<commit_message>
visualizing similarity score and other changes
</commit_message>
<xml_diff>
--- a/source/SDRDecoder3.7Project/Documentation/Extract and Evaluate Embeddings from SDR_Team_SDR_Decoder_3.7.docx
+++ b/source/SDRDecoder3.7Project/Documentation/Extract and Evaluate Embeddings from SDR_Team_SDR_Decoder_3.7.docx
@@ -1,6 +1,6 @@
 
 <file path=word/document.xml><?xml version="1.0" encoding="utf-8"?>
-<w:document xmlns:wpc="http://schemas.microsoft.com/office/word/2010/wordprocessingCanvas" xmlns:mc="http://schemas.openxmlformats.org/markup-compatibility/2006" xmlns:o="urn:schemas-microsoft-com:office:office" xmlns:r="http://schemas.openxmlformats.org/officeDocument/2006/relationships" xmlns:m="http://schemas.openxmlformats.org/officeDocument/2006/math" xmlns:v="urn:schemas-microsoft-com:vml" xmlns:wp14="http://schemas.microsoft.com/office/word/2010/wordprocessingDrawing" xmlns:wp="http://schemas.openxmlformats.org/drawingml/2006/wordprocessingDrawing" xmlns:w10="urn:schemas-microsoft-com:office:word" xmlns:w="http://schemas.openxmlformats.org/wordprocessingml/2006/main" xmlns:w14="http://schemas.microsoft.com/office/word/2010/wordml" xmlns:w15="http://schemas.microsoft.com/office/word/2012/wordml" xmlns:wpg="http://schemas.microsoft.com/office/word/2010/wordprocessingGroup" xmlns:wpi="http://schemas.microsoft.com/office/word/2010/wordprocessingInk" xmlns:wne="http://schemas.microsoft.com/office/word/2006/wordml" xmlns:wps="http://schemas.microsoft.com/office/word/2010/wordprocessingShape" mc:Ignorable="w14 w15 wp14">
+<w:document xmlns:wpc="http://schemas.microsoft.com/office/word/2010/wordprocessingCanvas" xmlns:cx="http://schemas.microsoft.com/office/drawing/2014/chartex" xmlns:mc="http://schemas.openxmlformats.org/markup-compatibility/2006" xmlns:o="urn:schemas-microsoft-com:office:office" xmlns:r="http://schemas.openxmlformats.org/officeDocument/2006/relationships" xmlns:m="http://schemas.openxmlformats.org/officeDocument/2006/math" xmlns:v="urn:schemas-microsoft-com:vml" xmlns:wp14="http://schemas.microsoft.com/office/word/2010/wordprocessingDrawing" xmlns:wp="http://schemas.openxmlformats.org/drawingml/2006/wordprocessingDrawing" xmlns:w10="urn:schemas-microsoft-com:office:word" xmlns:w="http://schemas.openxmlformats.org/wordprocessingml/2006/main" xmlns:w14="http://schemas.microsoft.com/office/word/2010/wordml" xmlns:w15="http://schemas.microsoft.com/office/word/2012/wordml" xmlns:w16se="http://schemas.microsoft.com/office/word/2015/wordml/symex" xmlns:wpg="http://schemas.microsoft.com/office/word/2010/wordprocessingGroup" xmlns:wpi="http://schemas.microsoft.com/office/word/2010/wordprocessingInk" xmlns:wne="http://schemas.microsoft.com/office/word/2006/wordml" xmlns:wps="http://schemas.microsoft.com/office/word/2010/wordprocessingShape" mc:Ignorable="w14 w15 w16se wp14">
   <w:body>
     <w:p>
       <w:pPr>
@@ -114,6 +114,7 @@
           <w:sz w:val="18"/>
           <w:szCs w:val="18"/>
         </w:rPr>
+        <w:lastRenderedPageBreak/>
         <w:t>Al Amin Ul Islam</w:t>
       </w:r>
       <w:r>
@@ -155,6 +156,7 @@
           <w:sz w:val="18"/>
           <w:szCs w:val="18"/>
         </w:rPr>
+        <w:lastRenderedPageBreak/>
         <w:t>Md Mahabubur Rashid Khan</w:t>
       </w:r>
       <w:r>
@@ -183,6 +185,7 @@
         </w:sectPr>
       </w:pPr>
       <w:r>
+        <w:lastRenderedPageBreak/>
         <w:br w:type="column"/>
       </w:r>
     </w:p>
@@ -198,6 +201,7 @@
           <w:i/>
           <w:iCs/>
         </w:rPr>
+        <w:lastRenderedPageBreak/>
         <w:t>Abstract</w:t>
       </w:r>
       <w:r>
@@ -233,7 +237,37 @@
         <w:rPr>
           <w:i/>
         </w:rPr>
-        <w:t xml:space="preserve"> framework, we preprocess input sequences through BERT-based tokenization, followed by HTM-based encoding with predefined spatial and temporal parameters. The encoded representations are processed through Spatial Pooling (SP) and Temporal Memory (TM) layers to capture sequential patterns. Semantic similarity is evaluated using cosine and Euclidean distance metrics. Experimental results demonstrate that HTM layers effectively learn sequential dependencies, improving semantic similarity detection compared to traditional methods. The findings suggest that HTM-enhanced models can better interpret contextual relationships in extended text sequences, offering potential applications in natural language understanding and sequence analysis tasks.</w:t>
+        <w:t xml:space="preserve"> framework, we preprocess input sequences through BERT-based tokenization, followed by HTM-based encoding with predefined spatial and temporal parameters. The encoded representations are processed through Spatial Pooling (SP) and Temporal Memory (TM) layers to capture sequential patterns. Semantic similarity is evaluated using cosine and Euclidean distance metrics. Experimental results demonstrate that HTM layers effectively learn sequential dependencies, improvin</w:t>
+      </w:r>
+      <w:r>
+        <w:rPr>
+          <w:i/>
+        </w:rPr>
+        <w:t>g semantic similarity detection</w:t>
+      </w:r>
+      <w:r>
+        <w:rPr>
+          <w:i/>
+        </w:rPr>
+        <w:t xml:space="preserve"> as it has its ability </w:t>
+      </w:r>
+      <w:r>
+        <w:rPr>
+          <w:i/>
+        </w:rPr>
+        <w:t>to retain sequence and structure</w:t>
+      </w:r>
+      <w:r>
+        <w:rPr>
+          <w:i/>
+        </w:rPr>
+        <w:t xml:space="preserve">. </w:t>
+      </w:r>
+      <w:r>
+        <w:rPr>
+          <w:i/>
+        </w:rPr>
+        <w:t>The findings suggest that HTM-enhanced models can better interpret contextual relationships in extended text sequences, offering potential applications in natural language understanding and sequence analysis tasks.</w:t>
       </w:r>
     </w:p>
     <w:p>
@@ -350,13 +384,14 @@
         <w:rPr>
           <w:lang w:val="en-US"/>
         </w:rPr>
-        <w:t xml:space="preserve">At the core of HTM lies the Spatial Pooler (SP), a crucial computational mechanism responsible for converting raw input data into Sparse Distributed Representations (SDRs). This transformation process is not merely a mathematical construct but is designed to mirror the way the human brain encodes and processes information. By maintaining sparsity and distributed activation, the Spatial Pooler enables efficient pattern recognition, memory formation, and information retrieval. Similar to the way the neocortex organizes and interprets sensory inputs, the SP ensures that learned </w:t>
-      </w:r>
-      <w:r>
-        <w:rPr>
-          <w:lang w:val="en-US"/>
-        </w:rPr>
-        <w:t>representations are both stable and adaptable, facilitating the recognition of recurring patterns in a highly efficient manner.</w:t>
+        <w:t xml:space="preserve">At the core of HTM lies the Spatial Pooler (SP), a crucial computational mechanism responsible for converting raw input data into Sparse Distributed Representations (SDRs). This transformation process is not merely a mathematical construct but is designed to mirror the way the human brain encodes and processes information. By maintaining sparsity and distributed activation, the Spatial Pooler enables efficient pattern recognition, memory formation, and information retrieval. Similar to the way the neocortex organizes and </w:t>
+      </w:r>
+      <w:r>
+        <w:rPr>
+          <w:lang w:val="en-US"/>
+        </w:rPr>
+        <w:lastRenderedPageBreak/>
+        <w:t>interprets sensory inputs, the SP ensures that learned representations are both stable and adaptable, facilitating the recognition of recurring patterns in a highly efficient manner.</w:t>
       </w:r>
     </w:p>
     <w:p>
@@ -739,22 +774,6 @@
       <w:pPr>
         <w:pStyle w:val="BodyText"/>
         <w:rPr>
-          <w:lang w:val="en-US"/>
-        </w:rPr>
-      </w:pPr>
-    </w:p>
-    <w:p>
-      <w:pPr>
-        <w:pStyle w:val="BodyText"/>
-        <w:rPr>
-          <w:lang w:val="en-US"/>
-        </w:rPr>
-      </w:pPr>
-    </w:p>
-    <w:p>
-      <w:pPr>
-        <w:pStyle w:val="BodyText"/>
-        <w:rPr>
           <w:b/>
           <w:i/>
           <w:lang w:val="en-US"/>
@@ -766,6 +785,7 @@
           <w:i/>
           <w:lang w:val="en-US"/>
         </w:rPr>
+        <w:lastRenderedPageBreak/>
         <w:t>B</w:t>
       </w:r>
       <w:r>
@@ -1186,13 +1206,14 @@
         <w:rPr>
           <w:lang w:val="en-US"/>
         </w:rPr>
-        <w:t xml:space="preserve">Temporal Memory extends HTM’s capabilities by learning and recalling sequences of patterns over time. It models the ability of cortical neurons to form connections based on temporal dependencies, allowing the system to predict future inputs based on past observations. Temporal Memory achieves this through active dendrites, which enable neurons to recognize context-dependent patterns. This </w:t>
-      </w:r>
-      <w:r>
-        <w:rPr>
-          <w:lang w:val="en-US"/>
-        </w:rPr>
-        <w:t>mechanism is crucial for applications requiring sequence prediction, such as speech recognition, anomaly detection, and time-series forecasting. Unlike traditional recurrent neural networks (RNNs), HTM’s Temporal Memory does not require backpropagation or fixed training phases, making it suitable for real-time learning applications.</w:t>
+        <w:t xml:space="preserve">Temporal Memory extends HTM’s capabilities by learning and recalling sequences of patterns over time. It models the ability of cortical neurons to form connections based on temporal dependencies, allowing the system to predict future inputs based on past observations. Temporal Memory achieves this through active dendrites, which enable neurons to recognize context-dependent patterns. This mechanism is crucial for applications requiring sequence prediction, such as speech recognition, anomaly detection, and </w:t>
+      </w:r>
+      <w:r>
+        <w:rPr>
+          <w:lang w:val="en-US"/>
+        </w:rPr>
+        <w:lastRenderedPageBreak/>
+        <w:t>time-series forecasting. Unlike traditional recurrent neural networks (RNNs), HTM’s Temporal Memory does not require backpropagation or fixed training phases, making it suitable for real-time learning applications.</w:t>
       </w:r>
     </w:p>
     <w:p>
@@ -1599,34 +1620,34 @@
         <w:rPr>
           <w:lang w:val="en-US"/>
         </w:rPr>
+        <w:t xml:space="preserve">The HTM Layers involved in generating </w:t>
+      </w:r>
+      <w:r>
+        <w:rPr>
+          <w:b/>
+          <w:lang w:val="en-US"/>
+        </w:rPr>
+        <w:t>HTM SDRs</w:t>
+      </w:r>
+      <w:r>
+        <w:rPr>
+          <w:lang w:val="en-US"/>
+        </w:rPr>
+        <w:t xml:space="preserve"> include:</w:t>
+      </w:r>
+    </w:p>
+    <w:p>
+      <w:pPr>
+        <w:pStyle w:val="BodyText"/>
+        <w:rPr>
+          <w:lang w:val="en-US"/>
+        </w:rPr>
+      </w:pPr>
+      <w:r>
+        <w:rPr>
+          <w:lang w:val="en-US"/>
+        </w:rPr>
         <w:lastRenderedPageBreak/>
-        <w:t xml:space="preserve">The HTM Layers involved in generating </w:t>
-      </w:r>
-      <w:r>
-        <w:rPr>
-          <w:b/>
-          <w:lang w:val="en-US"/>
-        </w:rPr>
-        <w:t>HTM SDRs</w:t>
-      </w:r>
-      <w:r>
-        <w:rPr>
-          <w:lang w:val="en-US"/>
-        </w:rPr>
-        <w:t xml:space="preserve"> include:</w:t>
-      </w:r>
-    </w:p>
-    <w:p>
-      <w:pPr>
-        <w:pStyle w:val="BodyText"/>
-        <w:rPr>
-          <w:lang w:val="en-US"/>
-        </w:rPr>
-      </w:pPr>
-      <w:r>
-        <w:rPr>
-          <w:lang w:val="en-US"/>
-        </w:rPr>
         <w:t>-</w:t>
       </w:r>
       <w:r>
@@ -2343,9 +2364,15 @@
                                 <w:rPr>
                                   <w:sz w:val="18"/>
                                 </w:rPr>
-                                <w:t>token-Ids</w:t>
+                                <w:t>token</w:t>
                               </w:r>
                               <w:proofErr w:type="gramEnd"/>
+                              <w:r>
+                                <w:rPr>
+                                  <w:sz w:val="18"/>
+                                </w:rPr>
+                                <w:t>-Ids</w:t>
+                              </w:r>
                             </w:p>
                           </w:txbxContent>
                         </wps:txbx>
@@ -2897,7 +2924,7 @@
           <mc:Fallback>
             <w:pict>
               <v:group w14:anchorId="1E94F042" id="Group 77" o:spid="_x0000_s1026" style="position:absolute;left:0;text-align:left;margin-left:26.65pt;margin-top:7.1pt;width:197.2pt;height:379.25pt;z-index:251673088;mso-position-horizontal-relative:margin;mso-width-relative:margin;mso-height-relative:margin" coordsize="31528,60053" o:gfxdata="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" o:allowoverlap="f">
-                <v:roundrect id="Rounded Rectangle 78" o:spid="_x0000_s1027" style="position:absolute;width:10899;height:2921;visibility:visible;mso-wrap-style:square;v-text-anchor:middle" arcsize="10923f" o:gfxdata="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" fillcolor="#fff2cc [663]" strokecolor="#1f3763 [1604]" strokeweight="1pt">
+                <v:roundrect id="Rounded Rectangle 78" o:spid="_x0000_s1027" style="position:absolute;width:10899;height:2921;visibility:visible;mso-wrap-style:square;v-text-anchor:middle" arcsize="10923f" o:gfxdata="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" fillcolor="#fff2cc [663]" strokecolor="#1f3763 [1604]" strokeweight="1pt">
                   <v:stroke joinstyle="miter"/>
                   <v:textbox>
                     <w:txbxContent>
@@ -2919,7 +2946,7 @@
                     </w:txbxContent>
                   </v:textbox>
                 </v:roundrect>
-                <v:rect id="Rectangle 79" o:spid="_x0000_s1028" style="position:absolute;top:7680;width:11338;height:5779;visibility:visible;mso-wrap-style:square;v-text-anchor:middle" o:gfxdata="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" fillcolor="#d9e2f3 [660]" strokecolor="#1f3763 [1604]" strokeweight="1pt">
+                <v:rect id="Rectangle 79" o:spid="_x0000_s1028" style="position:absolute;top:7680;width:11338;height:5779;visibility:visible;mso-wrap-style:square;v-text-anchor:middle" o:gfxdata="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" fillcolor="#d9e2f3 [660]" strokecolor="#1f3763 [1604]" strokeweight="1pt">
                   <v:textbox>
                     <w:txbxContent>
                       <w:p>
@@ -2940,7 +2967,7 @@
                     </w:txbxContent>
                   </v:textbox>
                 </v:rect>
-                <v:rect id="Rectangle 80" o:spid="_x0000_s1029" style="position:absolute;top:18361;width:10972;height:3949;visibility:visible;mso-wrap-style:square;v-text-anchor:middle" o:gfxdata="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" fillcolor="#d9e2f3 [660]" strokecolor="#1f3763 [1604]" strokeweight="1pt">
+                <v:rect id="Rectangle 80" o:spid="_x0000_s1029" style="position:absolute;top:18361;width:10972;height:3949;visibility:visible;mso-wrap-style:square;v-text-anchor:middle" o:gfxdata="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" fillcolor="#d9e2f3 [660]" strokecolor="#1f3763 [1604]" strokeweight="1pt">
                   <v:textbox>
                     <w:txbxContent>
                       <w:p>
@@ -2977,7 +3004,7 @@
                     </w:txbxContent>
                   </v:textbox>
                 </v:rect>
-                <v:rect id="Rectangle 81" o:spid="_x0000_s1030" style="position:absolute;left:21067;top:25822;width:10315;height:3950;visibility:visible;mso-wrap-style:square;v-text-anchor:middle" o:gfxdata="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" fillcolor="#d9e2f3 [660]" strokecolor="#1f3763 [1604]" strokeweight="1pt">
+                <v:rect id="Rectangle 81" o:spid="_x0000_s1030" style="position:absolute;left:21067;top:25822;width:10315;height:3950;visibility:visible;mso-wrap-style:square;v-text-anchor:middle" o:gfxdata="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" fillcolor="#d9e2f3 [660]" strokecolor="#1f3763 [1604]" strokeweight="1pt">
                   <v:textbox>
                     <w:txbxContent>
                       <w:p>
@@ -3006,7 +3033,7 @@
                     </w:txbxContent>
                   </v:textbox>
                 </v:rect>
-                <v:roundrect id="Rounded Rectangle 82" o:spid="_x0000_s1031" style="position:absolute;top:31597;width:12180;height:5779;visibility:visible;mso-wrap-style:square;v-text-anchor:middle" arcsize="10923f" o:gfxdata="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" fillcolor="#fff2cc [663]" strokecolor="#1f3763 [1604]" strokeweight="1pt">
+                <v:roundrect id="Rounded Rectangle 82" o:spid="_x0000_s1031" style="position:absolute;top:31597;width:12180;height:5779;visibility:visible;mso-wrap-style:square;v-text-anchor:middle" arcsize="10923f" o:gfxdata="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" fillcolor="#fff2cc [663]" strokecolor="#1f3763 [1604]" strokeweight="1pt">
                   <v:stroke joinstyle="miter"/>
                   <v:textbox>
                     <w:txbxContent>
@@ -3028,7 +3055,7 @@
                     </w:txbxContent>
                   </v:textbox>
                 </v:roundrect>
-                <v:rect id="Rectangle 83" o:spid="_x0000_s1032" style="position:absolute;top:43086;width:11411;height:5633;visibility:visible;mso-wrap-style:square;v-text-anchor:middle" o:gfxdata="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" fillcolor="#d9e2f3 [660]" strokecolor="#1f3763 [1604]" strokeweight="1pt">
+                <v:rect id="Rectangle 83" o:spid="_x0000_s1032" style="position:absolute;top:43086;width:11411;height:5633;visibility:visible;mso-wrap-style:square;v-text-anchor:middle" o:gfxdata="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" fillcolor="#d9e2f3 [660]" strokecolor="#1f3763 [1604]" strokeweight="1pt">
                   <v:textbox>
                     <w:txbxContent>
                       <w:p>
@@ -3049,7 +3076,7 @@
                     </w:txbxContent>
                   </v:textbox>
                 </v:rect>
-                <v:oval id="Oval 84" o:spid="_x0000_s1033" style="position:absolute;top:53543;width:11627;height:6510;visibility:visible;mso-wrap-style:square;v-text-anchor:middle" o:gfxdata="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" fillcolor="#fff2cc [663]" strokecolor="#1f3763 [1604]" strokeweight="1pt">
+                <v:oval id="Oval 84" o:spid="_x0000_s1033" style="position:absolute;top:53543;width:11627;height:6510;visibility:visible;mso-wrap-style:square;v-text-anchor:middle" o:gfxdata="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" fillcolor="#fff2cc [663]" strokecolor="#1f3763 [1604]" strokeweight="1pt">
                   <v:stroke joinstyle="miter"/>
                   <v:textbox>
                     <w:txbxContent>
@@ -3071,7 +3098,7 @@
                     </w:txbxContent>
                   </v:textbox>
                 </v:oval>
-                <v:rect id="Rectangle 85" o:spid="_x0000_s1034" style="position:absolute;left:5047;top:4023;width:9071;height:2560;visibility:visible;mso-wrap-style:square;v-text-anchor:middle" o:gfxdata="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" filled="f" stroked="f" strokeweight="1pt">
+                <v:rect id="Rectangle 85" o:spid="_x0000_s1034" style="position:absolute;left:5047;top:4023;width:9071;height:2560;visibility:visible;mso-wrap-style:square;v-text-anchor:middle" o:gfxdata="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" filled="f" stroked="f" strokeweight="1pt">
                   <v:textbox>
                     <w:txbxContent>
                       <w:p>
@@ -3090,7 +3117,7 @@
                     </w:txbxContent>
                   </v:textbox>
                 </v:rect>
-                <v:rect id="Rectangle 86" o:spid="_x0000_s1035" style="position:absolute;left:5559;top:14118;width:9071;height:2560;visibility:visible;mso-wrap-style:square;v-text-anchor:middle" o:gfxdata="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" filled="f" stroked="f" strokeweight="1pt">
+                <v:rect id="Rectangle 86" o:spid="_x0000_s1035" style="position:absolute;left:5559;top:14118;width:9071;height:2560;visibility:visible;mso-wrap-style:square;v-text-anchor:middle" o:gfxdata="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" filled="f" stroked="f" strokeweight="1pt">
                   <v:textbox>
                     <w:txbxContent>
                       <w:p>
@@ -3104,14 +3131,20 @@
                           <w:rPr>
                             <w:sz w:val="18"/>
                           </w:rPr>
-                          <w:t>token-Ids</w:t>
+                          <w:t>token</w:t>
                         </w:r>
                         <w:proofErr w:type="gramEnd"/>
+                        <w:r>
+                          <w:rPr>
+                            <w:sz w:val="18"/>
+                          </w:rPr>
+                          <w:t>-Ids</w:t>
+                        </w:r>
                       </w:p>
                     </w:txbxContent>
                   </v:textbox>
                 </v:rect>
-                <v:rect id="Rectangle 87" o:spid="_x0000_s1036" style="position:absolute;left:11338;top:17818;width:9071;height:2560;visibility:visible;mso-wrap-style:square;v-text-anchor:middle" o:gfxdata="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" filled="f" stroked="f" strokeweight="1pt">
+                <v:rect id="Rectangle 87" o:spid="_x0000_s1036" style="position:absolute;left:11338;top:17818;width:9071;height:2560;visibility:visible;mso-wrap-style:square;v-text-anchor:middle" o:gfxdata="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" filled="f" stroked="f" strokeweight="1pt">
                   <v:textbox>
                     <w:txbxContent>
                       <w:p>
@@ -3130,7 +3163,7 @@
                     </w:txbxContent>
                   </v:textbox>
                 </v:rect>
-                <v:rect id="Rectangle 88" o:spid="_x0000_s1037" style="position:absolute;left:5779;top:25822;width:9070;height:2560;visibility:visible;mso-wrap-style:square;v-text-anchor:middle" o:gfxdata="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" filled="f" stroked="f" strokeweight="1pt">
+                <v:rect id="Rectangle 88" o:spid="_x0000_s1037" style="position:absolute;left:5779;top:25822;width:9070;height:2560;visibility:visible;mso-wrap-style:square;v-text-anchor:middle" o:gfxdata="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" filled="f" stroked="f" strokeweight="1pt">
                   <v:textbox>
                     <w:txbxContent>
                       <w:p>
@@ -3149,7 +3182,7 @@
                     </w:txbxContent>
                   </v:textbox>
                 </v:rect>
-                <v:rect id="Rectangle 89" o:spid="_x0000_s1038" style="position:absolute;left:11127;top:31713;width:15947;height:3081;visibility:visible;mso-wrap-style:square;v-text-anchor:middle" o:gfxdata="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" filled="f" stroked="f" strokeweight="1pt">
+                <v:rect id="Rectangle 89" o:spid="_x0000_s1038" style="position:absolute;left:11127;top:31713;width:15947;height:3081;visibility:visible;mso-wrap-style:square;v-text-anchor:middle" o:gfxdata="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" filled="f" stroked="f" strokeweight="1pt">
                   <v:textbox>
                     <w:txbxContent>
                       <w:p>
@@ -3168,7 +3201,7 @@
                     </w:txbxContent>
                   </v:textbox>
                 </v:rect>
-                <v:rect id="Rectangle 90" o:spid="_x0000_s1039" style="position:absolute;left:6656;top:38551;width:15947;height:2560;visibility:visible;mso-wrap-style:square;v-text-anchor:middle" o:gfxdata="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" filled="f" stroked="f" strokeweight="1pt">
+                <v:rect id="Rectangle 90" o:spid="_x0000_s1039" style="position:absolute;left:6656;top:38551;width:15947;height:2560;visibility:visible;mso-wrap-style:square;v-text-anchor:middle" o:gfxdata="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" filled="f" stroked="f" strokeweight="1pt">
                   <v:textbox>
                     <w:txbxContent>
                       <w:p>
@@ -3191,22 +3224,22 @@
                   <v:path arrowok="t" fillok="f" o:connecttype="none"/>
                   <o:lock v:ext="edit" shapetype="t"/>
                 </v:shapetype>
-                <v:shape id="Straight Arrow Connector 91" o:spid="_x0000_s1040" type="#_x0000_t32" style="position:absolute;left:5559;top:2926;width:89;height:4662;visibility:visible;mso-wrap-style:square" o:connectortype="straight" o:gfxdata="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" strokecolor="black [3200]" strokeweight="1pt">
+                <v:shape id="Straight Arrow Connector 91" o:spid="_x0000_s1040" type="#_x0000_t32" style="position:absolute;left:5559;top:2926;width:89;height:4662;visibility:visible;mso-wrap-style:square" o:connectortype="straight" o:gfxdata="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" strokecolor="black [3200]" strokeweight="1pt">
                   <v:stroke endarrow="block" joinstyle="miter"/>
                 </v:shape>
-                <v:shape id="Straight Arrow Connector 92" o:spid="_x0000_s1041" type="#_x0000_t32" style="position:absolute;left:5559;top:13533;width:0;height:4681;visibility:visible;mso-wrap-style:square" o:connectortype="straight" o:gfxdata="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" strokecolor="black [3200]" strokeweight="1pt">
+                <v:shape id="Straight Arrow Connector 92" o:spid="_x0000_s1041" type="#_x0000_t32" style="position:absolute;left:5559;top:13533;width:0;height:4681;visibility:visible;mso-wrap-style:square" o:connectortype="straight" o:gfxdata="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" strokecolor="black [3200]" strokeweight="1pt">
                   <v:stroke endarrow="block" joinstyle="miter"/>
                 </v:shape>
-                <v:shape id="Straight Arrow Connector 93" o:spid="_x0000_s1042" type="#_x0000_t32" style="position:absolute;left:5632;top:22457;width:73;height:9144;flip:x;visibility:visible;mso-wrap-style:square" o:connectortype="straight" o:gfxdata="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" strokecolor="black [3200]" strokeweight="1pt">
+                <v:shape id="Straight Arrow Connector 93" o:spid="_x0000_s1042" type="#_x0000_t32" style="position:absolute;left:5632;top:22457;width:73;height:9144;flip:x;visibility:visible;mso-wrap-style:square" o:connectortype="straight" o:gfxdata="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" strokecolor="black [3200]" strokeweight="1pt">
                   <v:stroke endarrow="block" joinstyle="miter"/>
                 </v:shape>
-                <v:shape id="Straight Arrow Connector 94" o:spid="_x0000_s1043" type="#_x0000_t32" style="position:absolute;left:5559;top:37380;width:45;height:5729;flip:x;visibility:visible;mso-wrap-style:square" o:connectortype="straight" o:gfxdata="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" strokecolor="black [3200]" strokeweight="1pt">
+                <v:shape id="Straight Arrow Connector 94" o:spid="_x0000_s1043" type="#_x0000_t32" style="position:absolute;left:5559;top:37380;width:45;height:5729;flip:x;visibility:visible;mso-wrap-style:square" o:connectortype="straight" o:gfxdata="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" strokecolor="black [3200]" strokeweight="1pt">
                   <v:stroke endarrow="block" joinstyle="miter"/>
                 </v:shape>
-                <v:shape id="Straight Arrow Connector 95" o:spid="_x0000_s1044" type="#_x0000_t32" style="position:absolute;left:10899;top:20116;width:10388;height:0;visibility:visible;mso-wrap-style:square" o:connectortype="straight" o:gfxdata="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" strokecolor="black [3200]" strokeweight="1pt">
+                <v:shape id="Straight Arrow Connector 95" o:spid="_x0000_s1044" type="#_x0000_t32" style="position:absolute;left:10899;top:20116;width:10388;height:0;visibility:visible;mso-wrap-style:square" o:connectortype="straight" o:gfxdata="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" strokecolor="black [3200]" strokeweight="1pt">
                   <v:stroke endarrow="block" joinstyle="miter"/>
                 </v:shape>
-                <v:shape id="Straight Arrow Connector 96" o:spid="_x0000_s1045" type="#_x0000_t32" style="position:absolute;left:25676;top:22165;width:146;height:3584;flip:x;visibility:visible;mso-wrap-style:square" o:connectortype="straight" o:gfxdata="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" strokecolor="black [3200]" strokeweight="1pt">
+                <v:shape id="Straight Arrow Connector 96" o:spid="_x0000_s1045" type="#_x0000_t32" style="position:absolute;left:25676;top:22165;width:146;height:3584;flip:x;visibility:visible;mso-wrap-style:square" o:connectortype="straight" o:gfxdata="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" strokecolor="black [3200]" strokeweight="1pt">
                   <v:stroke endarrow="block" joinstyle="miter"/>
                 </v:shape>
                 <v:shapetype id="_x0000_t34" coordsize="21600,21600" o:spt="34" o:oned="t" adj="10800" path="m,l@0,0@0,21600,21600,21600e" filled="f">
@@ -3220,13 +3253,13 @@
                   </v:handles>
                   <o:lock v:ext="edit" shapetype="t"/>
                 </v:shapetype>
-                <v:shape id="Elbow Connector 97" o:spid="_x0000_s1046" type="#_x0000_t34" style="position:absolute;left:12135;top:29772;width:13747;height:4682;flip:x;visibility:visible;mso-wrap-style:square" o:connectortype="elbow" o:gfxdata="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" adj="-124" strokecolor="black [3200]" strokeweight="1pt">
+                <v:shape id="Elbow Connector 97" o:spid="_x0000_s1046" type="#_x0000_t34" style="position:absolute;left:12135;top:29772;width:13747;height:4682;flip:x;visibility:visible;mso-wrap-style:square" o:connectortype="elbow" o:gfxdata="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" adj="-124" strokecolor="black [3200]" strokeweight="1pt">
                   <v:stroke endarrow="block"/>
                 </v:shape>
-                <v:shape id="Straight Arrow Connector 98" o:spid="_x0000_s1047" type="#_x0000_t32" style="position:absolute;left:5559;top:48865;width:91;height:4617;flip:x;visibility:visible;mso-wrap-style:square" o:connectortype="straight" o:gfxdata="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" strokecolor="black [3200]" strokeweight="1pt">
+                <v:shape id="Straight Arrow Connector 98" o:spid="_x0000_s1047" type="#_x0000_t32" style="position:absolute;left:5559;top:48865;width:91;height:4617;flip:x;visibility:visible;mso-wrap-style:square" o:connectortype="straight" o:gfxdata="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" strokecolor="black [3200]" strokeweight="1pt">
                   <v:stroke endarrow="block" joinstyle="miter"/>
                 </v:shape>
-                <v:rect id="Rectangle 99" o:spid="_x0000_s1048" style="position:absolute;left:21213;top:18210;width:10315;height:4244;visibility:visible;mso-wrap-style:square;v-text-anchor:middle" o:gfxdata="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" fillcolor="#d9e2f3 [660]" strokecolor="#1f3763 [1604]" strokeweight="1pt">
+                <v:rect id="Rectangle 99" o:spid="_x0000_s1048" style="position:absolute;left:21213;top:18210;width:10315;height:4244;visibility:visible;mso-wrap-style:square;v-text-anchor:middle" o:gfxdata="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" fillcolor="#d9e2f3 [660]" strokecolor="#1f3763 [1604]" strokeweight="1pt">
                   <v:textbox>
                     <w:txbxContent>
                       <w:p>
@@ -3687,13 +3720,7 @@
         <w:rPr>
           <w:lang w:val="en-US"/>
         </w:rPr>
-        <w:t xml:space="preserve">. </w:t>
-      </w:r>
-      <w:r>
-        <w:rPr>
-          <w:lang w:val="en-US"/>
-        </w:rPr>
-        <w:t>This step ensures that the input is broken down into manageable units. Each unique word is assigned a token id</w:t>
+        <w:t>. This step ensures that the input is broken down into manageable units. Each unique word is assigned a token id</w:t>
       </w:r>
       <w:r>
         <w:rPr>
@@ -3717,7 +3744,14 @@
         <w:rPr>
           <w:lang w:val="en-US"/>
         </w:rPr>
-        <w:t xml:space="preserve">The reason behind using this model </w:t>
+        <w:t xml:space="preserve">The reason behind </w:t>
+      </w:r>
+      <w:r>
+        <w:rPr>
+          <w:lang w:val="en-US"/>
+        </w:rPr>
+        <w:lastRenderedPageBreak/>
+        <w:t xml:space="preserve">using this model </w:t>
       </w:r>
       <w:r>
         <w:t xml:space="preserve">that it splits text into </w:t>
@@ -4654,8 +4688,8 @@
           <mc:Fallback>
             <w:pict>
               <v:group w14:anchorId="37414A48" id="Group 154" o:spid="_x0000_s1050" style="position:absolute;margin-left:2.5pt;margin-top:5.7pt;width:243.35pt;height:74.75pt;z-index:251692544" coordsize="30904,9496" o:gfxdata="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">
-                <v:group id="Group 128" o:spid="_x0000_s1051" style="position:absolute;width:30718;height:5930" coordsize="30718,5930" o:gfxdata="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">
-                  <v:rect id="Rectangle 129" o:spid="_x0000_s1052" style="position:absolute;width:4362;height:5930;visibility:visible;mso-wrap-style:square;v-text-anchor:middle" o:gfxdata="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" filled="f" strokecolor="#1f3763 [1604]" strokeweight="1pt">
+                <v:group id="Group 128" o:spid="_x0000_s1051" style="position:absolute;width:30718;height:5930" coordsize="30718,5930" o:gfxdata="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">
+                  <v:rect id="Rectangle 129" o:spid="_x0000_s1052" style="position:absolute;width:4362;height:5930;visibility:visible;mso-wrap-style:square;v-text-anchor:middle" o:gfxdata="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" filled="f" strokecolor="#1f3763 [1604]" strokeweight="1pt">
                     <v:textbox>
                       <w:txbxContent>
                         <w:p>
@@ -4678,7 +4712,7 @@
                       </w:txbxContent>
                     </v:textbox>
                   </v:rect>
-                  <v:rect id="Rectangle 130" o:spid="_x0000_s1053" style="position:absolute;left:6334;width:4362;height:5930;visibility:visible;mso-wrap-style:square;v-text-anchor:middle" o:gfxdata="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" fillcolor="#deeaf6 [664]" strokecolor="#4472c4 [3204]" strokeweight="1pt">
+                  <v:rect id="Rectangle 130" o:spid="_x0000_s1053" style="position:absolute;left:6334;width:4362;height:5930;visibility:visible;mso-wrap-style:square;v-text-anchor:middle" o:gfxdata="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" fillcolor="#deeaf6 [664]" strokecolor="#4472c4 [3204]" strokeweight="1pt">
                     <v:textbox>
                       <w:txbxContent>
                         <w:p>
@@ -4701,7 +4735,7 @@
                       </w:txbxContent>
                     </v:textbox>
                   </v:rect>
-                  <v:rect id="Rectangle 131" o:spid="_x0000_s1054" style="position:absolute;left:12668;width:4362;height:5930;visibility:visible;mso-wrap-style:square;v-text-anchor:middle" o:gfxdata="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" fillcolor="#deeaf6 [664]" strokecolor="#4472c4 [3204]" strokeweight="1pt">
+                  <v:rect id="Rectangle 131" o:spid="_x0000_s1054" style="position:absolute;left:12668;width:4362;height:5930;visibility:visible;mso-wrap-style:square;v-text-anchor:middle" o:gfxdata="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" fillcolor="#deeaf6 [664]" strokecolor="#4472c4 [3204]" strokeweight="1pt">
                     <v:textbox>
                       <w:txbxContent>
                         <w:p>
@@ -4724,7 +4758,7 @@
                       </w:txbxContent>
                     </v:textbox>
                   </v:rect>
-                  <v:rect id="Rectangle 132" o:spid="_x0000_s1055" style="position:absolute;left:19002;width:5093;height:5930;visibility:visible;mso-wrap-style:square;v-text-anchor:middle" o:gfxdata="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" fillcolor="#deeaf6 [664]" strokecolor="#4472c4 [3204]" strokeweight="1pt">
+                  <v:rect id="Rectangle 132" o:spid="_x0000_s1055" style="position:absolute;left:19002;width:5093;height:5930;visibility:visible;mso-wrap-style:square;v-text-anchor:middle" o:gfxdata="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" fillcolor="#deeaf6 [664]" strokecolor="#4472c4 [3204]" strokeweight="1pt">
                     <v:textbox>
                       <w:txbxContent>
                         <w:p>
@@ -4749,7 +4783,7 @@
                       </w:txbxContent>
                     </v:textbox>
                   </v:rect>
-                  <v:rect id="Rectangle 133" o:spid="_x0000_s1056" style="position:absolute;left:25622;width:5096;height:5930;visibility:visible;mso-wrap-style:square;v-text-anchor:middle" o:gfxdata="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" fillcolor="#deeaf6 [664]" strokecolor="#4472c4 [3204]" strokeweight="1pt">
+                  <v:rect id="Rectangle 133" o:spid="_x0000_s1056" style="position:absolute;left:25622;width:5096;height:5930;visibility:visible;mso-wrap-style:square;v-text-anchor:middle" o:gfxdata="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" fillcolor="#deeaf6 [664]" strokecolor="#4472c4 [3204]" strokeweight="1pt">
                     <v:textbox>
                       <w:txbxContent>
                         <w:p>
@@ -4775,8 +4809,8 @@
                     </v:textbox>
                   </v:rect>
                 </v:group>
-                <v:group id="Group 134" o:spid="_x0000_s1057" style="position:absolute;left:43;top:6067;width:30861;height:3429" coordsize="30861,3429" o:gfxdata="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">
-                  <v:rect id="Rectangle 135" o:spid="_x0000_s1058" style="position:absolute;width:5286;height:3429;visibility:visible;mso-wrap-style:square;v-text-anchor:middle" o:gfxdata="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" filled="f" stroked="f" strokeweight="1pt">
+                <v:group id="Group 134" o:spid="_x0000_s1057" style="position:absolute;left:43;top:6067;width:30861;height:3429" coordsize="30861,3429" o:gfxdata="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">
+                  <v:rect id="Rectangle 135" o:spid="_x0000_s1058" style="position:absolute;width:5286;height:3429;visibility:visible;mso-wrap-style:square;v-text-anchor:middle" o:gfxdata="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" filled="f" stroked="f" strokeweight="1pt">
                     <v:textbox>
                       <w:txbxContent>
                         <w:p>
@@ -4799,7 +4833,7 @@
                       </w:txbxContent>
                     </v:textbox>
                   </v:rect>
-                  <v:rect id="Rectangle 136" o:spid="_x0000_s1059" style="position:absolute;left:5953;width:5810;height:3190;visibility:visible;mso-wrap-style:square;v-text-anchor:middle" o:gfxdata="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" filled="f" stroked="f" strokeweight="1pt">
+                  <v:rect id="Rectangle 136" o:spid="_x0000_s1059" style="position:absolute;left:5953;width:5810;height:3190;visibility:visible;mso-wrap-style:square;v-text-anchor:middle" o:gfxdata="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" filled="f" stroked="f" strokeweight="1pt">
                     <v:textbox>
                       <w:txbxContent>
                         <w:p>
@@ -4820,7 +4854,7 @@
                       </w:txbxContent>
                     </v:textbox>
                   </v:rect>
-                  <v:rect id="Rectangle 137" o:spid="_x0000_s1060" style="position:absolute;left:12192;width:5810;height:3190;visibility:visible;mso-wrap-style:square;v-text-anchor:middle" o:gfxdata="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" filled="f" stroked="f" strokeweight="1pt">
+                  <v:rect id="Rectangle 137" o:spid="_x0000_s1060" style="position:absolute;left:12192;width:5810;height:3190;visibility:visible;mso-wrap-style:square;v-text-anchor:middle" o:gfxdata="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" filled="f" stroked="f" strokeweight="1pt">
                     <v:textbox>
                       <w:txbxContent>
                         <w:p>
@@ -4848,7 +4882,7 @@
                       </w:txbxContent>
                     </v:textbox>
                   </v:rect>
-                  <v:rect id="Rectangle 138" o:spid="_x0000_s1061" style="position:absolute;left:25050;width:5811;height:3190;visibility:visible;mso-wrap-style:square;v-text-anchor:middle" o:gfxdata="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" filled="f" stroked="f" strokeweight="1pt">
+                  <v:rect id="Rectangle 138" o:spid="_x0000_s1061" style="position:absolute;left:25050;width:5811;height:3190;visibility:visible;mso-wrap-style:square;v-text-anchor:middle" o:gfxdata="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" filled="f" stroked="f" strokeweight="1pt">
                     <v:textbox>
                       <w:txbxContent>
                         <w:p>
@@ -4869,7 +4903,7 @@
                       </w:txbxContent>
                     </v:textbox>
                   </v:rect>
-                  <v:rect id="Rectangle 139" o:spid="_x0000_s1062" style="position:absolute;left:18811;width:5811;height:3190;visibility:visible;mso-wrap-style:square;v-text-anchor:middle" o:gfxdata="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" filled="f" stroked="f" strokeweight="1pt">
+                  <v:rect id="Rectangle 139" o:spid="_x0000_s1062" style="position:absolute;left:18811;width:5811;height:3190;visibility:visible;mso-wrap-style:square;v-text-anchor:middle" o:gfxdata="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" filled="f" stroked="f" strokeweight="1pt">
                     <v:textbox>
                       <w:txbxContent>
                         <w:p>
@@ -4907,10 +4941,10 @@
                     <v:h position="#0,#1" xrange="0,21600" yrange="0,10800"/>
                   </v:handles>
                 </v:shapetype>
-                <v:shape id="Right Arrow 148" o:spid="_x0000_s1063" type="#_x0000_t13" style="position:absolute;left:11050;top:2816;width:1306;height:458;visibility:visible;mso-wrap-style:square;v-text-anchor:middle" o:gfxdata="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" adj="17819" fillcolor="black [3213]" stroked="f" strokeweight="1pt"/>
-                <v:shape id="Right Arrow 150" o:spid="_x0000_s1064" type="#_x0000_t13" style="position:absolute;left:4723;top:2816;width:1306;height:458;visibility:visible;mso-wrap-style:square;v-text-anchor:middle" o:gfxdata="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" adj="17819" fillcolor="black [3213]" stroked="f" strokeweight="1pt"/>
-                <v:shape id="Right Arrow 152" o:spid="_x0000_s1065" type="#_x0000_t13" style="position:absolute;left:17377;top:2816;width:1306;height:458;visibility:visible;mso-wrap-style:square;v-text-anchor:middle" o:gfxdata="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" adj="17819" fillcolor="black [3213]" stroked="f" strokeweight="1pt"/>
-                <v:shape id="Right Arrow 153" o:spid="_x0000_s1066" type="#_x0000_t13" style="position:absolute;left:24225;top:2816;width:1305;height:458;visibility:visible;mso-wrap-style:square;v-text-anchor:middle" o:gfxdata="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" adj="17819" fillcolor="black [3213]" stroked="f" strokeweight="1pt"/>
+                <v:shape id="Right Arrow 148" o:spid="_x0000_s1063" type="#_x0000_t13" style="position:absolute;left:11050;top:2816;width:1306;height:458;visibility:visible;mso-wrap-style:square;v-text-anchor:middle" o:gfxdata="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" adj="17819" fillcolor="black [3213]" stroked="f" strokeweight="1pt"/>
+                <v:shape id="Right Arrow 150" o:spid="_x0000_s1064" type="#_x0000_t13" style="position:absolute;left:4723;top:2816;width:1306;height:458;visibility:visible;mso-wrap-style:square;v-text-anchor:middle" o:gfxdata="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" adj="17819" fillcolor="black [3213]" stroked="f" strokeweight="1pt"/>
+                <v:shape id="Right Arrow 152" o:spid="_x0000_s1065" type="#_x0000_t13" style="position:absolute;left:17377;top:2816;width:1306;height:458;visibility:visible;mso-wrap-style:square;v-text-anchor:middle" o:gfxdata="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" adj="17819" fillcolor="black [3213]" stroked="f" strokeweight="1pt"/>
+                <v:shape id="Right Arrow 153" o:spid="_x0000_s1066" type="#_x0000_t13" style="position:absolute;left:24225;top:2816;width:1305;height:458;visibility:visible;mso-wrap-style:square;v-text-anchor:middle" o:gfxdata="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" adj="17819" fillcolor="black [3213]" stroked="f" strokeweight="1pt"/>
               </v:group>
             </w:pict>
           </mc:Fallback>
@@ -4929,8 +4963,6 @@
       <w:pPr>
         <w:pStyle w:val="NormalWeb"/>
       </w:pPr>
-      <w:bookmarkStart w:id="1" w:name="_GoBack"/>
-      <w:bookmarkEnd w:id="1"/>
       <w:r>
         <w:rPr>
           <w:noProof/>
@@ -5281,31 +5313,25 @@
                               <w:t>sys.argv</w:t>
                             </w:r>
                             <w:proofErr w:type="spellEnd"/>
-                            <w:r>
-                              <w:t>[</w:t>
-                            </w:r>
                             <w:proofErr w:type="gramEnd"/>
                             <w:r>
-                              <w:t>1]</w:t>
+                              <w:t>[1]</w:t>
                             </w:r>
                           </w:p>
                           <w:p>
                             <w:pPr>
                               <w:jc w:val="left"/>
                             </w:pPr>
-                            <w:proofErr w:type="gramStart"/>
                             <w:r>
-                              <w:t>tokens</w:t>
-                            </w:r>
-                            <w:proofErr w:type="gramEnd"/>
-                            <w:r>
-                              <w:t xml:space="preserve"> = </w:t>
+                              <w:t xml:space="preserve">tokens = </w:t>
                             </w:r>
                             <w:proofErr w:type="spellStart"/>
+                            <w:proofErr w:type="gramStart"/>
                             <w:r>
                               <w:t>tokenizer.tokenize</w:t>
                             </w:r>
                             <w:proofErr w:type="spellEnd"/>
+                            <w:proofErr w:type="gramEnd"/>
                             <w:r>
                               <w:t>(</w:t>
                             </w:r>
@@ -5331,20 +5357,17 @@
                               <w:t xml:space="preserve"> = </w:t>
                             </w:r>
                             <w:proofErr w:type="spellStart"/>
-                            <w:r>
-                              <w:t>tokenizer.convert_tokens_to_</w:t>
-                            </w:r>
                             <w:proofErr w:type="gramStart"/>
                             <w:r>
-                              <w:t>ids</w:t>
+                              <w:t>tokenizer.convert</w:t>
+                            </w:r>
+                            <w:proofErr w:type="gramEnd"/>
+                            <w:r>
+                              <w:t>_tokens_to_ids</w:t>
                             </w:r>
                             <w:proofErr w:type="spellEnd"/>
                             <w:r>
-                              <w:t>(</w:t>
-                            </w:r>
-                            <w:proofErr w:type="gramEnd"/>
-                            <w:r>
-                              <w:t>tokens)</w:t>
+                              <w:t>(tokens)</w:t>
                             </w:r>
                           </w:p>
                           <w:p>
@@ -5434,31 +5457,25 @@
                         <w:t>sys.argv</w:t>
                       </w:r>
                       <w:proofErr w:type="spellEnd"/>
-                      <w:r>
-                        <w:t>[</w:t>
-                      </w:r>
                       <w:proofErr w:type="gramEnd"/>
                       <w:r>
-                        <w:t>1]</w:t>
+                        <w:t>[1]</w:t>
                       </w:r>
                     </w:p>
                     <w:p>
                       <w:pPr>
                         <w:jc w:val="left"/>
                       </w:pPr>
-                      <w:proofErr w:type="gramStart"/>
                       <w:r>
-                        <w:t>tokens</w:t>
-                      </w:r>
-                      <w:proofErr w:type="gramEnd"/>
-                      <w:r>
-                        <w:t xml:space="preserve"> = </w:t>
+                        <w:t xml:space="preserve">tokens = </w:t>
                       </w:r>
                       <w:proofErr w:type="spellStart"/>
+                      <w:proofErr w:type="gramStart"/>
                       <w:r>
                         <w:t>tokenizer.tokenize</w:t>
                       </w:r>
                       <w:proofErr w:type="spellEnd"/>
+                      <w:proofErr w:type="gramEnd"/>
                       <w:r>
                         <w:t>(</w:t>
                       </w:r>
@@ -5484,20 +5501,17 @@
                         <w:t xml:space="preserve"> = </w:t>
                       </w:r>
                       <w:proofErr w:type="spellStart"/>
-                      <w:r>
-                        <w:t>tokenizer.convert_tokens_to_</w:t>
-                      </w:r>
                       <w:proofErr w:type="gramStart"/>
                       <w:r>
-                        <w:t>ids</w:t>
+                        <w:t>tokenizer.convert</w:t>
+                      </w:r>
+                      <w:proofErr w:type="gramEnd"/>
+                      <w:r>
+                        <w:t>_tokens_to_ids</w:t>
                       </w:r>
                       <w:proofErr w:type="spellEnd"/>
                       <w:r>
-                        <w:t>(</w:t>
-                      </w:r>
-                      <w:proofErr w:type="gramEnd"/>
-                      <w:r>
-                        <w:t>tokens)</w:t>
+                        <w:t>(tokens)</w:t>
                       </w:r>
                     </w:p>
                     <w:p>
@@ -5725,9 +5739,12 @@
                             </w:r>
                             <w:proofErr w:type="gramStart"/>
                             <w:r>
-                              <w:t>&gt;()</w:t>
+                              <w:t>&gt;(</w:t>
                             </w:r>
                             <w:proofErr w:type="gramEnd"/>
+                            <w:r>
+                              <w:t>)</w:t>
+                            </w:r>
                           </w:p>
                           <w:p>
                             <w:pPr>
@@ -5928,9 +5945,12 @@
                       </w:r>
                       <w:proofErr w:type="gramStart"/>
                       <w:r>
-                        <w:t>&gt;()</w:t>
+                        <w:t>&gt;(</w:t>
                       </w:r>
                       <w:proofErr w:type="gramEnd"/>
+                      <w:r>
+                        <w:t>)</w:t>
+                      </w:r>
                     </w:p>
                     <w:p>
                       <w:pPr>
@@ -6260,11 +6280,7 @@
       </w:r>
       <w:proofErr w:type="spellEnd"/>
       <w:r>
-        <w:t xml:space="preserve"> namespace. This approach involves flattening all the lists within the dictionary </w:t>
-      </w:r>
-      <w:r>
-        <w:lastRenderedPageBreak/>
-        <w:t>into a single sequence and then identifying the highest value.</w:t>
+        <w:t xml:space="preserve"> namespace. This approach involves flattening all the lists within the dictionary into a single sequence and then identifying the highest value.</w:t>
       </w:r>
       <w:r>
         <w:rPr>
@@ -6342,7 +6358,6 @@
                                 <w:highlight w:val="white"/>
                               </w:rPr>
                             </w:pPr>
-                            <w:proofErr w:type="gramStart"/>
                             <w:r>
                               <w:rPr>
                                 <w:color w:val="0000FF"/>
@@ -6350,7 +6365,6 @@
                               </w:rPr>
                               <w:t>double</w:t>
                             </w:r>
-                            <w:proofErr w:type="gramEnd"/>
                             <w:r>
                               <w:rPr>
                                 <w:color w:val="000000"/>
@@ -6359,6 +6373,7 @@
                               <w:t xml:space="preserve"> max = </w:t>
                             </w:r>
                             <w:proofErr w:type="spellStart"/>
+                            <w:proofErr w:type="gramStart"/>
                             <w:r>
                               <w:rPr>
                                 <w:color w:val="000000"/>
@@ -6367,6 +6382,7 @@
                               <w:t>sequences.Values.SelectMany</w:t>
                             </w:r>
                             <w:proofErr w:type="spellEnd"/>
+                            <w:proofErr w:type="gramEnd"/>
                             <w:r>
                               <w:rPr>
                                 <w:color w:val="000000"/>
@@ -6427,7 +6443,6 @@
                           <w:highlight w:val="white"/>
                         </w:rPr>
                       </w:pPr>
-                      <w:proofErr w:type="gramStart"/>
                       <w:r>
                         <w:rPr>
                           <w:color w:val="0000FF"/>
@@ -6435,7 +6450,6 @@
                         </w:rPr>
                         <w:t>double</w:t>
                       </w:r>
-                      <w:proofErr w:type="gramEnd"/>
                       <w:r>
                         <w:rPr>
                           <w:color w:val="000000"/>
@@ -6444,6 +6458,7 @@
                         <w:t xml:space="preserve"> max = </w:t>
                       </w:r>
                       <w:proofErr w:type="spellStart"/>
+                      <w:proofErr w:type="gramStart"/>
                       <w:r>
                         <w:rPr>
                           <w:color w:val="000000"/>
@@ -6452,6 +6467,7 @@
                         <w:t>sequences.Values.SelectMany</w:t>
                       </w:r>
                       <w:proofErr w:type="spellEnd"/>
+                      <w:proofErr w:type="gramEnd"/>
                       <w:r>
                         <w:rPr>
                           <w:color w:val="000000"/>
@@ -6490,28 +6506,15 @@
     <w:p>
       <w:pPr>
         <w:pStyle w:val="BodyText"/>
-      </w:pPr>
-    </w:p>
-    <w:p>
-      <w:pPr>
-        <w:pStyle w:val="BodyText"/>
-        <w:ind w:firstLine="0"/>
-        <w:rPr>
-          <w:lang w:val="en-US"/>
-        </w:rPr>
-      </w:pPr>
-    </w:p>
-    <w:p>
-      <w:pPr>
-        <w:pStyle w:val="BodyText"/>
-        <w:rPr>
-          <w:lang w:val="en-US"/>
-        </w:rPr>
-      </w:pPr>
-      <w:r>
-        <w:rPr>
-          <w:lang w:val="en-US"/>
-        </w:rPr>
+        <w:rPr>
+          <w:lang w:val="en-US"/>
+        </w:rPr>
+      </w:pPr>
+      <w:r>
+        <w:rPr>
+          <w:lang w:val="en-US"/>
+        </w:rPr>
+        <w:lastRenderedPageBreak/>
         <w:t xml:space="preserve">All the generated SDRs </w:t>
       </w:r>
       <w:r>
@@ -6682,13 +6685,13 @@
         <mc:AlternateContent>
           <mc:Choice Requires="wps">
             <w:drawing>
-              <wp:anchor distT="45720" distB="45720" distL="114300" distR="114300" simplePos="0" relativeHeight="251648512" behindDoc="0" locked="0" layoutInCell="1" allowOverlap="1" wp14:anchorId="1F2A14A2" wp14:editId="36067ACD">
+              <wp:anchor distT="45720" distB="45720" distL="114300" distR="114300" simplePos="0" relativeHeight="251648512" behindDoc="0" locked="0" layoutInCell="1" allowOverlap="1" wp14:anchorId="1F2A14A2" wp14:editId="14CD397F">
                 <wp:simplePos x="0" y="0"/>
                 <wp:positionH relativeFrom="margin">
                   <wp:align>right</wp:align>
                 </wp:positionH>
                 <wp:positionV relativeFrom="paragraph">
-                  <wp:posOffset>3968</wp:posOffset>
+                  <wp:posOffset>142543</wp:posOffset>
                 </wp:positionV>
                 <wp:extent cx="3042920" cy="1432560"/>
                 <wp:effectExtent l="0" t="0" r="24130" b="15240"/>
@@ -6841,7 +6844,7 @@
           </mc:Choice>
           <mc:Fallback>
             <w:pict>
-              <v:shape w14:anchorId="1F2A14A2" id="Text Box 19" o:spid="_x0000_s1071" type="#_x0000_t202" style="position:absolute;left:0;text-align:left;margin-left:188.4pt;margin-top:.3pt;width:239.6pt;height:112.8pt;z-index:251648512;visibility:visible;mso-wrap-style:square;mso-width-percent:0;mso-height-percent:0;mso-wrap-distance-left:9pt;mso-wrap-distance-top:3.6pt;mso-wrap-distance-right:9pt;mso-wrap-distance-bottom:3.6pt;mso-position-horizontal:right;mso-position-horizontal-relative:margin;mso-position-vertical:absolute;mso-position-vertical-relative:text;mso-width-percent:0;mso-height-percent:0;mso-width-relative:margin;mso-height-relative:margin;v-text-anchor:top" o:gfxdata="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">
+              <v:shape w14:anchorId="1F2A14A2" id="Text Box 19" o:spid="_x0000_s1071" type="#_x0000_t202" style="position:absolute;left:0;text-align:left;margin-left:188.4pt;margin-top:11.2pt;width:239.6pt;height:112.8pt;z-index:251648512;visibility:visible;mso-wrap-style:square;mso-width-percent:0;mso-height-percent:0;mso-wrap-distance-left:9pt;mso-wrap-distance-top:3.6pt;mso-wrap-distance-right:9pt;mso-wrap-distance-bottom:3.6pt;mso-position-horizontal:right;mso-position-horizontal-relative:margin;mso-position-vertical:absolute;mso-position-vertical-relative:text;mso-width-percent:0;mso-height-percent:0;mso-width-relative:margin;mso-height-relative:margin;v-text-anchor:top" o:gfxdata="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">
                 <v:textbox>
                   <w:txbxContent>
                     <w:p>
@@ -6957,7 +6960,7 @@
         <mc:AlternateContent>
           <mc:Choice Requires="wpg">
             <w:drawing>
-              <wp:anchor distT="0" distB="0" distL="114300" distR="114300" simplePos="0" relativeHeight="251662848" behindDoc="0" locked="0" layoutInCell="1" allowOverlap="1" wp14:anchorId="4394CB3C" wp14:editId="4D1D1730">
+              <wp:anchor distT="0" distB="0" distL="114300" distR="114300" simplePos="0" relativeHeight="251662848" behindDoc="0" locked="0" layoutInCell="1" allowOverlap="1" wp14:anchorId="4394CB3C" wp14:editId="21FAC137">
                 <wp:simplePos x="0" y="0"/>
                 <wp:positionH relativeFrom="column">
                   <wp:posOffset>192405</wp:posOffset>
@@ -7398,7 +7401,6 @@
                                 </w:rPr>
                               </w:pPr>
                               <w:proofErr w:type="spellStart"/>
-                              <w:proofErr w:type="gramStart"/>
                               <w:r>
                                 <w:rPr>
                                   <w:color w:val="000000" w:themeColor="text1"/>
@@ -7407,7 +7409,6 @@
                                 <w:t>sdrGenerated</w:t>
                               </w:r>
                               <w:proofErr w:type="spellEnd"/>
-                              <w:proofErr w:type="gramEnd"/>
                               <w:r>
                                 <w:rPr>
                                   <w:color w:val="000000" w:themeColor="text1"/>
@@ -7469,7 +7470,6 @@
                                 </w:rPr>
                               </w:pPr>
                               <w:proofErr w:type="spellStart"/>
-                              <w:proofErr w:type="gramStart"/>
                               <w:r>
                                 <w:rPr>
                                   <w:color w:val="000000" w:themeColor="text1"/>
@@ -7478,7 +7478,6 @@
                                 <w:t>sdrText</w:t>
                               </w:r>
                               <w:proofErr w:type="spellEnd"/>
-                              <w:proofErr w:type="gramEnd"/>
                               <w:r>
                                 <w:rPr>
                                   <w:color w:val="000000" w:themeColor="text1"/>
@@ -7715,7 +7714,6 @@
                                 </w:rPr>
                               </w:pPr>
                               <w:proofErr w:type="spellStart"/>
-                              <w:proofErr w:type="gramStart"/>
                               <w:r>
                                 <w:rPr>
                                   <w:color w:val="000000" w:themeColor="text1"/>
@@ -7729,15 +7727,7 @@
                                   <w:color w:val="000000" w:themeColor="text1"/>
                                   <w:sz w:val="14"/>
                                 </w:rPr>
-                                <w:t>[</w:t>
-                              </w:r>
-                              <w:proofErr w:type="gramEnd"/>
-                              <w:r>
-                                <w:rPr>
-                                  <w:color w:val="000000" w:themeColor="text1"/>
-                                  <w:sz w:val="14"/>
-                                </w:rPr>
-                                <w:t xml:space="preserve">input] = {'generated': </w:t>
+                                <w:t xml:space="preserve">[input] = {'generated': </w:t>
                               </w:r>
                               <w:proofErr w:type="spellStart"/>
                               <w:r>
@@ -8115,16 +8105,16 @@
                   <v:path arrowok="t" fillok="f" o:connecttype="none"/>
                   <o:lock v:ext="edit" shapetype="t"/>
                 </v:shapetype>
-                <v:shape id="Curved Connector 53" o:spid="_x0000_s1073" type="#_x0000_t37" style="position:absolute;left:15889;top:12668;width:2258;height:4313;rotation:90;visibility:visible;mso-wrap-style:square" o:connectortype="curved" o:gfxdata="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" strokecolor="black [3200]" strokeweight="1pt">
+                <v:shape id="Curved Connector 53" o:spid="_x0000_s1073" type="#_x0000_t37" style="position:absolute;left:15889;top:12668;width:2258;height:4313;rotation:90;visibility:visible;mso-wrap-style:square" o:connectortype="curved" o:gfxdata="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" strokecolor="black [3200]" strokeweight="1pt">
                   <v:stroke endarrow="block" joinstyle="miter"/>
                 </v:shape>
-                <v:shape id="Straight Arrow Connector 59" o:spid="_x0000_s1074" type="#_x0000_t32" style="position:absolute;left:18446;top:36840;width:0;height:2362;visibility:visible;mso-wrap-style:square" o:connectortype="straight" o:gfxdata="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" strokecolor="black [3200]" strokeweight="1pt">
+                <v:shape id="Straight Arrow Connector 59" o:spid="_x0000_s1074" type="#_x0000_t32" style="position:absolute;left:18446;top:36840;width:0;height:2362;visibility:visible;mso-wrap-style:square" o:connectortype="straight" o:gfxdata="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" strokecolor="black [3200]" strokeweight="1pt">
                   <v:stroke endarrow="block" joinstyle="miter"/>
                 </v:shape>
-                <v:shape id="Curved Connector 57" o:spid="_x0000_s1075" type="#_x0000_t37" style="position:absolute;left:6673;top:42199;width:3881;height:4213;rotation:90;flip:x;visibility:visible;mso-wrap-style:square" o:connectortype="curved" o:gfxdata="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" strokecolor="black [3200]" strokeweight="1pt">
+                <v:shape id="Curved Connector 57" o:spid="_x0000_s1075" type="#_x0000_t37" style="position:absolute;left:6673;top:42199;width:3881;height:4213;rotation:90;flip:x;visibility:visible;mso-wrap-style:square" o:connectortype="curved" o:gfxdata="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" strokecolor="black [3200]" strokeweight="1pt">
                   <v:stroke endarrow="block" joinstyle="miter"/>
                 </v:shape>
-                <v:shape id="Curved Connector 58" o:spid="_x0000_s1076" type="#_x0000_t37" style="position:absolute;left:14832;top:42643;width:2878;height:4321;rotation:90;visibility:visible;mso-wrap-style:square" o:connectortype="curved" o:gfxdata="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" strokecolor="black [3200]" strokeweight="1pt">
+                <v:shape id="Curved Connector 58" o:spid="_x0000_s1076" type="#_x0000_t37" style="position:absolute;left:14832;top:42643;width:2878;height:4321;rotation:90;visibility:visible;mso-wrap-style:square" o:connectortype="curved" o:gfxdata="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" strokecolor="black [3200]" strokeweight="1pt">
                   <v:stroke endarrow="block" joinstyle="miter"/>
                 </v:shape>
                 <v:shapetype id="_x0000_t38" coordsize="21600,21600" o:spt="38" o:oned="t" path="m,c@0,0@1,5400@1,10800@1,16200@2,21600,21600,21600e" filled="f">
@@ -8139,16 +8129,16 @@
                   </v:handles>
                   <o:lock v:ext="edit" shapetype="t"/>
                 </v:shapetype>
-                <v:shape id="Curved Connector 55" o:spid="_x0000_s1077" type="#_x0000_t38" style="position:absolute;left:6501;top:27749;width:3772;height:12496;flip:x;visibility:visible;mso-wrap-style:square" o:connectortype="curved" o:gfxdata="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" adj="22364" strokecolor="black [3200]" strokeweight="1pt">
+                <v:shape id="Curved Connector 55" o:spid="_x0000_s1077" type="#_x0000_t38" style="position:absolute;left:6501;top:27749;width:3772;height:12496;flip:x;visibility:visible;mso-wrap-style:square" o:connectortype="curved" o:gfxdata="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" adj="22364" strokecolor="black [3200]" strokeweight="1pt">
                   <v:stroke endarrow="block" joinstyle="miter"/>
                 </v:shape>
-                <v:shape id="Curved Connector 38" o:spid="_x0000_s1078" type="#_x0000_t37" style="position:absolute;left:16805;top:8086;width:2366;height:2220;visibility:visible;mso-wrap-style:square" o:connectortype="curved" o:gfxdata="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" strokecolor="black [3200]" strokeweight="1pt">
+                <v:shape id="Curved Connector 38" o:spid="_x0000_s1078" type="#_x0000_t37" style="position:absolute;left:16805;top:8086;width:2366;height:2220;visibility:visible;mso-wrap-style:square" o:connectortype="curved" o:gfxdata="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" strokecolor="black [3200]" strokeweight="1pt">
                   <v:stroke endarrow="block" joinstyle="miter"/>
                 </v:shape>
-                <v:shape id="Straight Arrow Connector 37" o:spid="_x0000_s1079" type="#_x0000_t32" style="position:absolute;left:12421;top:2484;width:93;height:2589;visibility:visible;mso-wrap-style:square" o:connectortype="straight" o:gfxdata="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" strokecolor="black [3200]" strokeweight="1pt">
+                <v:shape id="Straight Arrow Connector 37" o:spid="_x0000_s1079" type="#_x0000_t32" style="position:absolute;left:12421;top:2484;width:93;height:2589;visibility:visible;mso-wrap-style:square" o:connectortype="straight" o:gfxdata="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" strokecolor="black [3200]" strokeweight="1pt">
                   <v:stroke endarrow="block" joinstyle="miter"/>
                 </v:shape>
-                <v:rect id="Rectangle 25" o:spid="_x0000_s1080" style="position:absolute;left:7981;width:9029;height:3111;visibility:visible;mso-wrap-style:square;v-text-anchor:middle" o:gfxdata="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" fillcolor="#d9e2f3 [660]" strokecolor="#1f3763 [1604]" strokeweight="1pt">
+                <v:rect id="Rectangle 25" o:spid="_x0000_s1080" style="position:absolute;left:7981;width:9029;height:3111;visibility:visible;mso-wrap-style:square;v-text-anchor:middle" o:gfxdata="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" fillcolor="#d9e2f3 [660]" strokecolor="#1f3763 [1604]" strokeweight="1pt">
                   <v:textbox>
                     <w:txbxContent>
                       <w:p>
@@ -8192,7 +8182,7 @@
                     </w:txbxContent>
                   </v:textbox>
                 </v:rect>
-                <v:rect id="Rectangle 26" o:spid="_x0000_s1081" style="position:absolute;left:6818;top:5073;width:11392;height:2968;visibility:visible;mso-wrap-style:square;v-text-anchor:middle" o:gfxdata="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" fillcolor="#d9e2f3 [660]" strokecolor="#1f3763 [1604]" strokeweight="1pt">
+                <v:rect id="Rectangle 26" o:spid="_x0000_s1081" style="position:absolute;left:6818;top:5073;width:11392;height:2968;visibility:visible;mso-wrap-style:square;v-text-anchor:middle" o:gfxdata="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" fillcolor="#d9e2f3 [660]" strokecolor="#1f3763 [1604]" strokeweight="1pt">
                   <v:textbox>
                     <w:txbxContent>
                       <w:p>
@@ -8213,7 +8203,7 @@
                     </w:txbxContent>
                   </v:textbox>
                 </v:rect>
-                <v:rect id="Rectangle 27" o:spid="_x0000_s1082" style="position:absolute;top:10306;width:11391;height:3391;visibility:visible;mso-wrap-style:square;v-text-anchor:middle" o:gfxdata="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" fillcolor="#d9e2f3 [660]" strokecolor="#1f3763 [1604]" strokeweight="1pt">
+                <v:rect id="Rectangle 27" o:spid="_x0000_s1082" style="position:absolute;top:10306;width:11391;height:3391;visibility:visible;mso-wrap-style:square;v-text-anchor:middle" o:gfxdata="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" fillcolor="#d9e2f3 [660]" strokecolor="#1f3763 [1604]" strokeweight="1pt">
                   <v:textbox>
                     <w:txbxContent>
                       <w:p>
@@ -8224,7 +8214,6 @@
                           </w:rPr>
                         </w:pPr>
                         <w:proofErr w:type="spellStart"/>
-                        <w:proofErr w:type="gramStart"/>
                         <w:r>
                           <w:rPr>
                             <w:color w:val="000000" w:themeColor="text1"/>
@@ -8233,7 +8222,6 @@
                           <w:t>sdrGenerated</w:t>
                         </w:r>
                         <w:proofErr w:type="spellEnd"/>
-                        <w:proofErr w:type="gramEnd"/>
                         <w:r>
                           <w:rPr>
                             <w:color w:val="000000" w:themeColor="text1"/>
@@ -8245,7 +8233,7 @@
                     </w:txbxContent>
                   </v:textbox>
                 </v:rect>
-                <v:rect id="Rectangle 28" o:spid="_x0000_s1083" style="position:absolute;left:13478;top:10306;width:11392;height:3391;visibility:visible;mso-wrap-style:square;v-text-anchor:middle" o:gfxdata="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" fillcolor="#d9e2f3 [660]" strokecolor="#1f3763 [1604]" strokeweight="1pt">
+                <v:rect id="Rectangle 28" o:spid="_x0000_s1083" style="position:absolute;left:13478;top:10306;width:11392;height:3391;visibility:visible;mso-wrap-style:square;v-text-anchor:middle" o:gfxdata="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" fillcolor="#d9e2f3 [660]" strokecolor="#1f3763 [1604]" strokeweight="1pt">
                   <v:textbox>
                     <w:txbxContent>
                       <w:p>
@@ -8256,7 +8244,6 @@
                           </w:rPr>
                         </w:pPr>
                         <w:proofErr w:type="spellStart"/>
-                        <w:proofErr w:type="gramStart"/>
                         <w:r>
                           <w:rPr>
                             <w:color w:val="000000" w:themeColor="text1"/>
@@ -8265,7 +8252,6 @@
                           <w:t>sdrText</w:t>
                         </w:r>
                         <w:proofErr w:type="spellEnd"/>
-                        <w:proofErr w:type="gramEnd"/>
                         <w:r>
                           <w:rPr>
                             <w:color w:val="000000" w:themeColor="text1"/>
@@ -8281,7 +8267,7 @@
                   <v:stroke joinstyle="miter"/>
                   <v:path gradientshapeok="t" o:connecttype="rect" textboxrect="5400,5400,16200,16200"/>
                 </v:shapetype>
-                <v:shape id="Diamond 30" o:spid="_x0000_s1084" type="#_x0000_t4" style="position:absolute;left:7346;top:20295;width:10364;height:10081;visibility:visible;mso-wrap-style:square;v-text-anchor:middle" o:gfxdata="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" fillcolor="#d9e2f3 [660]" strokecolor="#1f3763 [1604]" strokeweight="1pt">
+                <v:shape id="Diamond 30" o:spid="_x0000_s1084" type="#_x0000_t4" style="position:absolute;left:7346;top:20295;width:10364;height:10081;visibility:visible;mso-wrap-style:square;v-text-anchor:middle" o:gfxdata="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" fillcolor="#d9e2f3 [660]" strokecolor="#1f3763 [1604]" strokeweight="1pt">
                   <v:textbox>
                     <w:txbxContent>
                       <w:p>
@@ -8341,7 +8327,7 @@
                     </w:txbxContent>
                   </v:textbox>
                 </v:shape>
-                <v:rect id="Rectangle 31" o:spid="_x0000_s1085" style="position:absolute;left:12738;top:33457;width:11392;height:3391;visibility:visible;mso-wrap-style:square;v-text-anchor:middle" o:gfxdata="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" fillcolor="#d9e2f3 [660]" strokecolor="#1f3763 [1604]" strokeweight="1pt">
+                <v:rect id="Rectangle 31" o:spid="_x0000_s1085" style="position:absolute;left:12738;top:33457;width:11392;height:3391;visibility:visible;mso-wrap-style:square;v-text-anchor:middle" o:gfxdata="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" fillcolor="#d9e2f3 [660]" strokecolor="#1f3763 [1604]" strokeweight="1pt">
                   <v:textbox>
                     <w:txbxContent>
                       <w:p>
@@ -8378,7 +8364,7 @@
                     </w:txbxContent>
                   </v:textbox>
                 </v:rect>
-                <v:rect id="Rectangle 33" o:spid="_x0000_s1086" style="position:absolute;left:12738;top:39060;width:11392;height:4305;visibility:visible;mso-wrap-style:square;v-text-anchor:middle" o:gfxdata="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" fillcolor="#d9e2f3 [660]" strokecolor="#1f3763 [1604]" strokeweight="1pt">
+                <v:rect id="Rectangle 33" o:spid="_x0000_s1086" style="position:absolute;left:12738;top:39060;width:11392;height:4305;visibility:visible;mso-wrap-style:square;v-text-anchor:middle" o:gfxdata="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" fillcolor="#d9e2f3 [660]" strokecolor="#1f3763 [1604]" strokeweight="1pt">
                   <v:textbox>
                     <w:txbxContent>
                       <w:p>
@@ -8389,7 +8375,6 @@
                           </w:rPr>
                         </w:pPr>
                         <w:proofErr w:type="spellStart"/>
-                        <w:proofErr w:type="gramStart"/>
                         <w:r>
                           <w:rPr>
                             <w:color w:val="000000" w:themeColor="text1"/>
@@ -8403,15 +8388,7 @@
                             <w:color w:val="000000" w:themeColor="text1"/>
                             <w:sz w:val="14"/>
                           </w:rPr>
-                          <w:t>[</w:t>
-                        </w:r>
-                        <w:proofErr w:type="gramEnd"/>
-                        <w:r>
-                          <w:rPr>
-                            <w:color w:val="000000" w:themeColor="text1"/>
-                            <w:sz w:val="14"/>
-                          </w:rPr>
-                          <w:t xml:space="preserve">input] = {'generated': </w:t>
+                          <w:t xml:space="preserve">[input] = {'generated': </w:t>
                         </w:r>
                         <w:proofErr w:type="spellStart"/>
                         <w:r>
@@ -8449,10 +8426,10 @@
                     </w:txbxContent>
                   </v:textbox>
                 </v:rect>
-                <v:shape id="Curved Connector 56" o:spid="_x0000_s1087" type="#_x0000_t38" style="position:absolute;left:15328;top:27610;width:3963;height:5677;visibility:visible;mso-wrap-style:square" o:connectortype="curved" o:gfxdata="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" adj="21808" strokecolor="black [3200]" strokeweight="1pt">
+                <v:shape id="Curved Connector 56" o:spid="_x0000_s1087" type="#_x0000_t38" style="position:absolute;left:15328;top:27610;width:3963;height:5677;visibility:visible;mso-wrap-style:square" o:connectortype="curved" o:gfxdata="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" adj="21808" strokecolor="black [3200]" strokeweight="1pt">
                   <v:stroke endarrow="block" joinstyle="miter"/>
                 </v:shape>
-                <v:rect id="Rectangle 34" o:spid="_x0000_s1088" style="position:absolute;left:2431;top:40117;width:8153;height:2248;visibility:visible;mso-wrap-style:square;v-text-anchor:middle" o:gfxdata="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" fillcolor="#d9e2f3 [660]" strokecolor="#1f3763 [1604]" strokeweight="1pt">
+                <v:rect id="Rectangle 34" o:spid="_x0000_s1088" style="position:absolute;left:2431;top:40117;width:8153;height:2248;visibility:visible;mso-wrap-style:square;v-text-anchor:middle" o:gfxdata="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" fillcolor="#d9e2f3 [660]" strokecolor="#1f3763 [1604]" strokeweight="1pt">
                   <v:textbox>
                     <w:txbxContent>
                       <w:p>
@@ -8480,7 +8457,7 @@
                     </w:txbxContent>
                   </v:textbox>
                 </v:rect>
-                <v:rect id="Rectangle 35" o:spid="_x0000_s1089" style="position:absolute;left:10571;top:45720;width:3772;height:2247;visibility:visible;mso-wrap-style:square;v-text-anchor:middle" o:gfxdata="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" fillcolor="#d9e2f3 [660]" strokecolor="#1f3763 [1604]" strokeweight="1pt">
+                <v:rect id="Rectangle 35" o:spid="_x0000_s1089" style="position:absolute;left:10571;top:45720;width:3772;height:2247;visibility:visible;mso-wrap-style:square;v-text-anchor:middle" o:gfxdata="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" fillcolor="#d9e2f3 [660]" strokecolor="#1f3763 [1604]" strokeweight="1pt">
                   <v:textbox>
                     <w:txbxContent>
                       <w:p>
@@ -8502,16 +8479,16 @@
                     </w:txbxContent>
                   </v:textbox>
                 </v:rect>
-                <v:shape id="Curved Connector 50" o:spid="_x0000_s1090" type="#_x0000_t37" style="position:absolute;left:5695;top:8042;width:2330;height:2264;rotation:180;flip:y;visibility:visible;mso-wrap-style:square" o:connectortype="curved" o:gfxdata="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" strokecolor="black [3200]" strokeweight="1pt">
+                <v:shape id="Curved Connector 50" o:spid="_x0000_s1090" type="#_x0000_t37" style="position:absolute;left:5695;top:8042;width:2330;height:2264;rotation:180;flip:y;visibility:visible;mso-wrap-style:square" o:connectortype="curved" o:gfxdata="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" strokecolor="black [3200]" strokeweight="1pt">
                   <v:stroke endarrow="block" joinstyle="miter"/>
                 </v:shape>
-                <v:shape id="Curved Connector 52" o:spid="_x0000_s1091" type="#_x0000_t37" style="position:absolute;left:7346;top:12045;width:2179;height:5482;rotation:90;flip:x;visibility:visible;mso-wrap-style:square" o:connectortype="curved" o:gfxdata="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" strokecolor="black [3200]" strokeweight="1pt">
+                <v:shape id="Curved Connector 52" o:spid="_x0000_s1091" type="#_x0000_t37" style="position:absolute;left:7346;top:12045;width:2179;height:5482;rotation:90;flip:x;visibility:visible;mso-wrap-style:square" o:connectortype="curved" o:gfxdata="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" strokecolor="black [3200]" strokeweight="1pt">
                   <v:stroke endarrow="block" joinstyle="miter"/>
                 </v:shape>
-                <v:shape id="Straight Arrow Connector 54" o:spid="_x0000_s1092" type="#_x0000_t32" style="position:absolute;left:12598;top:18205;width:0;height:2210;visibility:visible;mso-wrap-style:square" o:connectortype="straight" o:gfxdata="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" strokecolor="black [3200]" strokeweight="1pt">
+                <v:shape id="Straight Arrow Connector 54" o:spid="_x0000_s1092" type="#_x0000_t32" style="position:absolute;left:12598;top:18205;width:0;height:2210;visibility:visible;mso-wrap-style:square" o:connectortype="straight" o:gfxdata="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" strokecolor="black [3200]" strokeweight="1pt">
                   <v:stroke endarrow="block" joinstyle="miter"/>
                 </v:shape>
-                <v:rect id="Rectangle 29" o:spid="_x0000_s1093" style="position:absolute;left:5927;top:16134;width:13485;height:2286;visibility:visible;mso-wrap-style:square;v-text-anchor:middle" o:gfxdata="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" fillcolor="#d9e2f3 [660]" strokecolor="#1f3763 [1604]" strokeweight="1pt">
+                <v:rect id="Rectangle 29" o:spid="_x0000_s1093" style="position:absolute;left:5927;top:16134;width:13485;height:2286;visibility:visible;mso-wrap-style:square;v-text-anchor:middle" o:gfxdata="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" fillcolor="#d9e2f3 [660]" strokecolor="#1f3763 [1604]" strokeweight="1pt">
                   <v:textbox>
                     <w:txbxContent>
                       <w:p>
@@ -8893,55 +8870,6 @@
           <w:sz w:val="18"/>
         </w:rPr>
       </w:pPr>
-    </w:p>
-    <w:p>
-      <w:pPr>
-        <w:rPr>
-          <w:sz w:val="18"/>
-        </w:rPr>
-      </w:pPr>
-    </w:p>
-    <w:p>
-      <w:pPr>
-        <w:rPr>
-          <w:sz w:val="18"/>
-        </w:rPr>
-      </w:pPr>
-    </w:p>
-    <w:p>
-      <w:pPr>
-        <w:rPr>
-          <w:sz w:val="18"/>
-        </w:rPr>
-      </w:pPr>
-    </w:p>
-    <w:p>
-      <w:pPr>
-        <w:rPr>
-          <w:sz w:val="18"/>
-        </w:rPr>
-      </w:pPr>
-    </w:p>
-    <w:p>
-      <w:pPr>
-        <w:rPr>
-          <w:sz w:val="18"/>
-        </w:rPr>
-      </w:pPr>
-    </w:p>
-    <w:p>
-      <w:pPr>
-        <w:rPr>
-          <w:sz w:val="18"/>
-        </w:rPr>
-      </w:pPr>
-    </w:p>
-    <w:p>
-      <w:pPr>
-        <w:rPr>
-          <w:sz w:val="18"/>
-        </w:rPr>
-      </w:pPr>
       <w:r>
         <w:rPr>
           <w:noProof/>
@@ -8949,13 +8877,13 @@
         <mc:AlternateContent>
           <mc:Choice Requires="wps">
             <w:drawing>
-              <wp:anchor distT="45720" distB="45720" distL="114300" distR="114300" simplePos="0" relativeHeight="251658752" behindDoc="0" locked="0" layoutInCell="1" allowOverlap="1" wp14:anchorId="4861F887" wp14:editId="2B04E5D5">
+              <wp:anchor distT="45720" distB="45720" distL="114300" distR="114300" simplePos="0" relativeHeight="251658752" behindDoc="0" locked="0" layoutInCell="1" allowOverlap="1" wp14:anchorId="4861F887" wp14:editId="6D38EBB3">
                 <wp:simplePos x="0" y="0"/>
                 <wp:positionH relativeFrom="margin">
                   <wp:posOffset>3312795</wp:posOffset>
                 </wp:positionH>
                 <wp:positionV relativeFrom="paragraph">
-                  <wp:posOffset>-1047115</wp:posOffset>
+                  <wp:posOffset>101600</wp:posOffset>
                 </wp:positionV>
                 <wp:extent cx="3042920" cy="1414780"/>
                 <wp:effectExtent l="0" t="0" r="24130" b="13970"/>
@@ -9017,7 +8945,6 @@
                               </w:rPr>
                             </w:pPr>
                             <w:proofErr w:type="spellStart"/>
-                            <w:proofErr w:type="gramStart"/>
                             <w:r>
                               <w:rPr>
                                 <w:sz w:val="18"/>
@@ -9026,7 +8953,6 @@
                               <w:t>int</w:t>
                             </w:r>
                             <w:proofErr w:type="spellEnd"/>
-                            <w:proofErr w:type="gramEnd"/>
                             <w:r>
                               <w:rPr>
                                 <w:sz w:val="18"/>
@@ -9284,7 +9210,7 @@
           </mc:Choice>
           <mc:Fallback>
             <w:pict>
-              <v:shape w14:anchorId="4861F887" id="Text Box 39" o:spid="_x0000_s1096" type="#_x0000_t202" style="position:absolute;left:0;text-align:left;margin-left:260.85pt;margin-top:-82.45pt;width:239.6pt;height:111.4pt;z-index:251658752;visibility:visible;mso-wrap-style:square;mso-width-percent:0;mso-height-percent:0;mso-wrap-distance-left:9pt;mso-wrap-distance-top:3.6pt;mso-wrap-distance-right:9pt;mso-wrap-distance-bottom:3.6pt;mso-position-horizontal:absolute;mso-position-horizontal-relative:margin;mso-position-vertical:absolute;mso-position-vertical-relative:text;mso-width-percent:0;mso-height-percent:0;mso-width-relative:margin;mso-height-relative:margin;v-text-anchor:top" o:gfxdata="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">
+              <v:shape w14:anchorId="4861F887" id="Text Box 39" o:spid="_x0000_s1096" type="#_x0000_t202" style="position:absolute;left:0;text-align:left;margin-left:260.85pt;margin-top:8pt;width:239.6pt;height:111.4pt;z-index:251658752;visibility:visible;mso-wrap-style:square;mso-width-percent:0;mso-height-percent:0;mso-wrap-distance-left:9pt;mso-wrap-distance-top:3.6pt;mso-wrap-distance-right:9pt;mso-wrap-distance-bottom:3.6pt;mso-position-horizontal:absolute;mso-position-horizontal-relative:margin;mso-position-vertical:absolute;mso-position-vertical-relative:text;mso-width-percent:0;mso-height-percent:0;mso-width-relative:margin;mso-height-relative:margin;v-text-anchor:top" o:gfxdata="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">
                 <v:textbox>
                   <w:txbxContent>
                     <w:p>
@@ -9312,7 +9238,6 @@
                         </w:rPr>
                       </w:pPr>
                       <w:proofErr w:type="spellStart"/>
-                      <w:proofErr w:type="gramStart"/>
                       <w:r>
                         <w:rPr>
                           <w:sz w:val="18"/>
@@ -9321,7 +9246,6 @@
                         <w:t>int</w:t>
                       </w:r>
                       <w:proofErr w:type="spellEnd"/>
-                      <w:proofErr w:type="gramEnd"/>
                       <w:r>
                         <w:rPr>
                           <w:sz w:val="18"/>
@@ -9568,6 +9492,55 @@
           </mc:Fallback>
         </mc:AlternateContent>
       </w:r>
+    </w:p>
+    <w:p>
+      <w:pPr>
+        <w:rPr>
+          <w:sz w:val="18"/>
+        </w:rPr>
+      </w:pPr>
+    </w:p>
+    <w:p>
+      <w:pPr>
+        <w:rPr>
+          <w:sz w:val="18"/>
+        </w:rPr>
+      </w:pPr>
+    </w:p>
+    <w:p>
+      <w:pPr>
+        <w:rPr>
+          <w:sz w:val="18"/>
+        </w:rPr>
+      </w:pPr>
+    </w:p>
+    <w:p>
+      <w:pPr>
+        <w:rPr>
+          <w:sz w:val="18"/>
+        </w:rPr>
+      </w:pPr>
+    </w:p>
+    <w:p>
+      <w:pPr>
+        <w:rPr>
+          <w:sz w:val="18"/>
+        </w:rPr>
+      </w:pPr>
+    </w:p>
+    <w:p>
+      <w:pPr>
+        <w:rPr>
+          <w:sz w:val="18"/>
+        </w:rPr>
+      </w:pPr>
+    </w:p>
+    <w:p>
+      <w:pPr>
+        <w:rPr>
+          <w:sz w:val="18"/>
+        </w:rPr>
+      </w:pPr>
       <w:r>
         <w:rPr>
           <w:sz w:val="18"/>
@@ -9723,6 +9696,7 @@
         <w:rPr>
           <w:lang w:val="en-US"/>
         </w:rPr>
+        <w:lastRenderedPageBreak/>
         <w:t>A third text input (</w:t>
       </w:r>
       <w:proofErr w:type="spellStart"/>
@@ -9973,27 +9947,13 @@
         <w:rPr>
           <w:lang w:val="en-US"/>
         </w:rPr>
-        <w:t xml:space="preserve"> are </w:t>
-      </w:r>
-      <w:proofErr w:type="gramStart"/>
-      <w:r>
-        <w:rPr>
-          <w:lang w:val="en-US"/>
-        </w:rPr>
-        <w:t>merged</w:t>
-      </w:r>
-      <w:r>
-        <w:rPr>
-          <w:lang w:val="en-US"/>
-        </w:rPr>
-        <w:t>(</w:t>
-      </w:r>
-      <w:proofErr w:type="gramEnd"/>
-      <w:r>
-        <w:rPr>
-          <w:lang w:val="en-US"/>
-        </w:rPr>
-        <w:t>concatenated)</w:t>
+        <w:t xml:space="preserve"> are merged</w:t>
+      </w:r>
+      <w:r>
+        <w:rPr>
+          <w:lang w:val="en-US"/>
+        </w:rPr>
+        <w:t>(concatenated)</w:t>
       </w:r>
       <w:r>
         <w:rPr>
@@ -10087,27 +10047,13 @@
         <w:rPr>
           <w:lang w:val="en-US"/>
         </w:rPr>
-        <w:t xml:space="preserve">This </w:t>
-      </w:r>
-      <w:proofErr w:type="gramStart"/>
-      <w:r>
-        <w:rPr>
-          <w:lang w:val="en-US"/>
-        </w:rPr>
-        <w:t>merging</w:t>
-      </w:r>
-      <w:r>
-        <w:rPr>
-          <w:lang w:val="en-US"/>
-        </w:rPr>
-        <w:t>(</w:t>
-      </w:r>
-      <w:proofErr w:type="gramEnd"/>
-      <w:r>
-        <w:rPr>
-          <w:lang w:val="en-US"/>
-        </w:rPr>
-        <w:t>concatenation)</w:t>
+        <w:t>This merging</w:t>
+      </w:r>
+      <w:r>
+        <w:rPr>
+          <w:lang w:val="en-US"/>
+        </w:rPr>
+        <w:t>(concatenation)</w:t>
       </w:r>
       <w:r>
         <w:rPr>
@@ -10337,34 +10283,40 @@
           <w:i/>
           <w:lang w:val="en-US"/>
         </w:rPr>
+        <w:t>Euclidean Distance:</w:t>
+      </w:r>
+      <w:r>
+        <w:rPr>
+          <w:lang w:val="en-US"/>
+        </w:rPr>
+        <w:t xml:space="preserve"> Calculates the direct spatial distance between two SDRs in high-dimensional space.</w:t>
+      </w:r>
+      <w:r>
+        <w:rPr>
+          <w:lang w:val="en-US"/>
+        </w:rPr>
+        <w:t xml:space="preserve"> Lower distance value means higher similarity. </w:t>
+      </w:r>
+    </w:p>
+    <w:p>
+      <w:pPr>
+        <w:pStyle w:val="BodyText"/>
+        <w:rPr>
+          <w:lang w:val="en-US"/>
+        </w:rPr>
+      </w:pPr>
+      <w:r>
+        <w:rPr>
+          <w:lang w:val="en-US"/>
+        </w:rPr>
+        <w:t xml:space="preserve">If the vectors have different lengths, the shorter one is padded with zeros to match the longer vector before </w:t>
+      </w:r>
+      <w:r>
+        <w:rPr>
+          <w:lang w:val="en-US"/>
+        </w:rPr>
         <w:lastRenderedPageBreak/>
-        <w:t>Euclidean Distance:</w:t>
-      </w:r>
-      <w:r>
-        <w:rPr>
-          <w:lang w:val="en-US"/>
-        </w:rPr>
-        <w:t xml:space="preserve"> Calculates the direct spatial distance between two SDRs in high-dimensional space.</w:t>
-      </w:r>
-      <w:r>
-        <w:rPr>
-          <w:lang w:val="en-US"/>
-        </w:rPr>
-        <w:t xml:space="preserve"> Lower distance value means higher similarity. </w:t>
-      </w:r>
-    </w:p>
-    <w:p>
-      <w:pPr>
-        <w:pStyle w:val="BodyText"/>
-        <w:rPr>
-          <w:lang w:val="en-US"/>
-        </w:rPr>
-      </w:pPr>
-      <w:r>
-        <w:rPr>
-          <w:lang w:val="en-US"/>
-        </w:rPr>
-        <w:t>If the vectors have different lengths, the shorter one is padded with zeros to match the longer vector before performing the distance calculation.</w:t>
+        <w:t>performing the distance calculation.</w:t>
       </w:r>
       <w:r>
         <w:rPr>
@@ -10461,21 +10413,12 @@
                                 <w:szCs w:val="18"/>
                               </w:rPr>
                             </w:pPr>
-                            <w:proofErr w:type="gramStart"/>
                             <w:r>
                               <w:rPr>
                                 <w:sz w:val="18"/>
                                 <w:szCs w:val="18"/>
                               </w:rPr>
-                              <w:t>double</w:t>
-                            </w:r>
-                            <w:proofErr w:type="gramEnd"/>
-                            <w:r>
-                              <w:rPr>
-                                <w:sz w:val="18"/>
-                                <w:szCs w:val="18"/>
-                              </w:rPr>
-                              <w:t xml:space="preserve"> distance = </w:t>
+                              <w:t xml:space="preserve">double distance = </w:t>
                             </w:r>
                             <w:proofErr w:type="spellStart"/>
                             <w:r>
@@ -10491,7 +10434,23 @@
                                 <w:sz w:val="18"/>
                                 <w:szCs w:val="18"/>
                               </w:rPr>
-                              <w:t>(paddedVec1.Zip(paddedVec2, (v1, v2) =&gt; (v1 - v2) * (v1 - v2)).Sum());</w:t>
+                              <w:t>(paddedVec1.Zip(paddedVec2, (v1, v2) =&gt; (v1 - v2) * (v1 - v2)</w:t>
+                            </w:r>
+                            <w:proofErr w:type="gramStart"/>
+                            <w:r>
+                              <w:rPr>
+                                <w:sz w:val="18"/>
+                                <w:szCs w:val="18"/>
+                              </w:rPr>
+                              <w:t>).Sum</w:t>
+                            </w:r>
+                            <w:proofErr w:type="gramEnd"/>
+                            <w:r>
+                              <w:rPr>
+                                <w:sz w:val="18"/>
+                                <w:szCs w:val="18"/>
+                              </w:rPr>
+                              <w:t>());</w:t>
                             </w:r>
                           </w:p>
                           <w:p>
@@ -10527,21 +10486,12 @@
                                 <w:szCs w:val="18"/>
                               </w:rPr>
                             </w:pPr>
-                            <w:proofErr w:type="gramStart"/>
                             <w:r>
                               <w:rPr>
                                 <w:sz w:val="18"/>
                                 <w:szCs w:val="18"/>
                               </w:rPr>
-                              <w:t>double</w:t>
-                            </w:r>
-                            <w:proofErr w:type="gramEnd"/>
-                            <w:r>
-                              <w:rPr>
-                                <w:sz w:val="18"/>
-                                <w:szCs w:val="18"/>
-                              </w:rPr>
-                              <w:t xml:space="preserve"> </w:t>
+                              <w:t xml:space="preserve">double </w:t>
                             </w:r>
                             <w:proofErr w:type="spellStart"/>
                             <w:r>
@@ -10625,21 +10575,12 @@
                                 <w:szCs w:val="18"/>
                               </w:rPr>
                             </w:pPr>
-                            <w:proofErr w:type="gramStart"/>
                             <w:r>
                               <w:rPr>
                                 <w:sz w:val="18"/>
                                 <w:szCs w:val="18"/>
                               </w:rPr>
-                              <w:t>return</w:t>
-                            </w:r>
-                            <w:proofErr w:type="gramEnd"/>
-                            <w:r>
-                              <w:rPr>
-                                <w:sz w:val="18"/>
-                                <w:szCs w:val="18"/>
-                              </w:rPr>
-                              <w:t xml:space="preserve"> 1 - (distance / </w:t>
+                              <w:t xml:space="preserve">return 1 - (distance / </w:t>
                             </w:r>
                             <w:proofErr w:type="spellStart"/>
                             <w:r>
@@ -10709,21 +10650,12 @@
                           <w:szCs w:val="18"/>
                         </w:rPr>
                       </w:pPr>
-                      <w:proofErr w:type="gramStart"/>
                       <w:r>
                         <w:rPr>
                           <w:sz w:val="18"/>
                           <w:szCs w:val="18"/>
                         </w:rPr>
-                        <w:t>double</w:t>
-                      </w:r>
-                      <w:proofErr w:type="gramEnd"/>
-                      <w:r>
-                        <w:rPr>
-                          <w:sz w:val="18"/>
-                          <w:szCs w:val="18"/>
-                        </w:rPr>
-                        <w:t xml:space="preserve"> distance = </w:t>
+                        <w:t xml:space="preserve">double distance = </w:t>
                       </w:r>
                       <w:proofErr w:type="spellStart"/>
                       <w:r>
@@ -10739,7 +10671,23 @@
                           <w:sz w:val="18"/>
                           <w:szCs w:val="18"/>
                         </w:rPr>
-                        <w:t>(paddedVec1.Zip(paddedVec2, (v1, v2) =&gt; (v1 - v2) * (v1 - v2)).Sum());</w:t>
+                        <w:t>(paddedVec1.Zip(paddedVec2, (v1, v2) =&gt; (v1 - v2) * (v1 - v2)</w:t>
+                      </w:r>
+                      <w:proofErr w:type="gramStart"/>
+                      <w:r>
+                        <w:rPr>
+                          <w:sz w:val="18"/>
+                          <w:szCs w:val="18"/>
+                        </w:rPr>
+                        <w:t>).Sum</w:t>
+                      </w:r>
+                      <w:proofErr w:type="gramEnd"/>
+                      <w:r>
+                        <w:rPr>
+                          <w:sz w:val="18"/>
+                          <w:szCs w:val="18"/>
+                        </w:rPr>
+                        <w:t>());</w:t>
                       </w:r>
                     </w:p>
                     <w:p>
@@ -10775,21 +10723,12 @@
                           <w:szCs w:val="18"/>
                         </w:rPr>
                       </w:pPr>
-                      <w:proofErr w:type="gramStart"/>
                       <w:r>
                         <w:rPr>
                           <w:sz w:val="18"/>
                           <w:szCs w:val="18"/>
                         </w:rPr>
-                        <w:t>double</w:t>
-                      </w:r>
-                      <w:proofErr w:type="gramEnd"/>
-                      <w:r>
-                        <w:rPr>
-                          <w:sz w:val="18"/>
-                          <w:szCs w:val="18"/>
-                        </w:rPr>
-                        <w:t xml:space="preserve"> </w:t>
+                        <w:t xml:space="preserve">double </w:t>
                       </w:r>
                       <w:proofErr w:type="spellStart"/>
                       <w:r>
@@ -10873,21 +10812,12 @@
                           <w:szCs w:val="18"/>
                         </w:rPr>
                       </w:pPr>
-                      <w:proofErr w:type="gramStart"/>
                       <w:r>
                         <w:rPr>
                           <w:sz w:val="18"/>
                           <w:szCs w:val="18"/>
                         </w:rPr>
-                        <w:t>return</w:t>
-                      </w:r>
-                      <w:proofErr w:type="gramEnd"/>
-                      <w:r>
-                        <w:rPr>
-                          <w:sz w:val="18"/>
-                          <w:szCs w:val="18"/>
-                        </w:rPr>
-                        <w:t xml:space="preserve"> 1 - (distance / </w:t>
+                        <w:t xml:space="preserve">return 1 - (distance / </w:t>
                       </w:r>
                       <w:proofErr w:type="spellStart"/>
                       <w:r>
@@ -11403,14 +11333,14 @@
         <w:rPr>
           <w:lang w:val="en-US"/>
         </w:rPr>
-        <w:t>er1.HtmModules.Add(</w:t>
+        <w:t>er1.HtmModules.Add</w:t>
       </w:r>
       <w:proofErr w:type="gramEnd"/>
       <w:r>
         <w:rPr>
           <w:lang w:val="en-US"/>
         </w:rPr>
-        <w:t xml:space="preserve">"tm", tm);). </w:t>
+        <w:t xml:space="preserve">("tm", tm);). </w:t>
       </w:r>
       <w:r>
         <w:rPr>
@@ -11534,6 +11464,7 @@
         <w:rPr>
           <w:lang w:val="en-US"/>
         </w:rPr>
+        <w:lastRenderedPageBreak/>
         <w:t xml:space="preserve"> T</w:t>
       </w:r>
       <w:r>
@@ -12811,27 +12742,27 @@
           <mc:Fallback>
             <w:pict>
               <v:group w14:anchorId="73735853" id="Group 76" o:spid="_x0000_s1098" style="position:absolute;margin-left:35.1pt;margin-top:6.1pt;width:184.25pt;height:400.9pt;z-index:251671040" coordsize="23399,50914" o:gfxdata="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">
-                <v:group id="Group 74" o:spid="_x0000_s1099" style="position:absolute;width:23399;height:50914" coordsize="23405,50918" o:gfxdata="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">
-                  <v:rect id="Rectangle 40" o:spid="_x0000_s1100" style="position:absolute;top:21496;width:23405;height:24088;visibility:visible;mso-wrap-style:square;v-text-anchor:middle" o:gfxdata="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" fillcolor="#fff2cc [663]" strokecolor="#1f3763 [1604]" strokeweight="1pt"/>
-                  <v:shape id="Elbow Connector 49" o:spid="_x0000_s1101" type="#_x0000_t34" style="position:absolute;left:3935;top:30970;width:5487;height:6910;flip:x;visibility:visible;mso-wrap-style:square" o:connectortype="elbow" o:gfxdata="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" adj="21352" strokecolor="black [3200]" strokeweight="1pt">
+                <v:group id="Group 74" o:spid="_x0000_s1099" style="position:absolute;width:23399;height:50914" coordsize="23405,50918" o:gfxdata="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">
+                  <v:rect id="Rectangle 40" o:spid="_x0000_s1100" style="position:absolute;top:21496;width:23405;height:24088;visibility:visible;mso-wrap-style:square;v-text-anchor:middle" o:gfxdata="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" fillcolor="#fff2cc [663]" strokecolor="#1f3763 [1604]" strokeweight="1pt"/>
+                  <v:shape id="Elbow Connector 49" o:spid="_x0000_s1101" type="#_x0000_t34" style="position:absolute;left:3935;top:30970;width:5487;height:6910;flip:x;visibility:visible;mso-wrap-style:square" o:connectortype="elbow" o:gfxdata="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" adj="21352" strokecolor="black [3200]" strokeweight="1pt">
                     <v:stroke endarrow="block"/>
                   </v:shape>
-                  <v:shape id="Elbow Connector 51" o:spid="_x0000_s1102" type="#_x0000_t34" style="position:absolute;left:17212;top:31010;width:2306;height:6718;visibility:visible;mso-wrap-style:square" o:connectortype="elbow" o:gfxdata="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" adj="21352" strokecolor="black [3200]" strokeweight="1pt">
+                  <v:shape id="Elbow Connector 51" o:spid="_x0000_s1102" type="#_x0000_t34" style="position:absolute;left:17212;top:31010;width:2306;height:6718;visibility:visible;mso-wrap-style:square" o:connectortype="elbow" o:gfxdata="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" adj="21352" strokecolor="black [3200]" strokeweight="1pt">
                     <v:stroke endarrow="block"/>
                   </v:shape>
-                  <v:shape id="Curved Connector 60" o:spid="_x0000_s1103" type="#_x0000_t38" style="position:absolute;left:6241;top:39955;width:199;height:3737;flip:x;visibility:visible;mso-wrap-style:square" o:connectortype="curved" o:gfxdata="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" adj="180331" strokecolor="black [3200]" strokeweight="1pt">
+                  <v:shape id="Curved Connector 60" o:spid="_x0000_s1103" type="#_x0000_t38" style="position:absolute;left:6241;top:39955;width:199;height:3737;flip:x;visibility:visible;mso-wrap-style:square" o:connectortype="curved" o:gfxdata="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" adj="180331" strokecolor="black [3200]" strokeweight="1pt">
                     <v:stroke endarrow="block" joinstyle="miter"/>
                   </v:shape>
-                  <v:shape id="Curved Connector 62" o:spid="_x0000_s1104" type="#_x0000_t38" style="position:absolute;left:17095;top:39955;width:199;height:3737;flip:x;visibility:visible;mso-wrap-style:square" o:connectortype="curved" o:gfxdata="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" adj="-158384" strokecolor="black [3200]" strokeweight="1pt">
+                  <v:shape id="Curved Connector 62" o:spid="_x0000_s1104" type="#_x0000_t38" style="position:absolute;left:17095;top:39955;width:199;height:3737;flip:x;visibility:visible;mso-wrap-style:square" o:connectortype="curved" o:gfxdata="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" adj="-158384" strokecolor="black [3200]" strokeweight="1pt">
                     <v:stroke endarrow="block" joinstyle="miter"/>
                   </v:shape>
-                  <v:shape id="Straight Arrow Connector 47" o:spid="_x0000_s1105" type="#_x0000_t32" style="position:absolute;left:11608;top:25364;width:0;height:2209;visibility:visible;mso-wrap-style:square" o:connectortype="straight" o:gfxdata="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" strokecolor="black [3200]" strokeweight="1pt">
+                  <v:shape id="Straight Arrow Connector 47" o:spid="_x0000_s1105" type="#_x0000_t32" style="position:absolute;left:11608;top:25364;width:0;height:2209;visibility:visible;mso-wrap-style:square" o:connectortype="straight" o:gfxdata="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" strokecolor="black [3200]" strokeweight="1pt">
                     <v:stroke endarrow="block" joinstyle="miter"/>
                   </v:shape>
-                  <v:shape id="Straight Arrow Connector 41" o:spid="_x0000_s1106" type="#_x0000_t32" style="position:absolute;left:11608;top:2186;width:0;height:2209;visibility:visible;mso-wrap-style:square" o:connectortype="straight" o:gfxdata="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" strokecolor="black [3200]" strokeweight="1pt">
+                  <v:shape id="Straight Arrow Connector 41" o:spid="_x0000_s1106" type="#_x0000_t32" style="position:absolute;left:11608;top:2186;width:0;height:2209;visibility:visible;mso-wrap-style:square" o:connectortype="straight" o:gfxdata="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" strokecolor="black [3200]" strokeweight="1pt">
                     <v:stroke endarrow="block" joinstyle="miter"/>
                   </v:shape>
-                  <v:rect id="Rectangle 63" o:spid="_x0000_s1107" style="position:absolute;left:8468;width:6321;height:2182;visibility:visible;mso-wrap-style:square;v-text-anchor:middle" o:gfxdata="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" fillcolor="#f7caac [1301]" strokecolor="#1f3763 [1604]" strokeweight="1pt">
+                  <v:rect id="Rectangle 63" o:spid="_x0000_s1107" style="position:absolute;left:8468;width:6321;height:2182;visibility:visible;mso-wrap-style:square;v-text-anchor:middle" o:gfxdata="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" fillcolor="#f7caac [1301]" strokecolor="#1f3763 [1604]" strokeweight="1pt">
                     <v:textbox>
                       <w:txbxContent>
                         <w:p>
@@ -12851,7 +12782,7 @@
                       </w:txbxContent>
                     </v:textbox>
                   </v:rect>
-                  <v:rect id="Rectangle 65" o:spid="_x0000_s1108" style="position:absolute;left:8468;top:4373;width:6318;height:2178;visibility:visible;mso-wrap-style:square;v-text-anchor:middle" o:gfxdata="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" fillcolor="#b4c6e7 [1300]" strokecolor="#1f3763 [1604]" strokeweight="1pt">
+                  <v:rect id="Rectangle 65" o:spid="_x0000_s1108" style="position:absolute;left:8468;top:4373;width:6318;height:2178;visibility:visible;mso-wrap-style:square;v-text-anchor:middle" o:gfxdata="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" fillcolor="#b4c6e7 [1300]" strokecolor="#1f3763 [1604]" strokeweight="1pt">
                     <v:textbox>
                       <w:txbxContent>
                         <w:p>
@@ -12872,7 +12803,7 @@
                       </w:txbxContent>
                     </v:textbox>
                   </v:rect>
-                  <v:rect id="Rectangle 66" o:spid="_x0000_s1109" style="position:absolute;left:8468;top:8786;width:6318;height:2178;visibility:visible;mso-wrap-style:square;v-text-anchor:middle" o:gfxdata="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" fillcolor="#b4c6e7 [1300]" strokecolor="#1f3763 [1604]" strokeweight="1pt">
+                  <v:rect id="Rectangle 66" o:spid="_x0000_s1109" style="position:absolute;left:8468;top:8786;width:6318;height:2178;visibility:visible;mso-wrap-style:square;v-text-anchor:middle" o:gfxdata="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" fillcolor="#b4c6e7 [1300]" strokecolor="#1f3763 [1604]" strokeweight="1pt">
                     <v:textbox>
                       <w:txbxContent>
                         <w:p>
@@ -12893,7 +12824,7 @@
                       </w:txbxContent>
                     </v:textbox>
                   </v:rect>
-                  <v:rect id="Rectangle 67" o:spid="_x0000_s1110" style="position:absolute;left:5208;top:13119;width:12842;height:2178;visibility:visible;mso-wrap-style:square;v-text-anchor:middle" o:gfxdata="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" fillcolor="#b4c6e7 [1300]" strokecolor="#1f3763 [1604]" strokeweight="1pt">
+                  <v:rect id="Rectangle 67" o:spid="_x0000_s1110" style="position:absolute;left:5208;top:13119;width:12842;height:2178;visibility:visible;mso-wrap-style:square;v-text-anchor:middle" o:gfxdata="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" fillcolor="#b4c6e7 [1300]" strokecolor="#1f3763 [1604]" strokeweight="1pt">
                     <v:textbox>
                       <w:txbxContent>
                         <w:p>
@@ -12914,7 +12845,7 @@
                       </w:txbxContent>
                     </v:textbox>
                   </v:rect>
-                  <v:rect id="Rectangle 68" o:spid="_x0000_s1111" style="position:absolute;left:8468;top:17651;width:6318;height:2178;visibility:visible;mso-wrap-style:square;v-text-anchor:middle" o:gfxdata="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" fillcolor="#b4c6e7 [1300]" strokecolor="#1f3763 [1604]" strokeweight="1pt">
+                  <v:rect id="Rectangle 68" o:spid="_x0000_s1111" style="position:absolute;left:8468;top:17651;width:6318;height:2178;visibility:visible;mso-wrap-style:square;v-text-anchor:middle" o:gfxdata="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" fillcolor="#b4c6e7 [1300]" strokecolor="#1f3763 [1604]" strokeweight="1pt">
                     <v:textbox>
                       <w:txbxContent>
                         <w:p>
@@ -12935,7 +12866,7 @@
                       </w:txbxContent>
                     </v:textbox>
                   </v:rect>
-                  <v:rect id="Rectangle 70" o:spid="_x0000_s1112" style="position:absolute;left:1987;top:37887;width:8766;height:2179;visibility:visible;mso-wrap-style:square;v-text-anchor:middle" o:gfxdata="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" fillcolor="#b4c6e7 [1300]" strokecolor="#1f3763 [1604]" strokeweight="1pt">
+                  <v:rect id="Rectangle 70" o:spid="_x0000_s1112" style="position:absolute;left:1987;top:37887;width:8766;height:2179;visibility:visible;mso-wrap-style:square;v-text-anchor:middle" o:gfxdata="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" fillcolor="#b4c6e7 [1300]" strokecolor="#1f3763 [1604]" strokeweight="1pt">
                     <v:textbox>
                       <w:txbxContent>
                         <w:p>
@@ -12956,7 +12887,7 @@
                       </w:txbxContent>
                     </v:textbox>
                   </v:rect>
-                  <v:rect id="Rectangle 71" o:spid="_x0000_s1113" style="position:absolute;left:12563;top:37887;width:8766;height:2179;visibility:visible;mso-wrap-style:square;v-text-anchor:middle" o:gfxdata="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" fillcolor="#b4c6e7 [1300]" strokecolor="#1f3763 [1604]" strokeweight="1pt">
+                  <v:rect id="Rectangle 71" o:spid="_x0000_s1113" style="position:absolute;left:12563;top:37887;width:8766;height:2179;visibility:visible;mso-wrap-style:square;v-text-anchor:middle" o:gfxdata="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" fillcolor="#b4c6e7 [1300]" strokecolor="#1f3763 [1604]" strokeweight="1pt">
                     <v:textbox>
                       <w:txbxContent>
                         <w:p>
@@ -12991,7 +12922,7 @@
                       </w:txbxContent>
                     </v:textbox>
                   </v:rect>
-                  <v:rect id="Rectangle 12" o:spid="_x0000_s1114" style="position:absolute;left:6122;top:42221;width:11051;height:2178;visibility:visible;mso-wrap-style:square;v-text-anchor:middle" o:gfxdata="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" fillcolor="#a8d08d [1945]" strokecolor="#1f3763 [1604]" strokeweight="1pt">
+                  <v:rect id="Rectangle 12" o:spid="_x0000_s1114" style="position:absolute;left:6122;top:42221;width:11051;height:2178;visibility:visible;mso-wrap-style:square;v-text-anchor:middle" o:gfxdata="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" fillcolor="#a8d08d [1945]" strokecolor="#1f3763 [1604]" strokeweight="1pt">
                     <v:textbox>
                       <w:txbxContent>
                         <w:p>
@@ -13012,7 +12943,7 @@
                       </w:txbxContent>
                     </v:textbox>
                   </v:rect>
-                  <v:rect id="Rectangle 32" o:spid="_x0000_s1115" style="position:absolute;left:5486;top:47747;width:12315;height:3171;visibility:visible;mso-wrap-style:square;v-text-anchor:middle" o:gfxdata="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" fillcolor="#a9f3e1" strokecolor="#1f3763 [1604]" strokeweight="1pt">
+                  <v:rect id="Rectangle 32" o:spid="_x0000_s1115" style="position:absolute;left:5486;top:47747;width:12315;height:3171;visibility:visible;mso-wrap-style:square;v-text-anchor:middle" o:gfxdata="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" fillcolor="#a9f3e1" strokecolor="#1f3763 [1604]" strokeweight="1pt">
                     <v:textbox>
                       <w:txbxContent>
                         <w:p>
@@ -13033,7 +12964,7 @@
                       </w:txbxContent>
                     </v:textbox>
                   </v:rect>
-                  <v:shape id="Diamond 36" o:spid="_x0000_s1116" type="#_x0000_t4" style="position:absolute;left:5820;top:27432;width:11581;height:7131;visibility:visible;mso-wrap-style:square;v-text-anchor:middle" o:gfxdata="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" fillcolor="#b4c6e7 [1300]" strokecolor="#1f3763 [1604]" strokeweight="1pt">
+                  <v:shape id="Diamond 36" o:spid="_x0000_s1116" type="#_x0000_t4" style="position:absolute;left:5820;top:27432;width:11581;height:7131;visibility:visible;mso-wrap-style:square;v-text-anchor:middle" o:gfxdata="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" fillcolor="#b4c6e7 [1300]" strokecolor="#1f3763 [1604]" strokeweight="1pt">
                     <v:textbox>
                       <w:txbxContent>
                         <w:p>
@@ -13054,19 +12985,19 @@
                       </w:txbxContent>
                     </v:textbox>
                   </v:shape>
-                  <v:shape id="Straight Arrow Connector 42" o:spid="_x0000_s1117" type="#_x0000_t32" style="position:absolute;left:11608;top:6599;width:0;height:2209;visibility:visible;mso-wrap-style:square" o:connectortype="straight" o:gfxdata="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" strokecolor="black [3200]" strokeweight="1pt">
+                  <v:shape id="Straight Arrow Connector 42" o:spid="_x0000_s1117" type="#_x0000_t32" style="position:absolute;left:11608;top:6599;width:0;height:2209;visibility:visible;mso-wrap-style:square" o:connectortype="straight" o:gfxdata="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" strokecolor="black [3200]" strokeweight="1pt">
                     <v:stroke endarrow="block" joinstyle="miter"/>
                   </v:shape>
-                  <v:shape id="Straight Arrow Connector 43" o:spid="_x0000_s1118" type="#_x0000_t32" style="position:absolute;left:11608;top:11052;width:0;height:2203;visibility:visible;mso-wrap-style:square" o:connectortype="straight" o:gfxdata="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" strokecolor="black [3200]" strokeweight="1pt">
+                  <v:shape id="Straight Arrow Connector 43" o:spid="_x0000_s1118" type="#_x0000_t32" style="position:absolute;left:11608;top:11052;width:0;height:2203;visibility:visible;mso-wrap-style:square" o:connectortype="straight" o:gfxdata="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" strokecolor="black [3200]" strokeweight="1pt">
                     <v:stroke endarrow="block" joinstyle="miter"/>
                   </v:shape>
-                  <v:shape id="Straight Arrow Connector 44" o:spid="_x0000_s1119" type="#_x0000_t32" style="position:absolute;left:11608;top:15465;width:0;height:2209;visibility:visible;mso-wrap-style:square" o:connectortype="straight" o:gfxdata="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" strokecolor="black [3200]" strokeweight="1pt">
+                  <v:shape id="Straight Arrow Connector 44" o:spid="_x0000_s1119" type="#_x0000_t32" style="position:absolute;left:11608;top:15465;width:0;height:2209;visibility:visible;mso-wrap-style:square" o:connectortype="straight" o:gfxdata="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" strokecolor="black [3200]" strokeweight="1pt">
                     <v:stroke endarrow="block" joinstyle="miter"/>
                   </v:shape>
-                  <v:shape id="Straight Arrow Connector 46" o:spid="_x0000_s1120" type="#_x0000_t32" style="position:absolute;left:11688;top:19838;width:0;height:3944;visibility:visible;mso-wrap-style:square" o:connectortype="straight" o:gfxdata="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" strokecolor="black [3200]" strokeweight="1pt">
+                  <v:shape id="Straight Arrow Connector 46" o:spid="_x0000_s1120" type="#_x0000_t32" style="position:absolute;left:11688;top:19838;width:0;height:3944;visibility:visible;mso-wrap-style:square" o:connectortype="straight" o:gfxdata="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" strokecolor="black [3200]" strokeweight="1pt">
                     <v:stroke endarrow="block" joinstyle="miter"/>
                   </v:shape>
-                  <v:rect id="Rectangle 69" o:spid="_x0000_s1121" style="position:absolute;left:7315;top:23575;width:8766;height:2178;visibility:visible;mso-wrap-style:square;v-text-anchor:middle" o:gfxdata="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" fillcolor="#b4c6e7 [1300]" strokecolor="#1f3763 [1604]" strokeweight="1pt">
+                  <v:rect id="Rectangle 69" o:spid="_x0000_s1121" style="position:absolute;left:7315;top:23575;width:8766;height:2178;visibility:visible;mso-wrap-style:square;v-text-anchor:middle" o:gfxdata="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" fillcolor="#b4c6e7 [1300]" strokecolor="#1f3763 [1604]" strokeweight="1pt">
                     <v:textbox>
                       <w:txbxContent>
                         <w:p>
@@ -13088,11 +13019,11 @@
                       </w:txbxContent>
                     </v:textbox>
                   </v:rect>
-                  <v:shape id="Straight Arrow Connector 73" o:spid="_x0000_s1122" type="#_x0000_t32" style="position:absolute;left:11569;top:44408;width:0;height:3348;visibility:visible;mso-wrap-style:square" o:connectortype="straight" o:gfxdata="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" strokecolor="black [3200]" strokeweight="1pt">
+                  <v:shape id="Straight Arrow Connector 73" o:spid="_x0000_s1122" type="#_x0000_t32" style="position:absolute;left:11569;top:44408;width:0;height:3348;visibility:visible;mso-wrap-style:square" o:connectortype="straight" o:gfxdata="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" strokecolor="black [3200]" strokeweight="1pt">
                     <v:stroke endarrow="block" joinstyle="miter"/>
                   </v:shape>
                 </v:group>
-                <v:rect id="Rectangle 72" o:spid="_x0000_s1123" style="position:absolute;left:296;top:33310;width:8074;height:2133;visibility:visible;mso-wrap-style:square;v-text-anchor:middle" o:gfxdata="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" filled="f" stroked="f" strokeweight="1pt">
+                <v:rect id="Rectangle 72" o:spid="_x0000_s1123" style="position:absolute;left:296;top:33310;width:8074;height:2133;visibility:visible;mso-wrap-style:square;v-text-anchor:middle" o:gfxdata="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" filled="f" stroked="f" strokeweight="1pt">
                   <v:textbox>
                     <w:txbxContent>
                       <w:p>
@@ -13114,7 +13045,7 @@
                     </w:txbxContent>
                   </v:textbox>
                 </v:rect>
-                <v:rect id="Rectangle 75" o:spid="_x0000_s1124" style="position:absolute;left:15437;top:33310;width:7715;height:2133;visibility:visible;mso-wrap-style:square;v-text-anchor:middle" o:gfxdata="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" filled="f" stroked="f" strokeweight="1pt">
+                <v:rect id="Rectangle 75" o:spid="_x0000_s1124" style="position:absolute;left:15437;top:33310;width:7715;height:2133;visibility:visible;mso-wrap-style:square;v-text-anchor:middle" o:gfxdata="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" filled="f" stroked="f" strokeweight="1pt">
                   <v:textbox>
                     <w:txbxContent>
                       <w:p>
@@ -13466,28 +13397,28 @@
         <w:rPr>
           <w:lang w:val="en-US"/>
         </w:rPr>
-        <w:t xml:space="preserve">Before computing similarity between subsequences, we merged the SDRs corresponding to each token ID within a given subsequence. This merging step is necessary because a subsequence typically contains multiple tokens, and as a result, each token ID generates its own individual SDR. However, our goal is to compare entire subsequences as unified entities, rather than performing token-by-token </w:t>
+        <w:t>Before computing similarity between subsequences, we merged the SDRs corresponding to each token ID within a given subsequence. This merging step is necessary because a subsequence typically contains multiple tokens, and as a result, each token ID generates its own individual SDR. However, our goal is to compare entire subsequences as unified entities, rather than performing token-by-token comparisons. To achieve this, we combine the individual SDRs into a single representation—this process is referred to as merging.</w:t>
+      </w:r>
+    </w:p>
+    <w:p>
+      <w:pPr>
+        <w:pStyle w:val="BodyText"/>
+        <w:rPr>
+          <w:lang w:val="en-US"/>
+        </w:rPr>
+      </w:pPr>
+      <w:r>
+        <w:rPr>
+          <w:lang w:val="en-US"/>
+        </w:rPr>
+        <w:t xml:space="preserve">The merging is analogous to concatenating words to form a sentence: just as words combine to express a complete </w:t>
       </w:r>
       <w:r>
         <w:rPr>
           <w:lang w:val="en-US"/>
         </w:rPr>
         <w:lastRenderedPageBreak/>
-        <w:t>comparisons. To achieve this, we combine the individual SDRs into a single representation—this process is referred to as merging.</w:t>
-      </w:r>
-    </w:p>
-    <w:p>
-      <w:pPr>
-        <w:pStyle w:val="BodyText"/>
-        <w:rPr>
-          <w:lang w:val="en-US"/>
-        </w:rPr>
-      </w:pPr>
-      <w:r>
-        <w:rPr>
-          <w:lang w:val="en-US"/>
-        </w:rPr>
-        <w:t>The merging is analogous to concatenating words to form a sentence: just as words combine to express a complete thought, individual token SDRs are merged to capture the full meaning of a subsequence.</w:t>
+        <w:t>thought, individual token SDRs are merged to capture the full meaning of a subsequence.</w:t>
       </w:r>
     </w:p>
     <w:p>
@@ -13834,7 +13765,6 @@
                               <w:t xml:space="preserve">    </w:t>
                             </w:r>
                             <w:proofErr w:type="spellStart"/>
-                            <w:proofErr w:type="gramStart"/>
                             <w:r>
                               <w:rPr>
                                 <w:sz w:val="18"/>
@@ -13844,7 +13774,6 @@
                               <w:t>var</w:t>
                             </w:r>
                             <w:proofErr w:type="spellEnd"/>
-                            <w:proofErr w:type="gramEnd"/>
                             <w:r>
                               <w:rPr>
                                 <w:sz w:val="18"/>
@@ -13890,6 +13819,7 @@
                               <w:t>(</w:t>
                             </w:r>
                             <w:proofErr w:type="spellStart"/>
+                            <w:proofErr w:type="gramStart"/>
                             <w:r>
                               <w:rPr>
                                 <w:sz w:val="18"/>
@@ -13899,6 +13829,7 @@
                               <w:t>token.ToString</w:t>
                             </w:r>
                             <w:proofErr w:type="spellEnd"/>
+                            <w:proofErr w:type="gramEnd"/>
                             <w:r>
                               <w:rPr>
                                 <w:sz w:val="18"/>
@@ -14391,7 +14322,6 @@
                               <w:t xml:space="preserve">         </w:t>
                             </w:r>
                             <w:proofErr w:type="spellStart"/>
-                            <w:proofErr w:type="gramStart"/>
                             <w:r>
                               <w:rPr>
                                 <w:sz w:val="18"/>
@@ -14401,7 +14331,6 @@
                               <w:t>numCellsPerColumn</w:t>
                             </w:r>
                             <w:proofErr w:type="spellEnd"/>
-                            <w:proofErr w:type="gramEnd"/>
                             <w:r>
                               <w:rPr>
                                 <w:sz w:val="18"/>
@@ -14442,19 +14371,9 @@
                                 <w:szCs w:val="19"/>
                                 <w:highlight w:val="white"/>
                               </w:rPr>
-                              <w:t xml:space="preserve">         </w:t>
-                            </w:r>
-                            <w:proofErr w:type="gramStart"/>
-                            <w:r>
-                              <w:rPr>
-                                <w:sz w:val="18"/>
-                                <w:szCs w:val="19"/>
-                                <w:highlight w:val="white"/>
-                              </w:rPr>
-                              <w:t>binarySDR1.AddRange(</w:t>
+                              <w:t xml:space="preserve">         binarySDR1.AddRange(</w:t>
                             </w:r>
                             <w:proofErr w:type="spellStart"/>
-                            <w:proofErr w:type="gramEnd"/>
                             <w:r>
                               <w:rPr>
                                 <w:sz w:val="18"/>
@@ -14778,7 +14697,6 @@
                         <w:t xml:space="preserve">    </w:t>
                       </w:r>
                       <w:proofErr w:type="spellStart"/>
-                      <w:proofErr w:type="gramStart"/>
                       <w:r>
                         <w:rPr>
                           <w:sz w:val="18"/>
@@ -14788,7 +14706,6 @@
                         <w:t>var</w:t>
                       </w:r>
                       <w:proofErr w:type="spellEnd"/>
-                      <w:proofErr w:type="gramEnd"/>
                       <w:r>
                         <w:rPr>
                           <w:sz w:val="18"/>
@@ -14834,6 +14751,7 @@
                         <w:t>(</w:t>
                       </w:r>
                       <w:proofErr w:type="spellStart"/>
+                      <w:proofErr w:type="gramStart"/>
                       <w:r>
                         <w:rPr>
                           <w:sz w:val="18"/>
@@ -14843,6 +14761,7 @@
                         <w:t>token.ToString</w:t>
                       </w:r>
                       <w:proofErr w:type="spellEnd"/>
+                      <w:proofErr w:type="gramEnd"/>
                       <w:r>
                         <w:rPr>
                           <w:sz w:val="18"/>
@@ -15335,7 +15254,6 @@
                         <w:t xml:space="preserve">         </w:t>
                       </w:r>
                       <w:proofErr w:type="spellStart"/>
-                      <w:proofErr w:type="gramStart"/>
                       <w:r>
                         <w:rPr>
                           <w:sz w:val="18"/>
@@ -15345,7 +15263,6 @@
                         <w:t>numCellsPerColumn</w:t>
                       </w:r>
                       <w:proofErr w:type="spellEnd"/>
-                      <w:proofErr w:type="gramEnd"/>
                       <w:r>
                         <w:rPr>
                           <w:sz w:val="18"/>
@@ -15386,19 +15303,9 @@
                           <w:szCs w:val="19"/>
                           <w:highlight w:val="white"/>
                         </w:rPr>
-                        <w:t xml:space="preserve">         </w:t>
-                      </w:r>
-                      <w:proofErr w:type="gramStart"/>
-                      <w:r>
-                        <w:rPr>
-                          <w:sz w:val="18"/>
-                          <w:szCs w:val="19"/>
-                          <w:highlight w:val="white"/>
-                        </w:rPr>
-                        <w:t>binarySDR1.AddRange(</w:t>
+                        <w:t xml:space="preserve">         binarySDR1.AddRange(</w:t>
                       </w:r>
                       <w:proofErr w:type="spellStart"/>
-                      <w:proofErr w:type="gramEnd"/>
                       <w:r>
                         <w:rPr>
                           <w:sz w:val="18"/>
@@ -15879,7 +15786,14 @@
         <w:rPr>
           <w:lang w:val="en-US"/>
         </w:rPr>
-        <w:t>It then iterates through the list of active indices and sets the corresponding positions in the binary vector to 1, ensuring that active locat</w:t>
+        <w:t xml:space="preserve">It then iterates through </w:t>
+      </w:r>
+      <w:r>
+        <w:rPr>
+          <w:lang w:val="en-US"/>
+        </w:rPr>
+        <w:lastRenderedPageBreak/>
+        <w:t>the list of active indices and sets the corresponding positions in the binary vector to 1, ensuring that active locat</w:t>
       </w:r>
       <w:r>
         <w:rPr>
@@ -15961,23 +15875,15 @@
                                 <w:szCs w:val="18"/>
                               </w:rPr>
                             </w:pPr>
-                            <w:proofErr w:type="gramStart"/>
                             <w:r>
                               <w:rPr>
                                 <w:sz w:val="18"/>
                                 <w:szCs w:val="18"/>
                               </w:rPr>
-                              <w:t>private</w:t>
-                            </w:r>
-                            <w:proofErr w:type="gramEnd"/>
-                            <w:r>
-                              <w:rPr>
-                                <w:sz w:val="18"/>
-                                <w:szCs w:val="18"/>
-                              </w:rPr>
-                              <w:t xml:space="preserve"> static </w:t>
+                              <w:t xml:space="preserve">private static </w:t>
                             </w:r>
                             <w:proofErr w:type="spellStart"/>
+                            <w:proofErr w:type="gramStart"/>
                             <w:r>
                               <w:rPr>
                                 <w:sz w:val="18"/>
@@ -15991,7 +15897,15 @@
                                 <w:sz w:val="18"/>
                                 <w:szCs w:val="18"/>
                               </w:rPr>
-                              <w:t xml:space="preserve">[] </w:t>
+                              <w:t>[</w:t>
+                            </w:r>
+                            <w:proofErr w:type="gramEnd"/>
+                            <w:r>
+                              <w:rPr>
+                                <w:sz w:val="18"/>
+                                <w:szCs w:val="18"/>
+                              </w:rPr>
+                              <w:t xml:space="preserve">] </w:t>
                             </w:r>
                             <w:proofErr w:type="spellStart"/>
                             <w:r>
@@ -16106,7 +16020,6 @@
                               <w:t xml:space="preserve">    </w:t>
                             </w:r>
                             <w:proofErr w:type="spellStart"/>
-                            <w:proofErr w:type="gramStart"/>
                             <w:r>
                               <w:rPr>
                                 <w:sz w:val="18"/>
@@ -16115,7 +16028,6 @@
                               <w:t>var</w:t>
                             </w:r>
                             <w:proofErr w:type="spellEnd"/>
-                            <w:proofErr w:type="gramEnd"/>
                             <w:r>
                               <w:rPr>
                                 <w:sz w:val="18"/>
@@ -16197,7 +16109,6 @@
                               <w:t xml:space="preserve">    </w:t>
                             </w:r>
                             <w:proofErr w:type="spellStart"/>
-                            <w:proofErr w:type="gramStart"/>
                             <w:r>
                               <w:rPr>
                                 <w:sz w:val="18"/>
@@ -16206,7 +16117,6 @@
                               <w:t>foreach</w:t>
                             </w:r>
                             <w:proofErr w:type="spellEnd"/>
-                            <w:proofErr w:type="gramEnd"/>
                             <w:r>
                               <w:rPr>
                                 <w:sz w:val="18"/>
@@ -16372,7 +16282,6 @@
                               <w:t xml:space="preserve">     </w:t>
                             </w:r>
                             <w:proofErr w:type="spellStart"/>
-                            <w:proofErr w:type="gramStart"/>
                             <w:r>
                               <w:rPr>
                                 <w:sz w:val="18"/>
@@ -16386,15 +16295,7 @@
                                 <w:sz w:val="18"/>
                                 <w:szCs w:val="18"/>
                               </w:rPr>
-                              <w:t>[</w:t>
-                            </w:r>
-                            <w:proofErr w:type="gramEnd"/>
-                            <w:r>
-                              <w:rPr>
-                                <w:sz w:val="18"/>
-                                <w:szCs w:val="18"/>
-                              </w:rPr>
-                              <w:t>index] = 1;</w:t>
+                              <w:t>[index] = 1;</w:t>
                             </w:r>
                           </w:p>
                           <w:p>
@@ -16449,23 +16350,7 @@
                                 <w:sz w:val="18"/>
                                 <w:szCs w:val="18"/>
                               </w:rPr>
-                              <w:t xml:space="preserve">    </w:t>
-                            </w:r>
-                            <w:proofErr w:type="gramStart"/>
-                            <w:r>
-                              <w:rPr>
-                                <w:sz w:val="18"/>
-                                <w:szCs w:val="18"/>
-                              </w:rPr>
-                              <w:t>return</w:t>
-                            </w:r>
-                            <w:proofErr w:type="gramEnd"/>
-                            <w:r>
-                              <w:rPr>
-                                <w:sz w:val="18"/>
-                                <w:szCs w:val="18"/>
-                              </w:rPr>
-                              <w:t xml:space="preserve"> </w:t>
+                              <w:t xml:space="preserve">    return </w:t>
                             </w:r>
                             <w:proofErr w:type="spellStart"/>
                             <w:r>
@@ -16530,23 +16415,15 @@
                           <w:szCs w:val="18"/>
                         </w:rPr>
                       </w:pPr>
-                      <w:proofErr w:type="gramStart"/>
                       <w:r>
                         <w:rPr>
                           <w:sz w:val="18"/>
                           <w:szCs w:val="18"/>
                         </w:rPr>
-                        <w:t>private</w:t>
-                      </w:r>
-                      <w:proofErr w:type="gramEnd"/>
-                      <w:r>
-                        <w:rPr>
-                          <w:sz w:val="18"/>
-                          <w:szCs w:val="18"/>
-                        </w:rPr>
-                        <w:t xml:space="preserve"> static </w:t>
+                        <w:t xml:space="preserve">private static </w:t>
                       </w:r>
                       <w:proofErr w:type="spellStart"/>
+                      <w:proofErr w:type="gramStart"/>
                       <w:r>
                         <w:rPr>
                           <w:sz w:val="18"/>
@@ -16560,7 +16437,15 @@
                           <w:sz w:val="18"/>
                           <w:szCs w:val="18"/>
                         </w:rPr>
-                        <w:t xml:space="preserve">[] </w:t>
+                        <w:t>[</w:t>
+                      </w:r>
+                      <w:proofErr w:type="gramEnd"/>
+                      <w:r>
+                        <w:rPr>
+                          <w:sz w:val="18"/>
+                          <w:szCs w:val="18"/>
+                        </w:rPr>
+                        <w:t xml:space="preserve">] </w:t>
                       </w:r>
                       <w:proofErr w:type="spellStart"/>
                       <w:r>
@@ -16675,7 +16560,6 @@
                         <w:t xml:space="preserve">    </w:t>
                       </w:r>
                       <w:proofErr w:type="spellStart"/>
-                      <w:proofErr w:type="gramStart"/>
                       <w:r>
                         <w:rPr>
                           <w:sz w:val="18"/>
@@ -16684,7 +16568,6 @@
                         <w:t>var</w:t>
                       </w:r>
                       <w:proofErr w:type="spellEnd"/>
-                      <w:proofErr w:type="gramEnd"/>
                       <w:r>
                         <w:rPr>
                           <w:sz w:val="18"/>
@@ -16766,7 +16649,6 @@
                         <w:t xml:space="preserve">    </w:t>
                       </w:r>
                       <w:proofErr w:type="spellStart"/>
-                      <w:proofErr w:type="gramStart"/>
                       <w:r>
                         <w:rPr>
                           <w:sz w:val="18"/>
@@ -16775,7 +16657,6 @@
                         <w:t>foreach</w:t>
                       </w:r>
                       <w:proofErr w:type="spellEnd"/>
-                      <w:proofErr w:type="gramEnd"/>
                       <w:r>
                         <w:rPr>
                           <w:sz w:val="18"/>
@@ -16941,7 +16822,6 @@
                         <w:t xml:space="preserve">     </w:t>
                       </w:r>
                       <w:proofErr w:type="spellStart"/>
-                      <w:proofErr w:type="gramStart"/>
                       <w:r>
                         <w:rPr>
                           <w:sz w:val="18"/>
@@ -16955,15 +16835,7 @@
                           <w:sz w:val="18"/>
                           <w:szCs w:val="18"/>
                         </w:rPr>
-                        <w:t>[</w:t>
-                      </w:r>
-                      <w:proofErr w:type="gramEnd"/>
-                      <w:r>
-                        <w:rPr>
-                          <w:sz w:val="18"/>
-                          <w:szCs w:val="18"/>
-                        </w:rPr>
-                        <w:t>index] = 1;</w:t>
+                        <w:t>[index] = 1;</w:t>
                       </w:r>
                     </w:p>
                     <w:p>
@@ -17018,23 +16890,7 @@
                           <w:sz w:val="18"/>
                           <w:szCs w:val="18"/>
                         </w:rPr>
-                        <w:t xml:space="preserve">    </w:t>
-                      </w:r>
-                      <w:proofErr w:type="gramStart"/>
-                      <w:r>
-                        <w:rPr>
-                          <w:sz w:val="18"/>
-                          <w:szCs w:val="18"/>
-                        </w:rPr>
-                        <w:t>return</w:t>
-                      </w:r>
-                      <w:proofErr w:type="gramEnd"/>
-                      <w:r>
-                        <w:rPr>
-                          <w:sz w:val="18"/>
-                          <w:szCs w:val="18"/>
-                        </w:rPr>
-                        <w:t xml:space="preserve"> </w:t>
+                        <w:t xml:space="preserve">    return </w:t>
                       </w:r>
                       <w:proofErr w:type="spellStart"/>
                       <w:r>
@@ -17228,21 +17084,23 @@
           <w:lang w:val="en-US"/>
         </w:rPr>
       </w:pPr>
-      <w:r>
+    </w:p>
+    <w:p>
+      <w:pPr>
+        <w:pStyle w:val="BodyText"/>
         <w:rPr>
           <w:b/>
           <w:i/>
           <w:lang w:val="en-US"/>
         </w:rPr>
-        <w:t>G</w:t>
-      </w:r>
+      </w:pPr>
       <w:r>
         <w:rPr>
           <w:b/>
           <w:i/>
           <w:lang w:val="en-US"/>
         </w:rPr>
-        <w:t>.</w:t>
+        <w:t>G</w:t>
       </w:r>
       <w:r>
         <w:rPr>
@@ -17250,7 +17108,7 @@
           <w:i/>
           <w:lang w:val="en-US"/>
         </w:rPr>
-        <w:t xml:space="preserve"> </w:t>
+        <w:t>.</w:t>
       </w:r>
       <w:r>
         <w:rPr>
@@ -17258,7 +17116,7 @@
           <w:i/>
           <w:lang w:val="en-US"/>
         </w:rPr>
-        <w:t>Similarity Computa</w:t>
+        <w:t xml:space="preserve"> </w:t>
       </w:r>
       <w:r>
         <w:rPr>
@@ -17266,7 +17124,7 @@
           <w:i/>
           <w:lang w:val="en-US"/>
         </w:rPr>
-        <w:t>tion</w:t>
+        <w:t>Similarity Computa</w:t>
       </w:r>
       <w:r>
         <w:rPr>
@@ -17274,7 +17132,7 @@
           <w:i/>
           <w:lang w:val="en-US"/>
         </w:rPr>
-        <w:t xml:space="preserve"> of Subsequence’s SDRs</w:t>
+        <w:t>tion</w:t>
       </w:r>
       <w:r>
         <w:rPr>
@@ -17282,122 +17140,102 @@
           <w:i/>
           <w:lang w:val="en-US"/>
         </w:rPr>
-        <w:t>:</w:t>
-      </w:r>
-    </w:p>
-    <w:p>
-      <w:pPr>
-        <w:pStyle w:val="BodyText"/>
-        <w:rPr>
-          <w:lang w:val="en-US"/>
-        </w:rPr>
-      </w:pPr>
-      <w:r>
-        <w:rPr>
-          <w:lang w:val="en-US"/>
-        </w:rPr>
-        <w:t>We performed</w:t>
-      </w:r>
-      <w:r>
-        <w:rPr>
-          <w:lang w:val="en-US"/>
-        </w:rPr>
-        <w:t xml:space="preserve"> similarity comparisons between two binary SD</w:t>
-      </w:r>
-      <w:r>
-        <w:rPr>
-          <w:lang w:val="en-US"/>
-        </w:rPr>
-        <w:t>Rs (we got from merging in previous section)</w:t>
-      </w:r>
-      <w:r>
-        <w:rPr>
-          <w:lang w:val="en-US"/>
-        </w:rPr>
-        <w:t xml:space="preserve"> using two different metrics: </w:t>
-      </w:r>
-      <w:r>
-        <w:rPr>
-          <w:b/>
-          <w:lang w:val="en-US"/>
-        </w:rPr>
-        <w:t>cosine similarity and Euclidean similarity.</w:t>
-      </w:r>
-      <w:r>
-        <w:rPr>
-          <w:lang w:val="en-US"/>
-        </w:rPr>
-        <w:t xml:space="preserve"> First, it checked</w:t>
-      </w:r>
-      <w:r>
-        <w:rPr>
-          <w:lang w:val="en-US"/>
-        </w:rPr>
-        <w:t xml:space="preserve"> if both SDRs contain data (n</w:t>
-      </w:r>
-      <w:r>
-        <w:rPr>
-          <w:lang w:val="en-US"/>
-        </w:rPr>
-        <w:t>on-zero counts), then calculated and displayed</w:t>
-      </w:r>
-      <w:r>
-        <w:rPr>
-          <w:lang w:val="en-US"/>
-        </w:rPr>
-        <w:t xml:space="preserve"> both similarity scores. The cosine similarity measures the angle </w:t>
-      </w:r>
-      <w:r>
-        <w:rPr>
-          <w:lang w:val="en-US"/>
-        </w:rPr>
-        <w:t>between vectors, ranging from 0</w:t>
-      </w:r>
-      <w:r>
-        <w:rPr>
-          <w:lang w:val="en-US"/>
-        </w:rPr>
-        <w:t xml:space="preserve"> (opposite) to 1 (identical), while the Euclidean similarity converts the straight-line distance between vectors into a normalized score from 0 (dissimilar) to</w:t>
-      </w:r>
-      <w:r>
-        <w:rPr>
-          <w:lang w:val="en-US"/>
-        </w:rPr>
-        <w:t xml:space="preserve"> 1 (identical). If either SDR was empty, it output</w:t>
-      </w:r>
-      <w:r>
-        <w:rPr>
-          <w:lang w:val="en-US"/>
-        </w:rPr>
-        <w:t xml:space="preserve"> a message indicating no comparison could be made.</w:t>
-      </w:r>
-    </w:p>
-    <w:p>
-      <w:pPr>
-        <w:pStyle w:val="BodyText"/>
-        <w:rPr>
-          <w:lang w:val="en-US"/>
-        </w:rPr>
-      </w:pPr>
+        <w:t xml:space="preserve"> of Subsequence’s SDRs</w:t>
+      </w:r>
       <w:r>
         <w:rPr>
           <w:b/>
           <w:i/>
           <w:lang w:val="en-US"/>
         </w:rPr>
-        <w:t>Cosine Similarity:</w:t>
-      </w:r>
-      <w:r>
-        <w:rPr>
-          <w:lang w:val="en-US"/>
-        </w:rPr>
-        <w:t xml:space="preserve"> </w:t>
-      </w:r>
-      <w:r>
-        <w:rPr>
-          <w:lang w:val="en-US"/>
-        </w:rPr>
-        <w:t>For cosine similarity, the calculation involves computing the dot product of the vectors and dividing it by the product of their magnitudes, automatically returning zero if either vector's magnitude equals zero to avoid division errors.</w:t>
+        <w:t>:</w:t>
+      </w:r>
+    </w:p>
+    <w:p>
+      <w:pPr>
+        <w:pStyle w:val="BodyText"/>
+        <w:rPr>
+          <w:lang w:val="en-US"/>
+        </w:rPr>
+      </w:pPr>
+      <w:r>
+        <w:rPr>
+          <w:lang w:val="en-US"/>
+        </w:rPr>
+        <w:t>We performed</w:t>
+      </w:r>
+      <w:r>
+        <w:rPr>
+          <w:lang w:val="en-US"/>
+        </w:rPr>
+        <w:t xml:space="preserve"> similarity comparisons between two binary SD</w:t>
+      </w:r>
+      <w:r>
+        <w:rPr>
+          <w:lang w:val="en-US"/>
+        </w:rPr>
+        <w:t>Rs (we got from merging in previous section)</w:t>
+      </w:r>
+      <w:r>
+        <w:rPr>
+          <w:lang w:val="en-US"/>
+        </w:rPr>
+        <w:t xml:space="preserve"> using two different metrics: </w:t>
+      </w:r>
+      <w:r>
+        <w:rPr>
+          <w:b/>
+          <w:lang w:val="en-US"/>
+        </w:rPr>
+        <w:t>cosine similarity and Euclidean similarity.</w:t>
+      </w:r>
+      <w:r>
+        <w:rPr>
+          <w:lang w:val="en-US"/>
+        </w:rPr>
+        <w:t xml:space="preserve"> First, it checked</w:t>
+      </w:r>
+      <w:r>
+        <w:rPr>
+          <w:lang w:val="en-US"/>
+        </w:rPr>
+        <w:t xml:space="preserve"> if both SDRs contain data (n</w:t>
+      </w:r>
+      <w:r>
+        <w:rPr>
+          <w:lang w:val="en-US"/>
+        </w:rPr>
+        <w:t>on-zero counts), then calculated and displayed</w:t>
+      </w:r>
+      <w:r>
+        <w:rPr>
+          <w:lang w:val="en-US"/>
+        </w:rPr>
+        <w:t xml:space="preserve"> both similarity scores. The cosine similarity measures the angle </w:t>
+      </w:r>
+      <w:r>
+        <w:rPr>
+          <w:lang w:val="en-US"/>
+        </w:rPr>
+        <w:t>between vectors, ranging from 0</w:t>
+      </w:r>
+      <w:r>
+        <w:rPr>
+          <w:lang w:val="en-US"/>
+        </w:rPr>
+        <w:t xml:space="preserve"> (opposite) to 1 (identical), while the Euclidean similarity converts the straight-line distance between vectors into a normalized score from 0 (dissimilar) to</w:t>
+      </w:r>
+      <w:r>
+        <w:rPr>
+          <w:lang w:val="en-US"/>
+        </w:rPr>
+        <w:t xml:space="preserve"> 1 (identical). If either SDR was empty, it output</w:t>
+      </w:r>
+      <w:r>
+        <w:rPr>
+          <w:lang w:val="en-US"/>
+        </w:rPr>
+        <w:t xml:space="preserve"> a message indicating no comparison could be made.</w:t>
       </w:r>
     </w:p>
     <w:p>
@@ -17413,6 +17251,34 @@
           <w:i/>
           <w:lang w:val="en-US"/>
         </w:rPr>
+        <w:t>Cosine Similarity:</w:t>
+      </w:r>
+      <w:r>
+        <w:rPr>
+          <w:lang w:val="en-US"/>
+        </w:rPr>
+        <w:t xml:space="preserve"> </w:t>
+      </w:r>
+      <w:r>
+        <w:rPr>
+          <w:lang w:val="en-US"/>
+        </w:rPr>
+        <w:t>For cosine similarity, the calculation involves computing the dot product of the vectors and dividing it by the product of their magnitudes, automatically returning zero if either vector's magnitude equals zero to avoid division errors.</w:t>
+      </w:r>
+    </w:p>
+    <w:p>
+      <w:pPr>
+        <w:pStyle w:val="BodyText"/>
+        <w:rPr>
+          <w:lang w:val="en-US"/>
+        </w:rPr>
+      </w:pPr>
+      <w:r>
+        <w:rPr>
+          <w:b/>
+          <w:i/>
+          <w:lang w:val="en-US"/>
+        </w:rPr>
         <w:t>Euclidean Distance:</w:t>
       </w:r>
       <w:r>
@@ -17499,22 +17365,57 @@
           <w:lang w:val="en-US" w:eastAsia="en-US"/>
         </w:rPr>
       </w:pPr>
-      <w:r>
+    </w:p>
+    <w:p>
+      <w:pPr>
+        <w:pStyle w:val="BodyText"/>
         <w:rPr>
           <w:noProof/>
           <w:lang w:val="en-US" w:eastAsia="en-US"/>
         </w:rPr>
-        <w:lastRenderedPageBreak/>
+      </w:pPr>
+    </w:p>
+    <w:p>
+      <w:pPr>
+        <w:pStyle w:val="BodyText"/>
+        <w:rPr>
+          <w:noProof/>
+          <w:lang w:val="en-US" w:eastAsia="en-US"/>
+        </w:rPr>
+      </w:pPr>
+    </w:p>
+    <w:p>
+      <w:pPr>
+        <w:pStyle w:val="BodyText"/>
+        <w:rPr>
+          <w:noProof/>
+          <w:lang w:val="en-US" w:eastAsia="en-US"/>
+        </w:rPr>
+      </w:pPr>
+    </w:p>
+    <w:p>
+      <w:pPr>
+        <w:pStyle w:val="BodyText"/>
+        <w:rPr>
+          <w:noProof/>
+          <w:lang w:val="en-US" w:eastAsia="en-US"/>
+        </w:rPr>
+      </w:pPr>
+      <w:r>
+        <w:rPr>
+          <w:noProof/>
+          <w:lang w:val="en-US" w:eastAsia="en-US"/>
+        </w:rPr>
         <mc:AlternateContent>
           <mc:Choice Requires="wpg">
             <w:drawing>
-              <wp:anchor distT="0" distB="0" distL="114300" distR="114300" simplePos="0" relativeHeight="251680256" behindDoc="0" locked="0" layoutInCell="1" allowOverlap="1" wp14:anchorId="63E8DB79" wp14:editId="02CB1DC6">
+              <wp:anchor distT="0" distB="0" distL="114300" distR="114300" simplePos="0" relativeHeight="251680256" behindDoc="0" locked="0" layoutInCell="1" allowOverlap="1" wp14:anchorId="63E8DB79" wp14:editId="6FACD2BF">
                 <wp:simplePos x="0" y="0"/>
-                <wp:positionH relativeFrom="margin">
+                <wp:positionH relativeFrom="column">
                   <wp:align>left</wp:align>
                 </wp:positionH>
                 <wp:positionV relativeFrom="paragraph">
-                  <wp:posOffset>5344</wp:posOffset>
+                  <wp:posOffset>9056</wp:posOffset>
                 </wp:positionV>
                 <wp:extent cx="2941607" cy="5309235"/>
                 <wp:effectExtent l="0" t="0" r="0" b="24765"/>
@@ -19237,25 +19138,25 @@
           </mc:Choice>
           <mc:Fallback>
             <w:pict>
-              <v:group w14:anchorId="63E8DB79" id="Group 141" o:spid="_x0000_s1128" style="position:absolute;left:0;text-align:left;margin-left:0;margin-top:.4pt;width:231.6pt;height:418.05pt;z-index:251680256;mso-position-horizontal:left;mso-position-horizontal-relative:margin;mso-width-relative:margin" coordsize="26190,53097" o:gfxdata="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">
-                <v:group id="Group 2" o:spid="_x0000_s1129" style="position:absolute;width:25381;height:53097" coordsize="25381,53097" o:gfxdata="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">
-                  <v:shape id="Curved Connector 117" o:spid="_x0000_s1130" type="#_x0000_t38" style="position:absolute;left:15906;top:19335;width:2943;height:6484;visibility:visible;mso-wrap-style:square" o:connectortype="curved" o:gfxdata="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" adj="21007" strokecolor="black [3200]" strokeweight="1pt">
+              <v:group w14:anchorId="63E8DB79" id="Group 141" o:spid="_x0000_s1128" style="position:absolute;left:0;text-align:left;margin-left:0;margin-top:.7pt;width:231.6pt;height:418.05pt;z-index:251680256;mso-position-horizontal:left;mso-width-relative:margin" coordsize="26190,53097" o:gfxdata="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">
+                <v:group id="Group 2" o:spid="_x0000_s1129" style="position:absolute;width:25381;height:53097" coordsize="25381,53097" o:gfxdata="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">
+                  <v:shape id="Curved Connector 117" o:spid="_x0000_s1130" type="#_x0000_t38" style="position:absolute;left:15906;top:19335;width:2943;height:6484;visibility:visible;mso-wrap-style:square" o:connectortype="curved" o:gfxdata="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" adj="21007" strokecolor="black [3200]" strokeweight="1pt">
                     <v:stroke endarrow="block" joinstyle="miter"/>
                   </v:shape>
-                  <v:rect id="Rectangle 5" o:spid="_x0000_s1131" style="position:absolute;left:12858;top:30406;width:12055;height:15183;visibility:visible;mso-wrap-style:square;v-text-anchor:middle" o:gfxdata="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" fillcolor="#fff2cc [663]" strokecolor="#1f3763 [1604]" strokeweight="1pt"/>
-                  <v:rect id="Rectangle 45" o:spid="_x0000_s1132" style="position:absolute;top:24547;width:12054;height:21002;visibility:visible;mso-wrap-style:square;v-text-anchor:middle" o:gfxdata="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" fillcolor="#fff2cc [663]" strokecolor="#1f3763 [1604]" strokeweight="1pt"/>
+                  <v:rect id="Rectangle 5" o:spid="_x0000_s1131" style="position:absolute;left:12858;top:30406;width:12055;height:15183;visibility:visible;mso-wrap-style:square;v-text-anchor:middle" o:gfxdata="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" fillcolor="#fff2cc [663]" strokecolor="#1f3763 [1604]" strokeweight="1pt"/>
+                  <v:rect id="Rectangle 45" o:spid="_x0000_s1132" style="position:absolute;top:24547;width:12054;height:21002;visibility:visible;mso-wrap-style:square;v-text-anchor:middle" o:gfxdata="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" fillcolor="#fff2cc [663]" strokecolor="#1f3763 [1604]" strokeweight="1pt"/>
                   <v:shapetype id="_x0000_t33" coordsize="21600,21600" o:spt="33" o:oned="t" path="m,l21600,r,21600e" filled="f">
                     <v:stroke joinstyle="miter"/>
                     <v:path arrowok="t" fillok="f" o:connecttype="none"/>
                     <o:lock v:ext="edit" shapetype="t"/>
                   </v:shapetype>
-                  <v:shape id="Elbow Connector 48" o:spid="_x0000_s1133" type="#_x0000_t33" style="position:absolute;left:10488;top:9263;width:1095;height:8068;rotation:180;flip:y;visibility:visible;mso-wrap-style:square" o:connectortype="elbow" o:gfxdata="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" strokecolor="black [3200]" strokeweight="1pt">
+                  <v:shape id="Elbow Connector 48" o:spid="_x0000_s1133" type="#_x0000_t33" style="position:absolute;left:10488;top:9263;width:1095;height:8068;rotation:180;flip:y;visibility:visible;mso-wrap-style:square" o:connectortype="elbow" o:gfxdata="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" strokecolor="black [3200]" strokeweight="1pt">
                     <v:stroke endarrow="block"/>
                   </v:shape>
-                  <v:shape id="Elbow Connector 64" o:spid="_x0000_s1134" type="#_x0000_t33" style="position:absolute;left:22837;top:9263;width:785;height:8138;visibility:visible;mso-wrap-style:square" o:connectortype="elbow" o:gfxdata="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" strokecolor="black [3200]" strokeweight="1pt">
+                  <v:shape id="Elbow Connector 64" o:spid="_x0000_s1134" type="#_x0000_t33" style="position:absolute;left:22837;top:9263;width:785;height:8138;visibility:visible;mso-wrap-style:square" o:connectortype="elbow" o:gfxdata="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" strokecolor="black [3200]" strokeweight="1pt">
                     <v:stroke endarrow="block"/>
                   </v:shape>
-                  <v:rect id="Rectangle 100" o:spid="_x0000_s1135" style="position:absolute;left:15192;width:3603;height:1801;visibility:visible;mso-wrap-style:square;v-text-anchor:middle" o:gfxdata="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" fillcolor="#a8d08d [1945]" strokecolor="#1f3763 [1604]" strokeweight="1pt">
+                  <v:rect id="Rectangle 100" o:spid="_x0000_s1135" style="position:absolute;left:15192;width:3603;height:1801;visibility:visible;mso-wrap-style:square;v-text-anchor:middle" o:gfxdata="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" fillcolor="#a8d08d [1945]" strokecolor="#1f3763 [1604]" strokeweight="1pt">
                     <v:textbox>
                       <w:txbxContent>
                         <w:p>
@@ -19276,7 +19177,7 @@
                       </w:txbxContent>
                     </v:textbox>
                   </v:rect>
-                  <v:shape id="Diamond 101" o:spid="_x0000_s1136" type="#_x0000_t4" style="position:absolute;left:11191;top:3857;width:11649;height:10814;visibility:visible;mso-wrap-style:square;v-text-anchor:middle" o:gfxdata="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" fillcolor="#ffd966 [1943]" strokecolor="#1f3763 [1604]" strokeweight="1pt">
+                  <v:shape id="Diamond 101" o:spid="_x0000_s1136" type="#_x0000_t4" style="position:absolute;left:11191;top:3857;width:11649;height:10814;visibility:visible;mso-wrap-style:square;v-text-anchor:middle" o:gfxdata="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" fillcolor="#ffd966 [1943]" strokecolor="#1f3763 [1604]" strokeweight="1pt">
                     <v:textbox>
                       <w:txbxContent>
                         <w:p>
@@ -19290,7 +19191,7 @@
                       </w:txbxContent>
                     </v:textbox>
                   </v:shape>
-                  <v:rect id="Rectangle 102" o:spid="_x0000_s1137" style="position:absolute;left:8715;top:17430;width:7474;height:2068;visibility:visible;mso-wrap-style:square;v-text-anchor:middle" o:gfxdata="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" fillcolor="#bdd6ee [1304]" strokecolor="#1f3763 [1604]" strokeweight="1pt">
+                  <v:rect id="Rectangle 102" o:spid="_x0000_s1137" style="position:absolute;left:8715;top:17430;width:7474;height:2068;visibility:visible;mso-wrap-style:square;v-text-anchor:middle" o:gfxdata="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" fillcolor="#bdd6ee [1304]" strokecolor="#1f3763 [1604]" strokeweight="1pt">
                     <v:textbox>
                       <w:txbxContent>
                         <w:p>
@@ -19311,7 +19212,7 @@
                       </w:txbxContent>
                     </v:textbox>
                   </v:rect>
-                  <v:rect id="Rectangle 103" o:spid="_x0000_s1138" style="position:absolute;left:17907;top:17430;width:7474;height:2068;visibility:visible;mso-wrap-style:square;v-text-anchor:middle" o:gfxdata="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" fillcolor="red" strokecolor="#1f3763 [1604]" strokeweight="1pt">
+                  <v:rect id="Rectangle 103" o:spid="_x0000_s1138" style="position:absolute;left:17907;top:17430;width:7474;height:2068;visibility:visible;mso-wrap-style:square;v-text-anchor:middle" o:gfxdata="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" fillcolor="red" strokecolor="#1f3763 [1604]" strokeweight="1pt">
                     <v:textbox>
                       <w:txbxContent>
                         <w:p>
@@ -19332,7 +19233,7 @@
                       </w:txbxContent>
                     </v:textbox>
                   </v:rect>
-                  <v:rect id="Rectangle 104" o:spid="_x0000_s1139" style="position:absolute;left:1476;top:21336;width:9200;height:2067;visibility:visible;mso-wrap-style:square;v-text-anchor:middle" o:gfxdata="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" fillcolor="#bdd6ee [1304]" strokecolor="#1f3763 [1604]" strokeweight="1pt">
+                  <v:rect id="Rectangle 104" o:spid="_x0000_s1139" style="position:absolute;left:1476;top:21336;width:9200;height:2067;visibility:visible;mso-wrap-style:square;v-text-anchor:middle" o:gfxdata="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" fillcolor="#bdd6ee [1304]" strokecolor="#1f3763 [1604]" strokeweight="1pt">
                     <v:textbox>
                       <w:txbxContent>
                         <w:p>
@@ -19353,7 +19254,7 @@
                       </w:txbxContent>
                     </v:textbox>
                   </v:rect>
-                  <v:rect id="Rectangle 105" o:spid="_x0000_s1140" style="position:absolute;left:2238;top:26527;width:7838;height:2063;visibility:visible;mso-wrap-style:square;v-text-anchor:middle" o:gfxdata="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" fillcolor="#bdd6ee [1304]" strokecolor="#1f3763 [1604]" strokeweight="1pt">
+                  <v:rect id="Rectangle 105" o:spid="_x0000_s1140" style="position:absolute;left:2238;top:26527;width:7838;height:2063;visibility:visible;mso-wrap-style:square;v-text-anchor:middle" o:gfxdata="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" fillcolor="#bdd6ee [1304]" strokecolor="#1f3763 [1604]" strokeweight="1pt">
                     <v:textbox>
                       <w:txbxContent>
                         <w:p>
@@ -19374,10 +19275,10 @@
                       </w:txbxContent>
                     </v:textbox>
                   </v:rect>
-                  <v:shape id="Straight Arrow Connector 113" o:spid="_x0000_s1141" type="#_x0000_t32" style="position:absolute;left:16954;top:1809;width:0;height:1966;visibility:visible;mso-wrap-style:square" o:connectortype="straight" o:gfxdata="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" strokecolor="black [3200]" strokeweight="1pt">
+                  <v:shape id="Straight Arrow Connector 113" o:spid="_x0000_s1141" type="#_x0000_t32" style="position:absolute;left:16954;top:1809;width:0;height:1966;visibility:visible;mso-wrap-style:square" o:connectortype="straight" o:gfxdata="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" strokecolor="black [3200]" strokeweight="1pt">
                     <v:stroke endarrow="block" joinstyle="miter"/>
                   </v:shape>
-                  <v:rect id="Rectangle 115" o:spid="_x0000_s1142" style="position:absolute;left:10763;top:51387;width:3519;height:1710;visibility:visible;mso-wrap-style:square;v-text-anchor:middle" o:gfxdata="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" fillcolor="#70ad47 [3209]" strokecolor="#1f3763 [1604]" strokeweight="1pt">
+                  <v:rect id="Rectangle 115" o:spid="_x0000_s1142" style="position:absolute;left:10763;top:51387;width:3519;height:1710;visibility:visible;mso-wrap-style:square;v-text-anchor:middle" o:gfxdata="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" fillcolor="#70ad47 [3209]" strokecolor="#1f3763 [1604]" strokeweight="1pt">
                     <v:textbox>
                       <w:txbxContent>
                         <w:p>
@@ -19398,40 +19299,40 @@
                       </w:txbxContent>
                     </v:textbox>
                   </v:rect>
-                  <v:shape id="Curved Connector 116" o:spid="_x0000_s1143" type="#_x0000_t38" style="position:absolute;left:6048;top:18430;width:2664;height:2863;flip:x;visibility:visible;mso-wrap-style:square" o:connectortype="curved" o:gfxdata="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" adj="21749" strokecolor="black [3200]" strokeweight="1pt">
+                  <v:shape id="Curved Connector 116" o:spid="_x0000_s1143" type="#_x0000_t38" style="position:absolute;left:6048;top:18430;width:2664;height:2863;flip:x;visibility:visible;mso-wrap-style:square" o:connectortype="curved" o:gfxdata="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" adj="21749" strokecolor="black [3200]" strokeweight="1pt">
                     <v:stroke endarrow="block" joinstyle="miter"/>
                   </v:shape>
-                  <v:shape id="Straight Arrow Connector 118" o:spid="_x0000_s1144" type="#_x0000_t32" style="position:absolute;left:6048;top:23431;width:0;height:3144;visibility:visible;mso-wrap-style:square" o:connectortype="straight" o:gfxdata="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" strokecolor="black [3200]" strokeweight="1pt">
+                  <v:shape id="Straight Arrow Connector 118" o:spid="_x0000_s1144" type="#_x0000_t32" style="position:absolute;left:6048;top:23431;width:0;height:3144;visibility:visible;mso-wrap-style:square" o:connectortype="straight" o:gfxdata="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" strokecolor="black [3200]" strokeweight="1pt">
                     <v:stroke endarrow="block" joinstyle="miter"/>
                   </v:shape>
-                  <v:shape id="Straight Arrow Connector 119" o:spid="_x0000_s1145" type="#_x0000_t32" style="position:absolute;left:6096;top:28575;width:0;height:3025;visibility:visible;mso-wrap-style:square" o:connectortype="straight" o:gfxdata="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" strokecolor="black [3200]" strokeweight="1pt">
+                  <v:shape id="Straight Arrow Connector 119" o:spid="_x0000_s1145" type="#_x0000_t32" style="position:absolute;left:6096;top:28575;width:0;height:3025;visibility:visible;mso-wrap-style:square" o:connectortype="straight" o:gfxdata="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" strokecolor="black [3200]" strokeweight="1pt">
                     <v:stroke endarrow="block" joinstyle="miter"/>
                   </v:shape>
-                  <v:shape id="Straight Arrow Connector 120" o:spid="_x0000_s1146" type="#_x0000_t32" style="position:absolute;left:6096;top:33718;width:0;height:3025;visibility:visible;mso-wrap-style:square" o:connectortype="straight" o:gfxdata="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" strokecolor="black [3200]" strokeweight="1pt">
+                  <v:shape id="Straight Arrow Connector 120" o:spid="_x0000_s1146" type="#_x0000_t32" style="position:absolute;left:6096;top:33718;width:0;height:3025;visibility:visible;mso-wrap-style:square" o:connectortype="straight" o:gfxdata="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" strokecolor="black [3200]" strokeweight="1pt">
                     <v:stroke endarrow="block" joinstyle="miter"/>
                   </v:shape>
-                  <v:shape id="Straight Arrow Connector 121" o:spid="_x0000_s1147" type="#_x0000_t32" style="position:absolute;left:6096;top:38814;width:0;height:3025;visibility:visible;mso-wrap-style:square" o:connectortype="straight" o:gfxdata="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" strokecolor="black [3200]" strokeweight="1pt">
+                  <v:shape id="Straight Arrow Connector 121" o:spid="_x0000_s1147" type="#_x0000_t32" style="position:absolute;left:6096;top:38814;width:0;height:3025;visibility:visible;mso-wrap-style:square" o:connectortype="straight" o:gfxdata="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" strokecolor="black [3200]" strokeweight="1pt">
                     <v:stroke endarrow="block" joinstyle="miter"/>
                   </v:shape>
-                  <v:shape id="Straight Arrow Connector 122" o:spid="_x0000_s1148" type="#_x0000_t32" style="position:absolute;left:18907;top:28575;width:0;height:3637;visibility:visible;mso-wrap-style:square" o:connectortype="straight" o:gfxdata="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" strokecolor="black [3200]" strokeweight="1pt">
+                  <v:shape id="Straight Arrow Connector 122" o:spid="_x0000_s1148" type="#_x0000_t32" style="position:absolute;left:18907;top:28575;width:0;height:3637;visibility:visible;mso-wrap-style:square" o:connectortype="straight" o:gfxdata="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" strokecolor="black [3200]" strokeweight="1pt">
                     <v:stroke endarrow="block" joinstyle="miter"/>
                   </v:shape>
-                  <v:shape id="Straight Arrow Connector 123" o:spid="_x0000_s1149" type="#_x0000_t32" style="position:absolute;left:18954;top:34051;width:0;height:2346;visibility:visible;mso-wrap-style:square" o:connectortype="straight" o:gfxdata="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" strokecolor="black [3200]" strokeweight="1pt">
+                  <v:shape id="Straight Arrow Connector 123" o:spid="_x0000_s1149" type="#_x0000_t32" style="position:absolute;left:18954;top:34051;width:0;height:2346;visibility:visible;mso-wrap-style:square" o:connectortype="straight" o:gfxdata="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" strokecolor="black [3200]" strokeweight="1pt">
                     <v:stroke endarrow="block" joinstyle="miter"/>
                   </v:shape>
-                  <v:shape id="Straight Arrow Connector 124" o:spid="_x0000_s1150" type="#_x0000_t32" style="position:absolute;left:18954;top:39909;width:0;height:2346;visibility:visible;mso-wrap-style:square" o:connectortype="straight" o:gfxdata="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" strokecolor="black [3200]" strokeweight="1pt">
+                  <v:shape id="Straight Arrow Connector 124" o:spid="_x0000_s1150" type="#_x0000_t32" style="position:absolute;left:18954;top:39909;width:0;height:2346;visibility:visible;mso-wrap-style:square" o:connectortype="straight" o:gfxdata="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" strokecolor="black [3200]" strokeweight="1pt">
                     <v:stroke endarrow="block" joinstyle="miter"/>
                   </v:shape>
-                  <v:shape id="Elbow Connector 125" o:spid="_x0000_s1151" type="#_x0000_t34" style="position:absolute;left:6048;top:44243;width:3636;height:4277;visibility:visible;mso-wrap-style:square" o:connectortype="elbow" o:gfxdata="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" adj="-3" strokecolor="black [3200]" strokeweight="1pt">
+                  <v:shape id="Elbow Connector 125" o:spid="_x0000_s1151" type="#_x0000_t34" style="position:absolute;left:6048;top:44243;width:3636;height:4277;visibility:visible;mso-wrap-style:square" o:connectortype="elbow" o:gfxdata="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" adj="-3" strokecolor="black [3200]" strokeweight="1pt">
                     <v:stroke endarrow="block"/>
                   </v:shape>
-                  <v:shape id="Elbow Connector 126" o:spid="_x0000_s1152" type="#_x0000_t34" style="position:absolute;left:15192;top:44053;width:3807;height:4477;flip:x;visibility:visible;mso-wrap-style:square" o:connectortype="elbow" o:gfxdata="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" adj="-3" strokecolor="black [3200]" strokeweight="1pt">
+                  <v:shape id="Elbow Connector 126" o:spid="_x0000_s1152" type="#_x0000_t34" style="position:absolute;left:15192;top:44053;width:3807;height:4477;flip:x;visibility:visible;mso-wrap-style:square" o:connectortype="elbow" o:gfxdata="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" adj="-3" strokecolor="black [3200]" strokeweight="1pt">
                     <v:stroke endarrow="block"/>
                   </v:shape>
-                  <v:shape id="Straight Arrow Connector 127" o:spid="_x0000_s1153" type="#_x0000_t32" style="position:absolute;left:12525;top:49101;width:0;height:2345;visibility:visible;mso-wrap-style:square" o:connectortype="straight" o:gfxdata="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" strokecolor="black [3200]" strokeweight="1pt">
+                  <v:shape id="Straight Arrow Connector 127" o:spid="_x0000_s1153" type="#_x0000_t32" style="position:absolute;left:12525;top:49101;width:0;height:2345;visibility:visible;mso-wrap-style:square" o:connectortype="straight" o:gfxdata="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" strokecolor="black [3200]" strokeweight="1pt">
                     <v:stroke endarrow="block" joinstyle="miter"/>
                   </v:shape>
-                  <v:rect id="Rectangle 106" o:spid="_x0000_s1154" style="position:absolute;left:1381;top:31623;width:9500;height:2909;visibility:visible;mso-wrap-style:square;v-text-anchor:middle" o:gfxdata="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" fillcolor="#bdd6ee [1304]" strokecolor="#1f3763 [1604]" strokeweight="1pt">
+                  <v:rect id="Rectangle 106" o:spid="_x0000_s1154" style="position:absolute;left:1381;top:31623;width:9500;height:2909;visibility:visible;mso-wrap-style:square;v-text-anchor:middle" o:gfxdata="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" fillcolor="#bdd6ee [1304]" strokecolor="#1f3763 [1604]" strokeweight="1pt">
                     <v:textbox>
                       <w:txbxContent>
                         <w:p>
@@ -19452,7 +19353,7 @@
                       </w:txbxContent>
                     </v:textbox>
                   </v:rect>
-                  <v:rect id="Rectangle 107" o:spid="_x0000_s1155" style="position:absolute;left:1381;top:36671;width:9500;height:2909;visibility:visible;mso-wrap-style:square;v-text-anchor:middle" o:gfxdata="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" fillcolor="#bdd6ee [1304]" strokecolor="#1f3763 [1604]" strokeweight="1pt">
+                  <v:rect id="Rectangle 107" o:spid="_x0000_s1155" style="position:absolute;left:1381;top:36671;width:9500;height:2909;visibility:visible;mso-wrap-style:square;v-text-anchor:middle" o:gfxdata="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" fillcolor="#bdd6ee [1304]" strokecolor="#1f3763 [1604]" strokeweight="1pt">
                     <v:textbox>
                       <w:txbxContent>
                         <w:p>
@@ -19473,7 +19374,7 @@
                       </w:txbxContent>
                     </v:textbox>
                   </v:rect>
-                  <v:rect id="Rectangle 108" o:spid="_x0000_s1156" style="position:absolute;left:1381;top:41767;width:9500;height:2909;visibility:visible;mso-wrap-style:square;v-text-anchor:middle" o:gfxdata="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" fillcolor="#bdd6ee [1304]" strokecolor="#1f3763 [1604]" strokeweight="1pt">
+                  <v:rect id="Rectangle 108" o:spid="_x0000_s1156" style="position:absolute;left:1381;top:41767;width:9500;height:2909;visibility:visible;mso-wrap-style:square;v-text-anchor:middle" o:gfxdata="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" fillcolor="#bdd6ee [1304]" strokecolor="#1f3763 [1604]" strokeweight="1pt">
                     <v:textbox>
                       <w:txbxContent>
                         <w:p>
@@ -19494,7 +19395,7 @@
                       </w:txbxContent>
                     </v:textbox>
                   </v:rect>
-                  <v:rect id="Rectangle 109" o:spid="_x0000_s1157" style="position:absolute;left:14478;top:32099;width:8965;height:2196;visibility:visible;mso-wrap-style:square;v-text-anchor:middle" o:gfxdata="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" fillcolor="#bdd6ee [1304]" strokecolor="#1f3763 [1604]" strokeweight="1pt">
+                  <v:rect id="Rectangle 109" o:spid="_x0000_s1157" style="position:absolute;left:14478;top:32099;width:8965;height:2196;visibility:visible;mso-wrap-style:square;v-text-anchor:middle" o:gfxdata="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" fillcolor="#bdd6ee [1304]" strokecolor="#1f3763 [1604]" strokeweight="1pt">
                     <v:textbox>
                       <w:txbxContent>
                         <w:p>
@@ -19515,7 +19416,7 @@
                       </w:txbxContent>
                     </v:textbox>
                   </v:rect>
-                  <v:rect id="Rectangle 110" o:spid="_x0000_s1158" style="position:absolute;left:14239;top:36290;width:9427;height:3562;visibility:visible;mso-wrap-style:square;v-text-anchor:middle" o:gfxdata="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" fillcolor="#bdd6ee [1304]" strokecolor="#1f3763 [1604]" strokeweight="1pt">
+                  <v:rect id="Rectangle 110" o:spid="_x0000_s1158" style="position:absolute;left:14239;top:36290;width:9427;height:3562;visibility:visible;mso-wrap-style:square;v-text-anchor:middle" o:gfxdata="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" fillcolor="#bdd6ee [1304]" strokecolor="#1f3763 [1604]" strokeweight="1pt">
                     <v:textbox>
                       <w:txbxContent>
                         <w:p>
@@ -19574,7 +19475,7 @@
                       </w:txbxContent>
                     </v:textbox>
                   </v:rect>
-                  <v:rect id="Rectangle 111" o:spid="_x0000_s1159" style="position:absolute;left:14478;top:42243;width:8965;height:2196;visibility:visible;mso-wrap-style:square;v-text-anchor:middle" o:gfxdata="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" fillcolor="#bdd6ee [1304]" strokecolor="#1f3763 [1604]" strokeweight="1pt">
+                  <v:rect id="Rectangle 111" o:spid="_x0000_s1159" style="position:absolute;left:14478;top:42243;width:8965;height:2196;visibility:visible;mso-wrap-style:square;v-text-anchor:middle" o:gfxdata="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" fillcolor="#bdd6ee [1304]" strokecolor="#1f3763 [1604]" strokeweight="1pt">
                     <v:textbox>
                       <w:txbxContent>
                         <w:p>
@@ -19595,7 +19496,7 @@
                       </w:txbxContent>
                     </v:textbox>
                   </v:rect>
-                  <v:rect id="Rectangle 112" o:spid="_x0000_s1160" style="position:absolute;left:14478;top:25908;width:8965;height:2968;visibility:visible;mso-wrap-style:square;v-text-anchor:middle" o:gfxdata="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" fillcolor="#bdd6ee [1304]" strokecolor="#1f3763 [1604]" strokeweight="1pt">
+                  <v:rect id="Rectangle 112" o:spid="_x0000_s1160" style="position:absolute;left:14478;top:25908;width:8965;height:2968;visibility:visible;mso-wrap-style:square;v-text-anchor:middle" o:gfxdata="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" fillcolor="#bdd6ee [1304]" strokecolor="#1f3763 [1604]" strokeweight="1pt">
                     <v:textbox>
                       <w:txbxContent>
                         <w:p>
@@ -19616,7 +19517,7 @@
                       </w:txbxContent>
                     </v:textbox>
                   </v:rect>
-                  <v:rect id="Rectangle 114" o:spid="_x0000_s1161" style="position:absolute;left:9620;top:47386;width:5720;height:1990;visibility:visible;mso-wrap-style:square;v-text-anchor:middle" o:gfxdata="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" fillcolor="#bdd6ee [1304]" strokecolor="#1f3763 [1604]" strokeweight="1pt">
+                  <v:rect id="Rectangle 114" o:spid="_x0000_s1161" style="position:absolute;left:9620;top:47386;width:5720;height:1990;visibility:visible;mso-wrap-style:square;v-text-anchor:middle" o:gfxdata="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" fillcolor="#bdd6ee [1304]" strokecolor="#1f3763 [1604]" strokeweight="1pt">
                     <v:textbox>
                       <w:txbxContent>
                         <w:p>
@@ -19638,7 +19539,7 @@
                     </v:textbox>
                   </v:rect>
                 </v:group>
-                <v:rect id="Rectangle 140" o:spid="_x0000_s1162" style="position:absolute;left:12040;top:7282;width:9640;height:3558;visibility:visible;mso-wrap-style:square;v-text-anchor:middle" o:gfxdata="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" filled="f" stroked="f" strokeweight="1pt">
+                <v:rect id="Rectangle 140" o:spid="_x0000_s1162" style="position:absolute;left:12040;top:7282;width:9640;height:3558;visibility:visible;mso-wrap-style:square;v-text-anchor:middle" o:gfxdata="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" filled="f" stroked="f" strokeweight="1pt">
                   <v:textbox>
                     <w:txbxContent>
                       <w:p>
@@ -19678,7 +19579,7 @@
                     </w:txbxContent>
                   </v:textbox>
                 </v:rect>
-                <v:rect id="Rectangle 142" o:spid="_x0000_s1163" style="position:absolute;left:7949;top:13304;width:5089;height:1796;visibility:visible;mso-wrap-style:square;v-text-anchor:middle" o:gfxdata="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" filled="f" stroked="f" strokeweight="1pt">
+                <v:rect id="Rectangle 142" o:spid="_x0000_s1163" style="position:absolute;left:7949;top:13304;width:5089;height:1796;visibility:visible;mso-wrap-style:square;v-text-anchor:middle" o:gfxdata="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" filled="f" stroked="f" strokeweight="1pt">
                   <v:textbox>
                     <w:txbxContent>
                       <w:p>
@@ -19702,7 +19603,7 @@
                     </w:txbxContent>
                   </v:textbox>
                 </v:rect>
-                <v:rect id="Rectangle 143" o:spid="_x0000_s1164" style="position:absolute;left:21101;top:13304;width:5089;height:1796;visibility:visible;mso-wrap-style:square;v-text-anchor:middle" o:gfxdata="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" filled="f" stroked="f" strokeweight="1pt">
+                <v:rect id="Rectangle 143" o:spid="_x0000_s1164" style="position:absolute;left:21101;top:13304;width:5089;height:1796;visibility:visible;mso-wrap-style:square;v-text-anchor:middle" o:gfxdata="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" filled="f" stroked="f" strokeweight="1pt">
                   <v:textbox>
                     <w:txbxContent>
                       <w:p>
@@ -19726,7 +19627,6 @@
                     </w:txbxContent>
                   </v:textbox>
                 </v:rect>
-                <w10:wrap anchorx="margin"/>
               </v:group>
             </w:pict>
           </mc:Fallback>
@@ -19908,71 +19808,47 @@
       <w:pPr>
         <w:pStyle w:val="BodyText"/>
         <w:rPr>
+          <w:lang w:val="en-US"/>
+        </w:rPr>
+      </w:pPr>
+    </w:p>
+    <w:p>
+      <w:pPr>
+        <w:pStyle w:val="BodyText"/>
+        <w:rPr>
+          <w:lang w:val="en-US"/>
+        </w:rPr>
+      </w:pPr>
+    </w:p>
+    <w:p>
+      <w:pPr>
+        <w:pStyle w:val="BodyText"/>
+        <w:rPr>
+          <w:lang w:val="en-US"/>
+        </w:rPr>
+      </w:pPr>
+    </w:p>
+    <w:p/>
+    <w:p/>
+    <w:p/>
+    <w:p>
+      <w:r>
+        <w:rPr>
           <w:noProof/>
-          <w:lang w:val="en-US" w:eastAsia="en-US"/>
-        </w:rPr>
-      </w:pPr>
-    </w:p>
-    <w:p>
-      <w:pPr>
-        <w:pStyle w:val="BodyText"/>
-        <w:rPr>
-          <w:noProof/>
-          <w:lang w:val="en-US" w:eastAsia="en-US"/>
-        </w:rPr>
-      </w:pPr>
-    </w:p>
-    <w:p>
-      <w:pPr>
-        <w:pStyle w:val="BodyText"/>
-        <w:rPr>
-          <w:noProof/>
-          <w:lang w:val="en-US" w:eastAsia="en-US"/>
-        </w:rPr>
-      </w:pPr>
-    </w:p>
-    <w:p>
-      <w:pPr>
-        <w:pStyle w:val="BodyText"/>
-        <w:rPr>
-          <w:noProof/>
-          <w:lang w:val="en-US" w:eastAsia="en-US"/>
-        </w:rPr>
-      </w:pPr>
-    </w:p>
-    <w:p>
-      <w:pPr>
-        <w:pStyle w:val="BodyText"/>
-        <w:rPr>
-          <w:lang w:val="en-US"/>
-        </w:rPr>
-      </w:pPr>
-    </w:p>
-    <w:p>
-      <w:pPr>
-        <w:pStyle w:val="BodyText"/>
-        <w:rPr>
-          <w:lang w:val="en-US"/>
-        </w:rPr>
-      </w:pPr>
-      <w:r>
-        <w:rPr>
-          <w:noProof/>
-          <w:lang w:val="en-US" w:eastAsia="en-US"/>
         </w:rPr>
         <mc:AlternateContent>
           <mc:Choice Requires="wps">
             <w:drawing>
-              <wp:anchor distT="0" distB="0" distL="114300" distR="114300" simplePos="0" relativeHeight="251660800" behindDoc="0" locked="0" layoutInCell="1" allowOverlap="1" wp14:anchorId="31504C5B" wp14:editId="72A2A975">
+              <wp:anchor distT="0" distB="0" distL="114300" distR="114300" simplePos="0" relativeHeight="251660800" behindDoc="0" locked="0" layoutInCell="1" allowOverlap="1" wp14:anchorId="31504C5B" wp14:editId="05D0F413">
                 <wp:simplePos x="0" y="0"/>
-                <wp:positionH relativeFrom="column">
-                  <wp:posOffset>176530</wp:posOffset>
+                <wp:positionH relativeFrom="margin">
+                  <wp:align>left</wp:align>
                 </wp:positionH>
                 <wp:positionV relativeFrom="paragraph">
-                  <wp:posOffset>92075</wp:posOffset>
+                  <wp:posOffset>5715</wp:posOffset>
                 </wp:positionV>
                 <wp:extent cx="2905125" cy="419100"/>
-                <wp:effectExtent l="0" t="0" r="0" b="635"/>
+                <wp:effectExtent l="0" t="0" r="9525" b="0"/>
                 <wp:wrapNone/>
                 <wp:docPr id="4" name="Text Box 42"/>
                 <wp:cNvGraphicFramePr>
@@ -20026,6 +19902,20 @@
                               <w:t>Figure 5: Workflow of Calculating Similarity between two subsequence-SDRs</w:t>
                             </w:r>
                           </w:p>
+                          <w:p>
+                            <w:pPr>
+                              <w:rPr>
+                                <w:sz w:val="18"/>
+                              </w:rPr>
+                            </w:pPr>
+                          </w:p>
+                          <w:p>
+                            <w:pPr>
+                              <w:rPr>
+                                <w:sz w:val="18"/>
+                              </w:rPr>
+                            </w:pPr>
+                          </w:p>
                         </w:txbxContent>
                       </wps:txbx>
                       <wps:bodyPr rot="0" vert="horz" wrap="square" lIns="91440" tIns="45720" rIns="91440" bIns="45720" anchor="t" anchorCtr="0" upright="1">
@@ -20045,7 +19935,7 @@
           </mc:Choice>
           <mc:Fallback>
             <w:pict>
-              <v:shape w14:anchorId="31504C5B" id="Text Box 42" o:spid="_x0000_s1165" type="#_x0000_t202" style="position:absolute;left:0;text-align:left;margin-left:13.9pt;margin-top:7.25pt;width:228.75pt;height:33pt;z-index:251660800;visibility:visible;mso-wrap-style:square;mso-width-percent:0;mso-height-percent:0;mso-wrap-distance-left:9pt;mso-wrap-distance-top:0;mso-wrap-distance-right:9pt;mso-wrap-distance-bottom:0;mso-position-horizontal:absolute;mso-position-horizontal-relative:text;mso-position-vertical:absolute;mso-position-vertical-relative:text;mso-width-percent:0;mso-height-percent:0;mso-width-relative:page;mso-height-relative:page;v-text-anchor:top" o:gfxdata="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" stroked="f">
+              <v:shape w14:anchorId="31504C5B" id="Text Box 42" o:spid="_x0000_s1165" type="#_x0000_t202" style="position:absolute;left:0;text-align:left;margin-left:0;margin-top:.45pt;width:228.75pt;height:33pt;z-index:251660800;visibility:visible;mso-wrap-style:square;mso-width-percent:0;mso-height-percent:0;mso-wrap-distance-left:9pt;mso-wrap-distance-top:0;mso-wrap-distance-right:9pt;mso-wrap-distance-bottom:0;mso-position-horizontal:left;mso-position-horizontal-relative:margin;mso-position-vertical:absolute;mso-position-vertical-relative:text;mso-width-percent:0;mso-height-percent:0;mso-width-relative:page;mso-height-relative:page;v-text-anchor:top" o:gfxdata="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" stroked="f">
                 <v:textbox>
                   <w:txbxContent>
                     <w:p>
@@ -20061,22 +19951,30 @@
                         <w:t>Figure 5: Workflow of Calculating Similarity between two subsequence-SDRs</w:t>
                       </w:r>
                     </w:p>
+                    <w:p>
+                      <w:pPr>
+                        <w:rPr>
+                          <w:sz w:val="18"/>
+                        </w:rPr>
+                      </w:pPr>
+                    </w:p>
+                    <w:p>
+                      <w:pPr>
+                        <w:rPr>
+                          <w:sz w:val="18"/>
+                        </w:rPr>
+                      </w:pPr>
+                    </w:p>
                   </w:txbxContent>
                 </v:textbox>
+                <w10:wrap anchorx="margin"/>
               </v:shape>
             </w:pict>
           </mc:Fallback>
         </mc:AlternateContent>
       </w:r>
     </w:p>
-    <w:p>
-      <w:pPr>
-        <w:pStyle w:val="BodyText"/>
-        <w:rPr>
-          <w:lang w:val="en-US"/>
-        </w:rPr>
-      </w:pPr>
-    </w:p>
+    <w:p/>
     <w:p/>
     <w:p>
       <w:pPr>
@@ -20191,6 +20089,7 @@
           <w:noProof/>
           <w:lang w:val="en-US" w:eastAsia="en-US"/>
         </w:rPr>
+        <w:lastRenderedPageBreak/>
         <w:drawing>
           <wp:inline distT="0" distB="0" distL="0" distR="0" wp14:anchorId="79E61637" wp14:editId="739C45F2">
             <wp:extent cx="3086100" cy="2105025"/>
@@ -20566,9 +20465,17 @@
         <w:rPr>
           <w:lang w:val="en-US"/>
         </w:rPr>
-        <w:t>sdr_data.json</w:t>
+        <w:t>sdr_</w:t>
+      </w:r>
+      <w:proofErr w:type="gramStart"/>
+      <w:r>
+        <w:rPr>
+          <w:lang w:val="en-US"/>
+        </w:rPr>
+        <w:t>data.json</w:t>
       </w:r>
       <w:proofErr w:type="spellEnd"/>
+      <w:proofErr w:type="gramEnd"/>
       <w:r>
         <w:rPr>
           <w:lang w:val="en-US"/>
@@ -20950,7 +20857,13 @@
           <w:lang w:val="en-US"/>
         </w:rPr>
         <w:lastRenderedPageBreak/>
-        <w:t>Our code will look for the SDR values of the corresponding Token IDs in the sdr_ouput.txt file</w:t>
+        <w:t>The</w:t>
+      </w:r>
+      <w:r>
+        <w:rPr>
+          <w:lang w:val="en-US"/>
+        </w:rPr>
+        <w:t xml:space="preserve"> code will look for the SDR values of the corresponding Token IDs in the sdr_ouput.txt file</w:t>
       </w:r>
       <w:r>
         <w:rPr>
@@ -20965,6 +20878,7 @@
         </w:rPr>
         <w:t>sdr_</w:t>
       </w:r>
+      <w:proofErr w:type="gramStart"/>
       <w:r>
         <w:rPr>
           <w:lang w:val="en-US"/>
@@ -20978,6 +20892,7 @@
         <w:t>son</w:t>
       </w:r>
       <w:proofErr w:type="spellEnd"/>
+      <w:proofErr w:type="gramEnd"/>
       <w:r>
         <w:rPr>
           <w:lang w:val="en-US"/>
@@ -21182,23 +21097,33 @@
       <w:pPr>
         <w:pStyle w:val="BodyText"/>
         <w:rPr>
-          <w:lang w:val="en-US"/>
-        </w:rPr>
-      </w:pPr>
-      <w:r>
-        <w:rPr>
-          <w:lang w:val="en-US"/>
-        </w:rPr>
-        <w:t xml:space="preserve"> U</w:t>
-      </w:r>
-      <w:r>
-        <w:rPr>
+          <w:b/>
+          <w:lang w:val="en-US"/>
+        </w:rPr>
+      </w:pPr>
+      <w:r>
+        <w:rPr>
+          <w:lang w:val="en-US"/>
+        </w:rPr>
+        <w:t xml:space="preserve"> </w:t>
+      </w:r>
+      <w:r>
+        <w:rPr>
+          <w:b/>
+          <w:lang w:val="en-US"/>
+        </w:rPr>
+        <w:t>U</w:t>
+      </w:r>
+      <w:r>
+        <w:rPr>
+          <w:b/>
           <w:lang w:val="en-US"/>
         </w:rPr>
         <w:t>sing Basic SDRs</w:t>
       </w:r>
       <w:r>
         <w:rPr>
+          <w:b/>
           <w:lang w:val="en-US"/>
         </w:rPr>
         <w:t>:</w:t>
@@ -21247,11 +21172,17 @@
         </w:rPr>
         <w:t xml:space="preserve"> But this values are converted to percentage for a better understanding.</w:t>
       </w:r>
+      <w:r>
+        <w:rPr>
+          <w:lang w:val="en-US"/>
+        </w:rPr>
+        <w:t xml:space="preserve"> Figure. 10. shows some similarity output for given subsequence texts:</w:t>
+      </w:r>
     </w:p>
     <w:p>
       <w:pPr>
         <w:pStyle w:val="BodyText"/>
-        <w:jc w:val="center"/>
+        <w:ind w:firstLine="0"/>
         <w:rPr>
           <w:lang w:val="en-US"/>
         </w:rPr>
@@ -21262,10 +21193,10 @@
           <w:lang w:val="en-US" w:eastAsia="en-US"/>
         </w:rPr>
         <w:drawing>
-          <wp:inline distT="0" distB="0" distL="0" distR="0" wp14:anchorId="5BC2F102" wp14:editId="42B785D8">
-            <wp:extent cx="3028950" cy="381000"/>
+          <wp:inline distT="0" distB="0" distL="0" distR="0" wp14:anchorId="6F07B14C" wp14:editId="38F5F588">
+            <wp:extent cx="3089910" cy="213825"/>
             <wp:effectExtent l="0" t="0" r="0" b="0"/>
-            <wp:docPr id="11" name="Picture 11" descr="4"/>
+            <wp:docPr id="6" name="Picture 6" descr="C:\Users\Best Laptop Gallery\Downloads\basicsdr1.JPG"/>
             <wp:cNvGraphicFramePr>
               <a:graphicFrameLocks xmlns:a="http://schemas.openxmlformats.org/drawingml/2006/main" noChangeAspect="1"/>
             </wp:cNvGraphicFramePr>
@@ -21273,13 +21204,13 @@
               <a:graphicData uri="http://schemas.openxmlformats.org/drawingml/2006/picture">
                 <pic:pic xmlns:pic="http://schemas.openxmlformats.org/drawingml/2006/picture">
                   <pic:nvPicPr>
-                    <pic:cNvPr id="0" name="Picture 11" descr="4"/>
+                    <pic:cNvPr id="0" name="Picture 2" descr="C:\Users\Best Laptop Gallery\Downloads\basicsdr1.JPG"/>
                     <pic:cNvPicPr>
                       <a:picLocks noChangeAspect="1" noChangeArrowheads="1"/>
                     </pic:cNvPicPr>
                   </pic:nvPicPr>
                   <pic:blipFill>
-                    <a:blip r:embed="rId15">
+                    <a:blip r:embed="rId15" cstate="print">
                       <a:extLst>
                         <a:ext uri="{28A0092B-C50C-407E-A947-70E740481C1C}">
                           <a14:useLocalDpi xmlns:a14="http://schemas.microsoft.com/office/drawing/2010/main" val="0"/>
@@ -21294,7 +21225,7 @@
                   <pic:spPr bwMode="auto">
                     <a:xfrm>
                       <a:off x="0" y="0"/>
-                      <a:ext cx="3028950" cy="381000"/>
+                      <a:ext cx="3089910" cy="213825"/>
                     </a:xfrm>
                     <a:prstGeom prst="rect">
                       <a:avLst/>
@@ -21314,6 +21245,262 @@
     <w:p>
       <w:pPr>
         <w:pStyle w:val="BodyText"/>
+        <w:ind w:firstLine="0"/>
+        <w:jc w:val="left"/>
+        <w:rPr>
+          <w:lang w:val="en-US"/>
+        </w:rPr>
+      </w:pPr>
+      <w:r>
+        <w:rPr>
+          <w:noProof/>
+          <w:lang w:val="en-US" w:eastAsia="en-US"/>
+        </w:rPr>
+        <w:drawing>
+          <wp:inline distT="0" distB="0" distL="0" distR="0" wp14:anchorId="6DC619E1" wp14:editId="6A6B4F64">
+            <wp:extent cx="3089910" cy="195764"/>
+            <wp:effectExtent l="0" t="0" r="0" b="0"/>
+            <wp:docPr id="39" name="Picture 39" descr="C:\Users\Best Laptop Gallery\Downloads\basicsdr2.JPG"/>
+            <wp:cNvGraphicFramePr>
+              <a:graphicFrameLocks xmlns:a="http://schemas.openxmlformats.org/drawingml/2006/main" noChangeAspect="1"/>
+            </wp:cNvGraphicFramePr>
+            <a:graphic xmlns:a="http://schemas.openxmlformats.org/drawingml/2006/main">
+              <a:graphicData uri="http://schemas.openxmlformats.org/drawingml/2006/picture">
+                <pic:pic xmlns:pic="http://schemas.openxmlformats.org/drawingml/2006/picture">
+                  <pic:nvPicPr>
+                    <pic:cNvPr id="0" name="Picture 3" descr="C:\Users\Best Laptop Gallery\Downloads\basicsdr2.JPG"/>
+                    <pic:cNvPicPr>
+                      <a:picLocks noChangeAspect="1" noChangeArrowheads="1"/>
+                    </pic:cNvPicPr>
+                  </pic:nvPicPr>
+                  <pic:blipFill>
+                    <a:blip r:embed="rId16" cstate="print">
+                      <a:extLst>
+                        <a:ext uri="{28A0092B-C50C-407E-A947-70E740481C1C}">
+                          <a14:useLocalDpi xmlns:a14="http://schemas.microsoft.com/office/drawing/2010/main" val="0"/>
+                        </a:ext>
+                      </a:extLst>
+                    </a:blip>
+                    <a:srcRect/>
+                    <a:stretch>
+                      <a:fillRect/>
+                    </a:stretch>
+                  </pic:blipFill>
+                  <pic:spPr bwMode="auto">
+                    <a:xfrm>
+                      <a:off x="0" y="0"/>
+                      <a:ext cx="3089910" cy="195764"/>
+                    </a:xfrm>
+                    <a:prstGeom prst="rect">
+                      <a:avLst/>
+                    </a:prstGeom>
+                    <a:noFill/>
+                    <a:ln>
+                      <a:noFill/>
+                    </a:ln>
+                  </pic:spPr>
+                </pic:pic>
+              </a:graphicData>
+            </a:graphic>
+          </wp:inline>
+        </w:drawing>
+      </w:r>
+    </w:p>
+    <w:p>
+      <w:pPr>
+        <w:pStyle w:val="BodyText"/>
+        <w:ind w:firstLine="0"/>
+        <w:jc w:val="left"/>
+        <w:rPr>
+          <w:lang w:val="en-US"/>
+        </w:rPr>
+      </w:pPr>
+      <w:r>
+        <w:rPr>
+          <w:noProof/>
+          <w:lang w:val="en-US" w:eastAsia="en-US"/>
+        </w:rPr>
+        <w:drawing>
+          <wp:inline distT="0" distB="0" distL="0" distR="0" wp14:anchorId="125DA1D4" wp14:editId="472FE645">
+            <wp:extent cx="3089910" cy="205172"/>
+            <wp:effectExtent l="0" t="0" r="0" b="4445"/>
+            <wp:docPr id="147" name="Picture 147" descr="C:\Users\Best Laptop Gallery\Downloads\basicsdr3.JPG"/>
+            <wp:cNvGraphicFramePr>
+              <a:graphicFrameLocks xmlns:a="http://schemas.openxmlformats.org/drawingml/2006/main" noChangeAspect="1"/>
+            </wp:cNvGraphicFramePr>
+            <a:graphic xmlns:a="http://schemas.openxmlformats.org/drawingml/2006/main">
+              <a:graphicData uri="http://schemas.openxmlformats.org/drawingml/2006/picture">
+                <pic:pic xmlns:pic="http://schemas.openxmlformats.org/drawingml/2006/picture">
+                  <pic:nvPicPr>
+                    <pic:cNvPr id="0" name="Picture 7" descr="C:\Users\Best Laptop Gallery\Downloads\basicsdr3.JPG"/>
+                    <pic:cNvPicPr>
+                      <a:picLocks noChangeAspect="1" noChangeArrowheads="1"/>
+                    </pic:cNvPicPr>
+                  </pic:nvPicPr>
+                  <pic:blipFill>
+                    <a:blip r:embed="rId17" cstate="print">
+                      <a:extLst>
+                        <a:ext uri="{28A0092B-C50C-407E-A947-70E740481C1C}">
+                          <a14:useLocalDpi xmlns:a14="http://schemas.microsoft.com/office/drawing/2010/main" val="0"/>
+                        </a:ext>
+                      </a:extLst>
+                    </a:blip>
+                    <a:srcRect/>
+                    <a:stretch>
+                      <a:fillRect/>
+                    </a:stretch>
+                  </pic:blipFill>
+                  <pic:spPr bwMode="auto">
+                    <a:xfrm>
+                      <a:off x="0" y="0"/>
+                      <a:ext cx="3089910" cy="205172"/>
+                    </a:xfrm>
+                    <a:prstGeom prst="rect">
+                      <a:avLst/>
+                    </a:prstGeom>
+                    <a:noFill/>
+                    <a:ln>
+                      <a:noFill/>
+                    </a:ln>
+                  </pic:spPr>
+                </pic:pic>
+              </a:graphicData>
+            </a:graphic>
+          </wp:inline>
+        </w:drawing>
+      </w:r>
+    </w:p>
+    <w:p>
+      <w:pPr>
+        <w:pStyle w:val="BodyText"/>
+        <w:ind w:firstLine="0"/>
+        <w:jc w:val="left"/>
+        <w:rPr>
+          <w:lang w:val="en-US"/>
+        </w:rPr>
+      </w:pPr>
+      <w:r>
+        <w:rPr>
+          <w:noProof/>
+          <w:lang w:val="en-US" w:eastAsia="en-US"/>
+        </w:rPr>
+        <w:drawing>
+          <wp:inline distT="0" distB="0" distL="0" distR="0" wp14:anchorId="2148FFBB" wp14:editId="3B59A378">
+            <wp:extent cx="3089910" cy="297233"/>
+            <wp:effectExtent l="0" t="0" r="0" b="7620"/>
+            <wp:docPr id="149" name="Picture 149" descr="C:\Users\Best Laptop Gallery\Downloads\basicsdr4.JPG"/>
+            <wp:cNvGraphicFramePr>
+              <a:graphicFrameLocks xmlns:a="http://schemas.openxmlformats.org/drawingml/2006/main" noChangeAspect="1"/>
+            </wp:cNvGraphicFramePr>
+            <a:graphic xmlns:a="http://schemas.openxmlformats.org/drawingml/2006/main">
+              <a:graphicData uri="http://schemas.openxmlformats.org/drawingml/2006/picture">
+                <pic:pic xmlns:pic="http://schemas.openxmlformats.org/drawingml/2006/picture">
+                  <pic:nvPicPr>
+                    <pic:cNvPr id="0" name="Picture 8" descr="C:\Users\Best Laptop Gallery\Downloads\basicsdr4.JPG"/>
+                    <pic:cNvPicPr>
+                      <a:picLocks noChangeAspect="1" noChangeArrowheads="1"/>
+                    </pic:cNvPicPr>
+                  </pic:nvPicPr>
+                  <pic:blipFill>
+                    <a:blip r:embed="rId18" cstate="print">
+                      <a:extLst>
+                        <a:ext uri="{28A0092B-C50C-407E-A947-70E740481C1C}">
+                          <a14:useLocalDpi xmlns:a14="http://schemas.microsoft.com/office/drawing/2010/main" val="0"/>
+                        </a:ext>
+                      </a:extLst>
+                    </a:blip>
+                    <a:srcRect/>
+                    <a:stretch>
+                      <a:fillRect/>
+                    </a:stretch>
+                  </pic:blipFill>
+                  <pic:spPr bwMode="auto">
+                    <a:xfrm>
+                      <a:off x="0" y="0"/>
+                      <a:ext cx="3089910" cy="297233"/>
+                    </a:xfrm>
+                    <a:prstGeom prst="rect">
+                      <a:avLst/>
+                    </a:prstGeom>
+                    <a:noFill/>
+                    <a:ln>
+                      <a:noFill/>
+                    </a:ln>
+                  </pic:spPr>
+                </pic:pic>
+              </a:graphicData>
+            </a:graphic>
+          </wp:inline>
+        </w:drawing>
+      </w:r>
+    </w:p>
+    <w:p>
+      <w:pPr>
+        <w:pStyle w:val="BodyText"/>
+        <w:ind w:firstLine="0"/>
+        <w:jc w:val="left"/>
+        <w:rPr>
+          <w:lang w:val="en-US"/>
+        </w:rPr>
+      </w:pPr>
+      <w:r>
+        <w:rPr>
+          <w:noProof/>
+          <w:lang w:val="en-US" w:eastAsia="en-US"/>
+        </w:rPr>
+        <w:drawing>
+          <wp:inline distT="0" distB="0" distL="0" distR="0" wp14:anchorId="3412DD28" wp14:editId="0BE908FB">
+            <wp:extent cx="3089910" cy="281128"/>
+            <wp:effectExtent l="0" t="0" r="0" b="5080"/>
+            <wp:docPr id="151" name="Picture 151" descr="C:\Users\Best Laptop Gallery\Downloads\basicsdr5.JPG"/>
+            <wp:cNvGraphicFramePr>
+              <a:graphicFrameLocks xmlns:a="http://schemas.openxmlformats.org/drawingml/2006/main" noChangeAspect="1"/>
+            </wp:cNvGraphicFramePr>
+            <a:graphic xmlns:a="http://schemas.openxmlformats.org/drawingml/2006/main">
+              <a:graphicData uri="http://schemas.openxmlformats.org/drawingml/2006/picture">
+                <pic:pic xmlns:pic="http://schemas.openxmlformats.org/drawingml/2006/picture">
+                  <pic:nvPicPr>
+                    <pic:cNvPr id="0" name="Picture 9" descr="C:\Users\Best Laptop Gallery\Downloads\basicsdr5.JPG"/>
+                    <pic:cNvPicPr>
+                      <a:picLocks noChangeAspect="1" noChangeArrowheads="1"/>
+                    </pic:cNvPicPr>
+                  </pic:nvPicPr>
+                  <pic:blipFill>
+                    <a:blip r:embed="rId19" cstate="print">
+                      <a:extLst>
+                        <a:ext uri="{28A0092B-C50C-407E-A947-70E740481C1C}">
+                          <a14:useLocalDpi xmlns:a14="http://schemas.microsoft.com/office/drawing/2010/main" val="0"/>
+                        </a:ext>
+                      </a:extLst>
+                    </a:blip>
+                    <a:srcRect/>
+                    <a:stretch>
+                      <a:fillRect/>
+                    </a:stretch>
+                  </pic:blipFill>
+                  <pic:spPr bwMode="auto">
+                    <a:xfrm>
+                      <a:off x="0" y="0"/>
+                      <a:ext cx="3089910" cy="281128"/>
+                    </a:xfrm>
+                    <a:prstGeom prst="rect">
+                      <a:avLst/>
+                    </a:prstGeom>
+                    <a:noFill/>
+                    <a:ln>
+                      <a:noFill/>
+                    </a:ln>
+                  </pic:spPr>
+                </pic:pic>
+              </a:graphicData>
+            </a:graphic>
+          </wp:inline>
+        </w:drawing>
+      </w:r>
+    </w:p>
+    <w:p>
+      <w:pPr>
+        <w:pStyle w:val="BodyText"/>
         <w:jc w:val="center"/>
         <w:rPr>
           <w:sz w:val="18"/>
@@ -21353,34 +21540,316 @@
         </w:rPr>
         <w:t>. Similarity Output</w:t>
       </w:r>
+      <w:r>
+        <w:rPr>
+          <w:sz w:val="18"/>
+          <w:szCs w:val="16"/>
+          <w:lang w:val="en-US"/>
+        </w:rPr>
+        <w:t>s of Subsequences</w:t>
+      </w:r>
     </w:p>
     <w:p>
       <w:pPr>
         <w:pStyle w:val="BodyText"/>
         <w:rPr>
-          <w:lang w:val="en-US"/>
-        </w:rPr>
-      </w:pPr>
-      <w:r>
-        <w:rPr>
-          <w:lang w:val="en-US"/>
-        </w:rPr>
+          <w:szCs w:val="16"/>
+          <w:lang w:val="en-US"/>
+        </w:rPr>
+      </w:pPr>
+    </w:p>
+    <w:p>
+      <w:pPr>
+        <w:pStyle w:val="BodyText"/>
+        <w:rPr>
+          <w:szCs w:val="16"/>
+          <w:lang w:val="en-US"/>
+        </w:rPr>
+      </w:pPr>
+      <w:r>
+        <w:rPr>
+          <w:szCs w:val="16"/>
+          <w:lang w:val="en-US"/>
+        </w:rPr>
+        <w:t xml:space="preserve">The figure given below (figure. 11.) </w:t>
+      </w:r>
+      <w:r>
+        <w:rPr>
+          <w:szCs w:val="16"/>
+          <w:lang w:val="en-US"/>
+        </w:rPr>
+        <w:t>visualizes similarity scores between various pairs of text sequences using Cosine Similarity (blue bars) and E</w:t>
+      </w:r>
+      <w:r>
+        <w:rPr>
+          <w:szCs w:val="16"/>
+          <w:lang w:val="en-US"/>
+        </w:rPr>
+        <w:t>uclidean Similarity (red bars). On x-a</w:t>
+      </w:r>
+      <w:r>
+        <w:rPr>
+          <w:szCs w:val="16"/>
+          <w:lang w:val="en-US"/>
+        </w:rPr>
+        <w:t xml:space="preserve">xis </w:t>
+      </w:r>
+      <w:r>
+        <w:rPr>
+          <w:szCs w:val="16"/>
+          <w:lang w:val="en-US"/>
+        </w:rPr>
+        <w:t>(Text Pairs), e</w:t>
+      </w:r>
+      <w:r>
+        <w:rPr>
+          <w:szCs w:val="16"/>
+          <w:lang w:val="en-US"/>
+        </w:rPr>
+        <w:t>ach label represents a pair of texts being compared. The texts are truncated for display, showing only the first few words followed by ellipses.</w:t>
+      </w:r>
+      <w:r>
+        <w:rPr>
+          <w:szCs w:val="16"/>
+          <w:lang w:val="en-US"/>
+        </w:rPr>
+        <w:t xml:space="preserve"> On y-a</w:t>
+      </w:r>
+      <w:r>
+        <w:rPr>
+          <w:szCs w:val="16"/>
+          <w:lang w:val="en-US"/>
+        </w:rPr>
+        <w:t>xis (Similarity Score %), t</w:t>
+      </w:r>
+      <w:r>
+        <w:rPr>
+          <w:szCs w:val="16"/>
+          <w:lang w:val="en-US"/>
+        </w:rPr>
+        <w:t xml:space="preserve">he scores represent how similar the two texts in each pair are, on a scale from 0% to 100% </w:t>
+      </w:r>
+    </w:p>
+    <w:p>
+      <w:pPr>
+        <w:pStyle w:val="BodyText"/>
+        <w:ind w:firstLine="0"/>
+        <w:rPr>
+          <w:sz w:val="18"/>
+          <w:szCs w:val="16"/>
+          <w:lang w:val="en-US"/>
+        </w:rPr>
+      </w:pPr>
+      <w:r>
+        <w:rPr>
+          <w:noProof/>
+          <w:sz w:val="18"/>
+          <w:szCs w:val="16"/>
+          <w:lang w:val="en-US" w:eastAsia="en-US"/>
+        </w:rPr>
+        <w:drawing>
+          <wp:inline distT="0" distB="0" distL="0" distR="0" wp14:anchorId="2F68DBD4" wp14:editId="18CD3A26">
+            <wp:extent cx="3089910" cy="1717176"/>
+            <wp:effectExtent l="0" t="0" r="0" b="0"/>
+            <wp:docPr id="158" name="Picture 158" descr="C:\Users\Best Laptop Gallery\Downloads\newplot (3).png"/>
+            <wp:cNvGraphicFramePr>
+              <a:graphicFrameLocks xmlns:a="http://schemas.openxmlformats.org/drawingml/2006/main" noChangeAspect="1"/>
+            </wp:cNvGraphicFramePr>
+            <a:graphic xmlns:a="http://schemas.openxmlformats.org/drawingml/2006/main">
+              <a:graphicData uri="http://schemas.openxmlformats.org/drawingml/2006/picture">
+                <pic:pic xmlns:pic="http://schemas.openxmlformats.org/drawingml/2006/picture">
+                  <pic:nvPicPr>
+                    <pic:cNvPr id="0" name="Picture 11" descr="C:\Users\Best Laptop Gallery\Downloads\newplot (3).png"/>
+                    <pic:cNvPicPr>
+                      <a:picLocks noChangeAspect="1" noChangeArrowheads="1"/>
+                    </pic:cNvPicPr>
+                  </pic:nvPicPr>
+                  <pic:blipFill>
+                    <a:blip r:embed="rId20" cstate="print">
+                      <a:extLst>
+                        <a:ext uri="{28A0092B-C50C-407E-A947-70E740481C1C}">
+                          <a14:useLocalDpi xmlns:a14="http://schemas.microsoft.com/office/drawing/2010/main" val="0"/>
+                        </a:ext>
+                      </a:extLst>
+                    </a:blip>
+                    <a:srcRect/>
+                    <a:stretch>
+                      <a:fillRect/>
+                    </a:stretch>
+                  </pic:blipFill>
+                  <pic:spPr bwMode="auto">
+                    <a:xfrm>
+                      <a:off x="0" y="0"/>
+                      <a:ext cx="3089910" cy="1717176"/>
+                    </a:xfrm>
+                    <a:prstGeom prst="rect">
+                      <a:avLst/>
+                    </a:prstGeom>
+                    <a:noFill/>
+                    <a:ln>
+                      <a:noFill/>
+                    </a:ln>
+                  </pic:spPr>
+                </pic:pic>
+              </a:graphicData>
+            </a:graphic>
+          </wp:inline>
+        </w:drawing>
+      </w:r>
+    </w:p>
+    <w:p>
+      <w:pPr>
+        <w:pStyle w:val="BodyText"/>
+        <w:jc w:val="center"/>
+        <w:rPr>
+          <w:sz w:val="18"/>
+          <w:szCs w:val="18"/>
+          <w:lang w:val="en-US"/>
+        </w:rPr>
+      </w:pPr>
+      <w:r>
+        <w:rPr>
+          <w:sz w:val="18"/>
+          <w:szCs w:val="18"/>
+          <w:lang w:val="en-US"/>
+        </w:rPr>
+        <w:t>Figure</w:t>
+      </w:r>
+      <w:r>
+        <w:rPr>
+          <w:sz w:val="18"/>
+          <w:szCs w:val="18"/>
+          <w:lang w:val="en-US"/>
+        </w:rPr>
+        <w:t>. 11</w:t>
+      </w:r>
+      <w:r>
+        <w:rPr>
+          <w:sz w:val="18"/>
+          <w:szCs w:val="18"/>
+          <w:lang w:val="en-US"/>
+        </w:rPr>
+        <w:t xml:space="preserve">. </w:t>
+      </w:r>
+      <w:r>
+        <w:rPr>
+          <w:sz w:val="18"/>
+          <w:szCs w:val="18"/>
+        </w:rPr>
+        <w:t xml:space="preserve">Comparison of Similarity Scores Between </w:t>
+      </w:r>
+      <w:r>
+        <w:rPr>
+          <w:sz w:val="18"/>
+          <w:szCs w:val="18"/>
+          <w:lang w:val="en-US"/>
+        </w:rPr>
+        <w:t>Subsequence</w:t>
+      </w:r>
+      <w:r>
+        <w:rPr>
+          <w:sz w:val="18"/>
+          <w:szCs w:val="18"/>
+        </w:rPr>
+        <w:t xml:space="preserve"> Pairs</w:t>
+      </w:r>
+      <w:r>
+        <w:rPr>
+          <w:sz w:val="18"/>
+          <w:szCs w:val="18"/>
+          <w:lang w:val="en-US"/>
+        </w:rPr>
+        <w:t xml:space="preserve"> using Basic SDRs</w:t>
+      </w:r>
+    </w:p>
+    <w:p>
+      <w:pPr>
+        <w:pStyle w:val="BodyText"/>
+        <w:jc w:val="left"/>
+        <w:rPr>
+          <w:sz w:val="18"/>
+          <w:szCs w:val="16"/>
+          <w:lang w:val="en-US"/>
+        </w:rPr>
+      </w:pPr>
+    </w:p>
+    <w:p>
+      <w:pPr>
+        <w:pStyle w:val="BodyText"/>
+        <w:rPr>
+          <w:b/>
+          <w:lang w:val="en-US"/>
+        </w:rPr>
+      </w:pPr>
+      <w:r>
+        <w:rPr>
+          <w:b/>
+          <w:lang w:val="en-US"/>
+        </w:rPr>
+        <w:lastRenderedPageBreak/>
         <w:t>Using HTM SDRs:</w:t>
       </w:r>
     </w:p>
     <w:p>
       <w:pPr>
-        <w:pStyle w:val="NormalWeb"/>
-        <w:jc w:val="center"/>
+        <w:pStyle w:val="BodyText"/>
+        <w:rPr>
+          <w:lang w:val="en-US"/>
+        </w:rPr>
+      </w:pPr>
+      <w:r>
+        <w:rPr>
+          <w:lang w:val="en-US"/>
+        </w:rPr>
+        <w:t xml:space="preserve">The following figure. 12. </w:t>
+      </w:r>
+      <w:r>
+        <w:rPr>
+          <w:lang w:val="en-US"/>
+        </w:rPr>
+        <w:t>presents a selection of similarity scores generated using Cosine and Euclidean similarity functions. These scores correspond to various pairs of text subsequences,</w:t>
+      </w:r>
+      <w:r>
+        <w:rPr>
+          <w:lang w:val="en-US"/>
+        </w:rPr>
+        <w:t xml:space="preserve"> where each subsequence's token-</w:t>
+      </w:r>
+      <w:r>
+        <w:rPr>
+          <w:lang w:val="en-US"/>
+        </w:rPr>
+        <w:t xml:space="preserve">IDs were first transformed into </w:t>
+      </w:r>
+      <w:r>
+        <w:rPr>
+          <w:lang w:val="en-US"/>
+        </w:rPr>
+        <w:t>SDRs</w:t>
+      </w:r>
+      <w:r>
+        <w:rPr>
+          <w:lang w:val="en-US"/>
+        </w:rPr>
+        <w:t xml:space="preserve"> using an HTM layer.</w:t>
+      </w:r>
+    </w:p>
+    <w:p>
+      <w:pPr>
+        <w:pStyle w:val="BodyText"/>
+        <w:ind w:firstLine="0"/>
+        <w:rPr>
+          <w:lang w:val="en-US"/>
+        </w:rPr>
       </w:pPr>
       <w:r>
         <w:rPr>
           <w:noProof/>
         </w:rPr>
         <w:drawing>
-          <wp:inline distT="0" distB="0" distL="0" distR="0" wp14:anchorId="079EB150" wp14:editId="7E772A4E">
-            <wp:extent cx="3228975" cy="342873"/>
-            <wp:effectExtent l="0" t="0" r="0" b="635"/>
+          <wp:inline distT="0" distB="0" distL="0" distR="0" wp14:anchorId="494873B8" wp14:editId="26CFB4ED">
+            <wp:extent cx="3089910" cy="278853"/>
+            <wp:effectExtent l="0" t="0" r="0" b="6985"/>
             <wp:docPr id="24" name="Picture 24" descr="C:\Users\Best Laptop Gallery\Downloads\comparison output 3.JPG"/>
             <wp:cNvGraphicFramePr>
               <a:graphicFrameLocks xmlns:a="http://schemas.openxmlformats.org/drawingml/2006/main" noChangeAspect="1"/>
@@ -21395,7 +21864,7 @@
                     </pic:cNvPicPr>
                   </pic:nvPicPr>
                   <pic:blipFill>
-                    <a:blip r:embed="rId16">
+                    <a:blip r:embed="rId21" cstate="print">
                       <a:extLst>
                         <a:ext uri="{28A0092B-C50C-407E-A947-70E740481C1C}">
                           <a14:useLocalDpi xmlns:a14="http://schemas.microsoft.com/office/drawing/2010/main" val="0"/>
@@ -21410,7 +21879,7 @@
                   <pic:spPr bwMode="auto">
                     <a:xfrm>
                       <a:off x="0" y="0"/>
-                      <a:ext cx="4266315" cy="453024"/>
+                      <a:ext cx="3089910" cy="278853"/>
                     </a:xfrm>
                     <a:prstGeom prst="rect">
                       <a:avLst/>
@@ -21426,27 +21895,482 @@
           </wp:inline>
         </w:drawing>
       </w:r>
-      <w:r>
+    </w:p>
+    <w:p>
+      <w:pPr>
+        <w:pStyle w:val="BodyText"/>
+        <w:ind w:firstLine="0"/>
+        <w:rPr>
+          <w:lang w:val="en-US"/>
+        </w:rPr>
+      </w:pPr>
+      <w:r>
+        <w:rPr>
+          <w:noProof/>
+          <w:lang w:val="en-US" w:eastAsia="en-US"/>
+        </w:rPr>
+        <w:drawing>
+          <wp:inline distT="0" distB="0" distL="0" distR="0" wp14:anchorId="240CFCF6" wp14:editId="330D3BC9">
+            <wp:extent cx="3089910" cy="287691"/>
+            <wp:effectExtent l="0" t="0" r="0" b="0"/>
+            <wp:docPr id="159" name="Picture 159" descr="C:\Users\Best Laptop Gallery\Downloads\htmsdrresult1.JPG"/>
+            <wp:cNvGraphicFramePr>
+              <a:graphicFrameLocks xmlns:a="http://schemas.openxmlformats.org/drawingml/2006/main" noChangeAspect="1"/>
+            </wp:cNvGraphicFramePr>
+            <a:graphic xmlns:a="http://schemas.openxmlformats.org/drawingml/2006/main">
+              <a:graphicData uri="http://schemas.openxmlformats.org/drawingml/2006/picture">
+                <pic:pic xmlns:pic="http://schemas.openxmlformats.org/drawingml/2006/picture">
+                  <pic:nvPicPr>
+                    <pic:cNvPr id="0" name="Picture 12" descr="C:\Users\Best Laptop Gallery\Downloads\htmsdrresult1.JPG"/>
+                    <pic:cNvPicPr>
+                      <a:picLocks noChangeAspect="1" noChangeArrowheads="1"/>
+                    </pic:cNvPicPr>
+                  </pic:nvPicPr>
+                  <pic:blipFill>
+                    <a:blip r:embed="rId22" cstate="print">
+                      <a:extLst>
+                        <a:ext uri="{28A0092B-C50C-407E-A947-70E740481C1C}">
+                          <a14:useLocalDpi xmlns:a14="http://schemas.microsoft.com/office/drawing/2010/main" val="0"/>
+                        </a:ext>
+                      </a:extLst>
+                    </a:blip>
+                    <a:srcRect/>
+                    <a:stretch>
+                      <a:fillRect/>
+                    </a:stretch>
+                  </pic:blipFill>
+                  <pic:spPr bwMode="auto">
+                    <a:xfrm>
+                      <a:off x="0" y="0"/>
+                      <a:ext cx="3089910" cy="287691"/>
+                    </a:xfrm>
+                    <a:prstGeom prst="rect">
+                      <a:avLst/>
+                    </a:prstGeom>
+                    <a:noFill/>
+                    <a:ln>
+                      <a:noFill/>
+                    </a:ln>
+                  </pic:spPr>
+                </pic:pic>
+              </a:graphicData>
+            </a:graphic>
+          </wp:inline>
+        </w:drawing>
+      </w:r>
+    </w:p>
+    <w:p>
+      <w:pPr>
+        <w:pStyle w:val="BodyText"/>
+        <w:ind w:firstLine="0"/>
+        <w:rPr>
+          <w:lang w:val="en-US"/>
+        </w:rPr>
+      </w:pPr>
+      <w:r>
+        <w:rPr>
+          <w:noProof/>
+          <w:lang w:val="en-US" w:eastAsia="en-US"/>
+        </w:rPr>
+        <w:drawing>
+          <wp:inline distT="0" distB="0" distL="0" distR="0" wp14:anchorId="613D25E2" wp14:editId="44EB6504">
+            <wp:extent cx="3089910" cy="343763"/>
+            <wp:effectExtent l="0" t="0" r="0" b="0"/>
+            <wp:docPr id="160" name="Picture 160" descr="C:\Users\Best Laptop Gallery\Downloads\htmsdrresult2.JPG"/>
+            <wp:cNvGraphicFramePr>
+              <a:graphicFrameLocks xmlns:a="http://schemas.openxmlformats.org/drawingml/2006/main" noChangeAspect="1"/>
+            </wp:cNvGraphicFramePr>
+            <a:graphic xmlns:a="http://schemas.openxmlformats.org/drawingml/2006/main">
+              <a:graphicData uri="http://schemas.openxmlformats.org/drawingml/2006/picture">
+                <pic:pic xmlns:pic="http://schemas.openxmlformats.org/drawingml/2006/picture">
+                  <pic:nvPicPr>
+                    <pic:cNvPr id="0" name="Picture 13" descr="C:\Users\Best Laptop Gallery\Downloads\htmsdrresult2.JPG"/>
+                    <pic:cNvPicPr>
+                      <a:picLocks noChangeAspect="1" noChangeArrowheads="1"/>
+                    </pic:cNvPicPr>
+                  </pic:nvPicPr>
+                  <pic:blipFill>
+                    <a:blip r:embed="rId23" cstate="print">
+                      <a:extLst>
+                        <a:ext uri="{28A0092B-C50C-407E-A947-70E740481C1C}">
+                          <a14:useLocalDpi xmlns:a14="http://schemas.microsoft.com/office/drawing/2010/main" val="0"/>
+                        </a:ext>
+                      </a:extLst>
+                    </a:blip>
+                    <a:srcRect/>
+                    <a:stretch>
+                      <a:fillRect/>
+                    </a:stretch>
+                  </pic:blipFill>
+                  <pic:spPr bwMode="auto">
+                    <a:xfrm>
+                      <a:off x="0" y="0"/>
+                      <a:ext cx="3089910" cy="343763"/>
+                    </a:xfrm>
+                    <a:prstGeom prst="rect">
+                      <a:avLst/>
+                    </a:prstGeom>
+                    <a:noFill/>
+                    <a:ln>
+                      <a:noFill/>
+                    </a:ln>
+                  </pic:spPr>
+                </pic:pic>
+              </a:graphicData>
+            </a:graphic>
+          </wp:inline>
+        </w:drawing>
+      </w:r>
+    </w:p>
+    <w:p>
+      <w:pPr>
+        <w:pStyle w:val="BodyText"/>
+        <w:ind w:firstLine="0"/>
+        <w:rPr>
+          <w:lang w:val="en-US"/>
+        </w:rPr>
+      </w:pPr>
+      <w:r>
+        <w:rPr>
+          <w:noProof/>
+          <w:lang w:val="en-US" w:eastAsia="en-US"/>
+        </w:rPr>
+        <w:drawing>
+          <wp:inline distT="0" distB="0" distL="0" distR="0" wp14:anchorId="382574FE" wp14:editId="575B0493">
+            <wp:extent cx="3089910" cy="367656"/>
+            <wp:effectExtent l="0" t="0" r="0" b="0"/>
+            <wp:docPr id="161" name="Picture 161" descr="C:\Users\Best Laptop Gallery\Downloads\htmsdrresult3.JPG"/>
+            <wp:cNvGraphicFramePr>
+              <a:graphicFrameLocks xmlns:a="http://schemas.openxmlformats.org/drawingml/2006/main" noChangeAspect="1"/>
+            </wp:cNvGraphicFramePr>
+            <a:graphic xmlns:a="http://schemas.openxmlformats.org/drawingml/2006/main">
+              <a:graphicData uri="http://schemas.openxmlformats.org/drawingml/2006/picture">
+                <pic:pic xmlns:pic="http://schemas.openxmlformats.org/drawingml/2006/picture">
+                  <pic:nvPicPr>
+                    <pic:cNvPr id="0" name="Picture 14" descr="C:\Users\Best Laptop Gallery\Downloads\htmsdrresult3.JPG"/>
+                    <pic:cNvPicPr>
+                      <a:picLocks noChangeAspect="1" noChangeArrowheads="1"/>
+                    </pic:cNvPicPr>
+                  </pic:nvPicPr>
+                  <pic:blipFill>
+                    <a:blip r:embed="rId24" cstate="print">
+                      <a:extLst>
+                        <a:ext uri="{28A0092B-C50C-407E-A947-70E740481C1C}">
+                          <a14:useLocalDpi xmlns:a14="http://schemas.microsoft.com/office/drawing/2010/main" val="0"/>
+                        </a:ext>
+                      </a:extLst>
+                    </a:blip>
+                    <a:srcRect/>
+                    <a:stretch>
+                      <a:fillRect/>
+                    </a:stretch>
+                  </pic:blipFill>
+                  <pic:spPr bwMode="auto">
+                    <a:xfrm>
+                      <a:off x="0" y="0"/>
+                      <a:ext cx="3089910" cy="367656"/>
+                    </a:xfrm>
+                    <a:prstGeom prst="rect">
+                      <a:avLst/>
+                    </a:prstGeom>
+                    <a:noFill/>
+                    <a:ln>
+                      <a:noFill/>
+                    </a:ln>
+                  </pic:spPr>
+                </pic:pic>
+              </a:graphicData>
+            </a:graphic>
+          </wp:inline>
+        </w:drawing>
+      </w:r>
+    </w:p>
+    <w:p>
+      <w:pPr>
+        <w:pStyle w:val="BodyText"/>
+        <w:ind w:firstLine="0"/>
+        <w:rPr>
+          <w:lang w:val="en-US"/>
+        </w:rPr>
+      </w:pPr>
+      <w:r>
+        <w:rPr>
+          <w:noProof/>
+          <w:lang w:val="en-US" w:eastAsia="en-US"/>
+        </w:rPr>
+        <w:drawing>
+          <wp:inline distT="0" distB="0" distL="0" distR="0" wp14:anchorId="0AEBE3B3" wp14:editId="43154DF7">
+            <wp:extent cx="3089910" cy="325160"/>
+            <wp:effectExtent l="0" t="0" r="0" b="0"/>
+            <wp:docPr id="162" name="Picture 162" descr="C:\Users\Best Laptop Gallery\Downloads\htmsdrresult4.JPG"/>
+            <wp:cNvGraphicFramePr>
+              <a:graphicFrameLocks xmlns:a="http://schemas.openxmlformats.org/drawingml/2006/main" noChangeAspect="1"/>
+            </wp:cNvGraphicFramePr>
+            <a:graphic xmlns:a="http://schemas.openxmlformats.org/drawingml/2006/main">
+              <a:graphicData uri="http://schemas.openxmlformats.org/drawingml/2006/picture">
+                <pic:pic xmlns:pic="http://schemas.openxmlformats.org/drawingml/2006/picture">
+                  <pic:nvPicPr>
+                    <pic:cNvPr id="0" name="Picture 15" descr="C:\Users\Best Laptop Gallery\Downloads\htmsdrresult4.JPG"/>
+                    <pic:cNvPicPr>
+                      <a:picLocks noChangeAspect="1" noChangeArrowheads="1"/>
+                    </pic:cNvPicPr>
+                  </pic:nvPicPr>
+                  <pic:blipFill>
+                    <a:blip r:embed="rId25" cstate="print">
+                      <a:extLst>
+                        <a:ext uri="{28A0092B-C50C-407E-A947-70E740481C1C}">
+                          <a14:useLocalDpi xmlns:a14="http://schemas.microsoft.com/office/drawing/2010/main" val="0"/>
+                        </a:ext>
+                      </a:extLst>
+                    </a:blip>
+                    <a:srcRect/>
+                    <a:stretch>
+                      <a:fillRect/>
+                    </a:stretch>
+                  </pic:blipFill>
+                  <pic:spPr bwMode="auto">
+                    <a:xfrm>
+                      <a:off x="0" y="0"/>
+                      <a:ext cx="3089910" cy="325160"/>
+                    </a:xfrm>
+                    <a:prstGeom prst="rect">
+                      <a:avLst/>
+                    </a:prstGeom>
+                    <a:noFill/>
+                    <a:ln>
+                      <a:noFill/>
+                    </a:ln>
+                  </pic:spPr>
+                </pic:pic>
+              </a:graphicData>
+            </a:graphic>
+          </wp:inline>
+        </w:drawing>
+      </w:r>
+    </w:p>
+    <w:p>
+      <w:pPr>
+        <w:pStyle w:val="NormalWeb"/>
+        <w:jc w:val="center"/>
         <w:rPr>
           <w:sz w:val="18"/>
           <w:szCs w:val="16"/>
         </w:rPr>
-        <w:t>Fig</w:t>
-      </w:r>
+      </w:pPr>
       <w:r>
         <w:rPr>
           <w:sz w:val="18"/>
           <w:szCs w:val="16"/>
         </w:rPr>
-        <w:t>ure</w:t>
+        <w:t>Fig</w:t>
       </w:r>
       <w:r>
         <w:rPr>
           <w:sz w:val="18"/>
           <w:szCs w:val="16"/>
         </w:rPr>
-        <w:t>. 11. Similarity Output of Subsequences</w:t>
-      </w:r>
+        <w:t>ure</w:t>
+      </w:r>
+      <w:r>
+        <w:rPr>
+          <w:sz w:val="18"/>
+          <w:szCs w:val="16"/>
+        </w:rPr>
+        <w:t>. 12</w:t>
+      </w:r>
+      <w:r>
+        <w:rPr>
+          <w:sz w:val="18"/>
+          <w:szCs w:val="16"/>
+        </w:rPr>
+        <w:t>. Similarity Output of Subsequences</w:t>
+      </w:r>
+    </w:p>
+    <w:p>
+      <w:pPr>
+        <w:pStyle w:val="NormalWeb"/>
+        <w:jc w:val="both"/>
+        <w:rPr>
+          <w:sz w:val="20"/>
+          <w:szCs w:val="16"/>
+        </w:rPr>
+      </w:pPr>
+      <w:r>
+        <w:rPr>
+          <w:sz w:val="20"/>
+          <w:szCs w:val="16"/>
+        </w:rPr>
+        <w:t xml:space="preserve">     The following figure. 13. </w:t>
+      </w:r>
+      <w:r>
+        <w:rPr>
+          <w:sz w:val="20"/>
+          <w:szCs w:val="16"/>
+        </w:rPr>
+        <w:t>bar chart displays the Cosine and Euclidean similarity scores for four different pairs of text subsequences.</w:t>
+      </w:r>
+      <w:r>
+        <w:t xml:space="preserve"> </w:t>
+      </w:r>
+      <w:r>
+        <w:rPr>
+          <w:sz w:val="20"/>
+          <w:szCs w:val="16"/>
+        </w:rPr>
+        <w:t>For all text pairs, Cosine similarity scores are relatively high, ranging between 60% to 95%. This suggests a moderate to strong degree of angular similarity in the SDR representations of the token sequences.</w:t>
+      </w:r>
+    </w:p>
+    <w:p>
+      <w:pPr>
+        <w:pStyle w:val="NormalWeb"/>
+        <w:jc w:val="both"/>
+      </w:pPr>
+      <w:r>
+        <w:rPr>
+          <w:noProof/>
+        </w:rPr>
+        <w:drawing>
+          <wp:inline distT="0" distB="0" distL="0" distR="0" wp14:anchorId="2F086EAC" wp14:editId="1A7B3DA6">
+            <wp:extent cx="3089910" cy="1717176"/>
+            <wp:effectExtent l="0" t="0" r="0" b="0"/>
+            <wp:docPr id="163" name="Picture 163" descr="C:\Users\Best Laptop Gallery\Downloads\newplot (1).png"/>
+            <wp:cNvGraphicFramePr>
+              <a:graphicFrameLocks xmlns:a="http://schemas.openxmlformats.org/drawingml/2006/main" noChangeAspect="1"/>
+            </wp:cNvGraphicFramePr>
+            <a:graphic xmlns:a="http://schemas.openxmlformats.org/drawingml/2006/main">
+              <a:graphicData uri="http://schemas.openxmlformats.org/drawingml/2006/picture">
+                <pic:pic xmlns:pic="http://schemas.openxmlformats.org/drawingml/2006/picture">
+                  <pic:nvPicPr>
+                    <pic:cNvPr id="0" name="Picture 16" descr="C:\Users\Best Laptop Gallery\Downloads\newplot (1).png"/>
+                    <pic:cNvPicPr>
+                      <a:picLocks noChangeAspect="1" noChangeArrowheads="1"/>
+                    </pic:cNvPicPr>
+                  </pic:nvPicPr>
+                  <pic:blipFill>
+                    <a:blip r:embed="rId26" cstate="print">
+                      <a:extLst>
+                        <a:ext uri="{28A0092B-C50C-407E-A947-70E740481C1C}">
+                          <a14:useLocalDpi xmlns:a14="http://schemas.microsoft.com/office/drawing/2010/main" val="0"/>
+                        </a:ext>
+                      </a:extLst>
+                    </a:blip>
+                    <a:srcRect/>
+                    <a:stretch>
+                      <a:fillRect/>
+                    </a:stretch>
+                  </pic:blipFill>
+                  <pic:spPr bwMode="auto">
+                    <a:xfrm>
+                      <a:off x="0" y="0"/>
+                      <a:ext cx="3089910" cy="1717176"/>
+                    </a:xfrm>
+                    <a:prstGeom prst="rect">
+                      <a:avLst/>
+                    </a:prstGeom>
+                    <a:noFill/>
+                    <a:ln>
+                      <a:noFill/>
+                    </a:ln>
+                  </pic:spPr>
+                </pic:pic>
+              </a:graphicData>
+            </a:graphic>
+          </wp:inline>
+        </w:drawing>
+      </w:r>
+    </w:p>
+    <w:p>
+      <w:pPr>
+        <w:pStyle w:val="BodyText"/>
+        <w:jc w:val="center"/>
+        <w:rPr>
+          <w:sz w:val="18"/>
+          <w:lang w:val="en-US"/>
+        </w:rPr>
+      </w:pPr>
+      <w:r>
+        <w:rPr>
+          <w:sz w:val="18"/>
+          <w:szCs w:val="16"/>
+          <w:lang w:val="en-US"/>
+        </w:rPr>
+        <w:t>Fig</w:t>
+      </w:r>
+      <w:r>
+        <w:rPr>
+          <w:sz w:val="18"/>
+          <w:szCs w:val="16"/>
+          <w:lang w:val="en-US"/>
+        </w:rPr>
+        <w:t>ure</w:t>
+      </w:r>
+      <w:r>
+        <w:rPr>
+          <w:sz w:val="18"/>
+          <w:szCs w:val="16"/>
+          <w:lang w:val="en-US"/>
+        </w:rPr>
+        <w:t>. 13</w:t>
+      </w:r>
+      <w:r>
+        <w:rPr>
+          <w:sz w:val="18"/>
+          <w:szCs w:val="16"/>
+          <w:lang w:val="en-US"/>
+        </w:rPr>
+        <w:t xml:space="preserve">. </w:t>
+      </w:r>
+      <w:r>
+        <w:rPr>
+          <w:sz w:val="18"/>
+        </w:rPr>
+        <w:t xml:space="preserve">Comparison of Similarity Scores Between </w:t>
+      </w:r>
+      <w:r>
+        <w:rPr>
+          <w:sz w:val="18"/>
+          <w:lang w:val="en-US"/>
+        </w:rPr>
+        <w:t>Subsequence</w:t>
+      </w:r>
+      <w:r>
+        <w:rPr>
+          <w:sz w:val="18"/>
+        </w:rPr>
+        <w:t xml:space="preserve"> Pairs</w:t>
+      </w:r>
+      <w:r>
+        <w:rPr>
+          <w:sz w:val="18"/>
+          <w:lang w:val="en-US"/>
+        </w:rPr>
+        <w:t xml:space="preserve"> using </w:t>
+      </w:r>
+      <w:r>
+        <w:rPr>
+          <w:sz w:val="18"/>
+          <w:lang w:val="en-US"/>
+        </w:rPr>
+        <w:t>HTM</w:t>
+      </w:r>
+      <w:r>
+        <w:rPr>
+          <w:sz w:val="18"/>
+          <w:lang w:val="en-US"/>
+        </w:rPr>
+        <w:t xml:space="preserve"> SDRs</w:t>
+      </w:r>
+    </w:p>
+    <w:p>
+      <w:pPr>
+        <w:pStyle w:val="BodyText"/>
+        <w:jc w:val="center"/>
+        <w:rPr>
+          <w:sz w:val="18"/>
+          <w:szCs w:val="16"/>
+          <w:lang w:val="en-US"/>
+        </w:rPr>
+      </w:pPr>
     </w:p>
     <w:p>
       <w:pPr>
@@ -21546,6 +22470,22 @@
       <w:pPr>
         <w:pStyle w:val="BodyText"/>
         <w:rPr>
+          <w:lang w:val="en-US"/>
+        </w:rPr>
+      </w:pPr>
+    </w:p>
+    <w:p>
+      <w:pPr>
+        <w:pStyle w:val="BodyText"/>
+        <w:rPr>
+          <w:lang w:val="en-US"/>
+        </w:rPr>
+      </w:pPr>
+    </w:p>
+    <w:p>
+      <w:pPr>
+        <w:pStyle w:val="BodyText"/>
+        <w:rPr>
           <w:b/>
           <w:sz w:val="18"/>
           <w:lang w:val="en-US"/>
@@ -21557,6 +22497,7 @@
           <w:sz w:val="18"/>
           <w:lang w:val="en-US"/>
         </w:rPr>
+        <w:lastRenderedPageBreak/>
         <w:t>Table-1: Similarity Score Comparison for Input Subsequences</w:t>
       </w:r>
     </w:p>
@@ -21727,7 +22668,13 @@
               <w:rPr>
                 <w:lang w:val="en-US"/>
               </w:rPr>
-              <w:t>Cosine Similarity: 98.10%</w:t>
+              <w:t>Cosine Similarity: 91.43</w:t>
+            </w:r>
+            <w:r>
+              <w:rPr>
+                <w:lang w:val="en-US"/>
+              </w:rPr>
+              <w:t>%</w:t>
             </w:r>
           </w:p>
           <w:p>
@@ -21743,7 +22690,13 @@
               <w:rPr>
                 <w:lang w:val="en-US"/>
               </w:rPr>
-              <w:t>Euclidean Similarity : 92.44%</w:t>
+              <w:t>Euclidean Similarity : 83.96</w:t>
+            </w:r>
+            <w:r>
+              <w:rPr>
+                <w:lang w:val="en-US"/>
+              </w:rPr>
+              <w:t>%</w:t>
             </w:r>
           </w:p>
         </w:tc>
@@ -21986,7 +22939,13 @@
               <w:rPr>
                 <w:lang w:val="en-US"/>
               </w:rPr>
-              <w:t>30.06</w:t>
+              <w:t>15</w:t>
+            </w:r>
+            <w:r>
+              <w:rPr>
+                <w:lang w:val="en-US"/>
+              </w:rPr>
+              <w:t>.06</w:t>
             </w:r>
             <w:r>
               <w:rPr>
@@ -22154,7 +23113,13 @@
               <w:rPr>
                 <w:lang w:val="en-US"/>
               </w:rPr>
-              <w:t>33.58</w:t>
+              <w:t>08</w:t>
+            </w:r>
+            <w:r>
+              <w:rPr>
+                <w:lang w:val="en-US"/>
+              </w:rPr>
+              <w:t>.58</w:t>
             </w:r>
             <w:r>
               <w:rPr>
@@ -22239,6 +23204,7 @@
         <w:rPr>
           <w:b/>
         </w:rPr>
+        <w:lastRenderedPageBreak/>
         <w:t>Conclusion</w:t>
       </w:r>
     </w:p>
@@ -22341,7 +23307,6 @@
         <w:rPr>
           <w:lang w:val="en-US"/>
         </w:rPr>
-        <w:lastRenderedPageBreak/>
         <w:t>By integrating these improvements, we can enhance the accuracy and robustness of HTM-based models, leading to deeper insights into sequence relationships and more reliable real-world applications</w:t>
       </w:r>
       <w:r>
@@ -22356,70 +23321,6 @@
         </w:rPr>
         <w:t>This integrated approach could provide deeper insights into sequence relationships and improve the performance of HTM-based models in real-world applications. Future experiments should explore this direction to achieve more accurate and reliable results.</w:t>
       </w:r>
-    </w:p>
-    <w:p>
-      <w:pPr>
-        <w:pStyle w:val="BodyText"/>
-        <w:rPr>
-          <w:lang w:val="en-US"/>
-        </w:rPr>
-      </w:pPr>
-    </w:p>
-    <w:p>
-      <w:pPr>
-        <w:pStyle w:val="BodyText"/>
-        <w:rPr>
-          <w:lang w:val="en-US"/>
-        </w:rPr>
-      </w:pPr>
-    </w:p>
-    <w:p>
-      <w:pPr>
-        <w:pStyle w:val="BodyText"/>
-        <w:rPr>
-          <w:lang w:val="en-US"/>
-        </w:rPr>
-      </w:pPr>
-    </w:p>
-    <w:p>
-      <w:pPr>
-        <w:pStyle w:val="BodyText"/>
-        <w:rPr>
-          <w:lang w:val="en-US"/>
-        </w:rPr>
-      </w:pPr>
-    </w:p>
-    <w:p>
-      <w:pPr>
-        <w:pStyle w:val="BodyText"/>
-        <w:rPr>
-          <w:lang w:val="en-US"/>
-        </w:rPr>
-      </w:pPr>
-    </w:p>
-    <w:p>
-      <w:pPr>
-        <w:pStyle w:val="BodyText"/>
-        <w:rPr>
-          <w:lang w:val="en-US"/>
-        </w:rPr>
-      </w:pPr>
-    </w:p>
-    <w:p>
-      <w:pPr>
-        <w:pStyle w:val="BodyText"/>
-        <w:rPr>
-          <w:lang w:val="en-US"/>
-        </w:rPr>
-      </w:pPr>
-    </w:p>
-    <w:p>
-      <w:pPr>
-        <w:pStyle w:val="BodyText"/>
-        <w:rPr>
-          <w:lang w:val="en-US"/>
-        </w:rPr>
-      </w:pPr>
     </w:p>
     <w:p>
       <w:pPr>
@@ -22429,6 +23330,8 @@
           <w:lang w:val="en-US"/>
         </w:rPr>
       </w:pPr>
+      <w:bookmarkStart w:id="1" w:name="_GoBack"/>
+      <w:bookmarkEnd w:id="1"/>
     </w:p>
     <w:p>
       <w:pPr>
@@ -22451,7 +23354,7 @@
       <w:r>
         <w:t xml:space="preserve"> </w:t>
       </w:r>
-      <w:hyperlink r:id="rId17" w:history="1">
+      <w:hyperlink r:id="rId27" w:history="1">
         <w:r>
           <w:rPr>
             <w:rStyle w:val="Hyperlink"/>
@@ -22518,7 +23421,7 @@
       <w:r>
         <w:t xml:space="preserve"> </w:t>
       </w:r>
-      <w:hyperlink r:id="rId18" w:history="1">
+      <w:hyperlink r:id="rId28" w:history="1">
         <w:r>
           <w:rPr>
             <w:rStyle w:val="Hyperlink"/>
@@ -22561,7 +23464,7 @@
         </w:numPr>
         <w:ind w:left="354"/>
       </w:pPr>
-      <w:hyperlink r:id="rId19" w:history="1">
+      <w:hyperlink r:id="rId29" w:history="1">
         <w:r>
           <w:rPr>
             <w:rStyle w:val="Hyperlink"/>
@@ -22628,7 +23531,7 @@
 </file>
 
 <file path=word/endnotes.xml><?xml version="1.0" encoding="utf-8"?>
-<w:endnotes xmlns:wpc="http://schemas.microsoft.com/office/word/2010/wordprocessingCanvas" xmlns:mc="http://schemas.openxmlformats.org/markup-compatibility/2006" xmlns:o="urn:schemas-microsoft-com:office:office" xmlns:r="http://schemas.openxmlformats.org/officeDocument/2006/relationships" xmlns:m="http://schemas.openxmlformats.org/officeDocument/2006/math" xmlns:v="urn:schemas-microsoft-com:vml" xmlns:wp14="http://schemas.microsoft.com/office/word/2010/wordprocessingDrawing" xmlns:wp="http://schemas.openxmlformats.org/drawingml/2006/wordprocessingDrawing" xmlns:w10="urn:schemas-microsoft-com:office:word" xmlns:w="http://schemas.openxmlformats.org/wordprocessingml/2006/main" xmlns:w14="http://schemas.microsoft.com/office/word/2010/wordml" xmlns:w15="http://schemas.microsoft.com/office/word/2012/wordml" xmlns:wpg="http://schemas.microsoft.com/office/word/2010/wordprocessingGroup" xmlns:wpi="http://schemas.microsoft.com/office/word/2010/wordprocessingInk" xmlns:wne="http://schemas.microsoft.com/office/word/2006/wordml" xmlns:wps="http://schemas.microsoft.com/office/word/2010/wordprocessingShape" mc:Ignorable="w14 w15 wp14">
+<w:endnotes xmlns:wpc="http://schemas.microsoft.com/office/word/2010/wordprocessingCanvas" xmlns:cx="http://schemas.microsoft.com/office/drawing/2014/chartex" xmlns:mc="http://schemas.openxmlformats.org/markup-compatibility/2006" xmlns:o="urn:schemas-microsoft-com:office:office" xmlns:r="http://schemas.openxmlformats.org/officeDocument/2006/relationships" xmlns:m="http://schemas.openxmlformats.org/officeDocument/2006/math" xmlns:v="urn:schemas-microsoft-com:vml" xmlns:wp14="http://schemas.microsoft.com/office/word/2010/wordprocessingDrawing" xmlns:wp="http://schemas.openxmlformats.org/drawingml/2006/wordprocessingDrawing" xmlns:w10="urn:schemas-microsoft-com:office:word" xmlns:w="http://schemas.openxmlformats.org/wordprocessingml/2006/main" xmlns:w14="http://schemas.microsoft.com/office/word/2010/wordml" xmlns:w15="http://schemas.microsoft.com/office/word/2012/wordml" xmlns:w16se="http://schemas.microsoft.com/office/word/2015/wordml/symex" xmlns:wpg="http://schemas.microsoft.com/office/word/2010/wordprocessingGroup" xmlns:wpi="http://schemas.microsoft.com/office/word/2010/wordprocessingInk" xmlns:wne="http://schemas.microsoft.com/office/word/2006/wordml" xmlns:wps="http://schemas.microsoft.com/office/word/2010/wordprocessingShape" mc:Ignorable="w14 w15 w16se wp14">
   <w:endnote w:type="separator" w:id="-1">
     <w:p>
       <w:r>
@@ -22647,7 +23550,7 @@
 </file>
 
 <file path=word/footer1.xml><?xml version="1.0" encoding="utf-8"?>
-<w:ftr xmlns:wpc="http://schemas.microsoft.com/office/word/2010/wordprocessingCanvas" xmlns:mc="http://schemas.openxmlformats.org/markup-compatibility/2006" xmlns:o="urn:schemas-microsoft-com:office:office" xmlns:r="http://schemas.openxmlformats.org/officeDocument/2006/relationships" xmlns:m="http://schemas.openxmlformats.org/officeDocument/2006/math" xmlns:v="urn:schemas-microsoft-com:vml" xmlns:wp14="http://schemas.microsoft.com/office/word/2010/wordprocessingDrawing" xmlns:wp="http://schemas.openxmlformats.org/drawingml/2006/wordprocessingDrawing" xmlns:w10="urn:schemas-microsoft-com:office:word" xmlns:w="http://schemas.openxmlformats.org/wordprocessingml/2006/main" xmlns:w14="http://schemas.microsoft.com/office/word/2010/wordml" xmlns:w15="http://schemas.microsoft.com/office/word/2012/wordml" xmlns:wpg="http://schemas.microsoft.com/office/word/2010/wordprocessingGroup" xmlns:wpi="http://schemas.microsoft.com/office/word/2010/wordprocessingInk" xmlns:wne="http://schemas.microsoft.com/office/word/2006/wordml" xmlns:wps="http://schemas.microsoft.com/office/word/2010/wordprocessingShape" mc:Ignorable="w14 w15 wp14">
+<w:ftr xmlns:wpc="http://schemas.microsoft.com/office/word/2010/wordprocessingCanvas" xmlns:cx="http://schemas.microsoft.com/office/drawing/2014/chartex" xmlns:mc="http://schemas.openxmlformats.org/markup-compatibility/2006" xmlns:o="urn:schemas-microsoft-com:office:office" xmlns:r="http://schemas.openxmlformats.org/officeDocument/2006/relationships" xmlns:m="http://schemas.openxmlformats.org/officeDocument/2006/math" xmlns:v="urn:schemas-microsoft-com:vml" xmlns:wp14="http://schemas.microsoft.com/office/word/2010/wordprocessingDrawing" xmlns:wp="http://schemas.openxmlformats.org/drawingml/2006/wordprocessingDrawing" xmlns:w10="urn:schemas-microsoft-com:office:word" xmlns:w="http://schemas.openxmlformats.org/wordprocessingml/2006/main" xmlns:w14="http://schemas.microsoft.com/office/word/2010/wordml" xmlns:w15="http://schemas.microsoft.com/office/word/2012/wordml" xmlns:w16se="http://schemas.microsoft.com/office/word/2015/wordml/symex" xmlns:wpg="http://schemas.microsoft.com/office/word/2010/wordprocessingGroup" xmlns:wpi="http://schemas.microsoft.com/office/word/2010/wordprocessingInk" xmlns:wne="http://schemas.microsoft.com/office/word/2006/wordml" xmlns:wps="http://schemas.microsoft.com/office/word/2010/wordprocessingShape" mc:Ignorable="w14 w15 w16se wp14">
   <w:p>
     <w:pPr>
       <w:pStyle w:val="Footer"/>
@@ -22674,7 +23577,7 @@
 </file>
 
 <file path=word/footer2.xml><?xml version="1.0" encoding="utf-8"?>
-<w:ftr xmlns:wpc="http://schemas.microsoft.com/office/word/2010/wordprocessingCanvas" xmlns:mc="http://schemas.openxmlformats.org/markup-compatibility/2006" xmlns:o="urn:schemas-microsoft-com:office:office" xmlns:r="http://schemas.openxmlformats.org/officeDocument/2006/relationships" xmlns:m="http://schemas.openxmlformats.org/officeDocument/2006/math" xmlns:v="urn:schemas-microsoft-com:vml" xmlns:wp14="http://schemas.microsoft.com/office/word/2010/wordprocessingDrawing" xmlns:wp="http://schemas.openxmlformats.org/drawingml/2006/wordprocessingDrawing" xmlns:w10="urn:schemas-microsoft-com:office:word" xmlns:w="http://schemas.openxmlformats.org/wordprocessingml/2006/main" xmlns:w14="http://schemas.microsoft.com/office/word/2010/wordml" xmlns:w15="http://schemas.microsoft.com/office/word/2012/wordml" xmlns:wpg="http://schemas.microsoft.com/office/word/2010/wordprocessingGroup" xmlns:wpi="http://schemas.microsoft.com/office/word/2010/wordprocessingInk" xmlns:wne="http://schemas.microsoft.com/office/word/2006/wordml" xmlns:wps="http://schemas.microsoft.com/office/word/2010/wordprocessingShape" mc:Ignorable="w14 w15 wp14">
+<w:ftr xmlns:wpc="http://schemas.microsoft.com/office/word/2010/wordprocessingCanvas" xmlns:cx="http://schemas.microsoft.com/office/drawing/2014/chartex" xmlns:mc="http://schemas.openxmlformats.org/markup-compatibility/2006" xmlns:o="urn:schemas-microsoft-com:office:office" xmlns:r="http://schemas.openxmlformats.org/officeDocument/2006/relationships" xmlns:m="http://schemas.openxmlformats.org/officeDocument/2006/math" xmlns:v="urn:schemas-microsoft-com:vml" xmlns:wp14="http://schemas.microsoft.com/office/word/2010/wordprocessingDrawing" xmlns:wp="http://schemas.openxmlformats.org/drawingml/2006/wordprocessingDrawing" xmlns:w10="urn:schemas-microsoft-com:office:word" xmlns:w="http://schemas.openxmlformats.org/wordprocessingml/2006/main" xmlns:w14="http://schemas.microsoft.com/office/word/2010/wordml" xmlns:w15="http://schemas.microsoft.com/office/word/2012/wordml" xmlns:w16se="http://schemas.microsoft.com/office/word/2015/wordml/symex" xmlns:wpg="http://schemas.microsoft.com/office/word/2010/wordprocessingGroup" xmlns:wpi="http://schemas.microsoft.com/office/word/2010/wordprocessingInk" xmlns:wne="http://schemas.microsoft.com/office/word/2006/wordml" xmlns:wps="http://schemas.microsoft.com/office/word/2010/wordprocessingShape" mc:Ignorable="w14 w15 w16se wp14">
   <w:p>
     <w:pPr>
       <w:pStyle w:val="Footer"/>
@@ -22703,7 +23606,7 @@
 </file>
 
 <file path=word/footnotes.xml><?xml version="1.0" encoding="utf-8"?>
-<w:footnotes xmlns:wpc="http://schemas.microsoft.com/office/word/2010/wordprocessingCanvas" xmlns:mc="http://schemas.openxmlformats.org/markup-compatibility/2006" xmlns:o="urn:schemas-microsoft-com:office:office" xmlns:r="http://schemas.openxmlformats.org/officeDocument/2006/relationships" xmlns:m="http://schemas.openxmlformats.org/officeDocument/2006/math" xmlns:v="urn:schemas-microsoft-com:vml" xmlns:wp14="http://schemas.microsoft.com/office/word/2010/wordprocessingDrawing" xmlns:wp="http://schemas.openxmlformats.org/drawingml/2006/wordprocessingDrawing" xmlns:w10="urn:schemas-microsoft-com:office:word" xmlns:w="http://schemas.openxmlformats.org/wordprocessingml/2006/main" xmlns:w14="http://schemas.microsoft.com/office/word/2010/wordml" xmlns:w15="http://schemas.microsoft.com/office/word/2012/wordml" xmlns:wpg="http://schemas.microsoft.com/office/word/2010/wordprocessingGroup" xmlns:wpi="http://schemas.microsoft.com/office/word/2010/wordprocessingInk" xmlns:wne="http://schemas.microsoft.com/office/word/2006/wordml" xmlns:wps="http://schemas.microsoft.com/office/word/2010/wordprocessingShape" mc:Ignorable="w14 w15 wp14">
+<w:footnotes xmlns:wpc="http://schemas.microsoft.com/office/word/2010/wordprocessingCanvas" xmlns:cx="http://schemas.microsoft.com/office/drawing/2014/chartex" xmlns:mc="http://schemas.openxmlformats.org/markup-compatibility/2006" xmlns:o="urn:schemas-microsoft-com:office:office" xmlns:r="http://schemas.openxmlformats.org/officeDocument/2006/relationships" xmlns:m="http://schemas.openxmlformats.org/officeDocument/2006/math" xmlns:v="urn:schemas-microsoft-com:vml" xmlns:wp14="http://schemas.microsoft.com/office/word/2010/wordprocessingDrawing" xmlns:wp="http://schemas.openxmlformats.org/drawingml/2006/wordprocessingDrawing" xmlns:w10="urn:schemas-microsoft-com:office:word" xmlns:w="http://schemas.openxmlformats.org/wordprocessingml/2006/main" xmlns:w14="http://schemas.microsoft.com/office/word/2010/wordml" xmlns:w15="http://schemas.microsoft.com/office/word/2012/wordml" xmlns:w16se="http://schemas.microsoft.com/office/word/2015/wordml/symex" xmlns:wpg="http://schemas.microsoft.com/office/word/2010/wordprocessingGroup" xmlns:wpi="http://schemas.microsoft.com/office/word/2010/wordprocessingInk" xmlns:wne="http://schemas.microsoft.com/office/word/2006/wordml" xmlns:wps="http://schemas.microsoft.com/office/word/2010/wordprocessingShape" mc:Ignorable="w14 w15 w16se wp14">
   <w:footnote w:type="separator" w:id="-1">
     <w:p>
       <w:r>
@@ -22722,7 +23625,7 @@
 </file>
 
 <file path=word/header1.xml><?xml version="1.0" encoding="utf-8"?>
-<w:hdr xmlns:wpc="http://schemas.microsoft.com/office/word/2010/wordprocessingCanvas" xmlns:mc="http://schemas.openxmlformats.org/markup-compatibility/2006" xmlns:o="urn:schemas-microsoft-com:office:office" xmlns:r="http://schemas.openxmlformats.org/officeDocument/2006/relationships" xmlns:m="http://schemas.openxmlformats.org/officeDocument/2006/math" xmlns:v="urn:schemas-microsoft-com:vml" xmlns:wp14="http://schemas.microsoft.com/office/word/2010/wordprocessingDrawing" xmlns:wp="http://schemas.openxmlformats.org/drawingml/2006/wordprocessingDrawing" xmlns:w10="urn:schemas-microsoft-com:office:word" xmlns:w="http://schemas.openxmlformats.org/wordprocessingml/2006/main" xmlns:w14="http://schemas.microsoft.com/office/word/2010/wordml" xmlns:w15="http://schemas.microsoft.com/office/word/2012/wordml" xmlns:wpg="http://schemas.microsoft.com/office/word/2010/wordprocessingGroup" xmlns:wpi="http://schemas.microsoft.com/office/word/2010/wordprocessingInk" xmlns:wne="http://schemas.microsoft.com/office/word/2006/wordml" xmlns:wps="http://schemas.microsoft.com/office/word/2010/wordprocessingShape" mc:Ignorable="w14 w15 wp14">
+<w:hdr xmlns:wpc="http://schemas.microsoft.com/office/word/2010/wordprocessingCanvas" xmlns:cx="http://schemas.microsoft.com/office/drawing/2014/chartex" xmlns:mc="http://schemas.openxmlformats.org/markup-compatibility/2006" xmlns:o="urn:schemas-microsoft-com:office:office" xmlns:r="http://schemas.openxmlformats.org/officeDocument/2006/relationships" xmlns:m="http://schemas.openxmlformats.org/officeDocument/2006/math" xmlns:v="urn:schemas-microsoft-com:vml" xmlns:wp14="http://schemas.microsoft.com/office/word/2010/wordprocessingDrawing" xmlns:wp="http://schemas.openxmlformats.org/drawingml/2006/wordprocessingDrawing" xmlns:w10="urn:schemas-microsoft-com:office:word" xmlns:w="http://schemas.openxmlformats.org/wordprocessingml/2006/main" xmlns:w14="http://schemas.microsoft.com/office/word/2010/wordml" xmlns:w15="http://schemas.microsoft.com/office/word/2012/wordml" xmlns:w16se="http://schemas.microsoft.com/office/word/2015/wordml/symex" xmlns:wpg="http://schemas.microsoft.com/office/word/2010/wordprocessingGroup" xmlns:wpi="http://schemas.microsoft.com/office/word/2010/wordprocessingInk" xmlns:wne="http://schemas.microsoft.com/office/word/2006/wordml" xmlns:wps="http://schemas.microsoft.com/office/word/2010/wordprocessingShape" mc:Ignorable="w14 w15 w16se wp14">
   <w:tbl>
     <w:tblPr>
       <w:tblW w:w="0" w:type="auto"/>
@@ -22886,7 +23789,7 @@
 </file>
 
 <file path=word/numbering.xml><?xml version="1.0" encoding="utf-8"?>
-<w:numbering xmlns:wpc="http://schemas.microsoft.com/office/word/2010/wordprocessingCanvas" xmlns:mc="http://schemas.openxmlformats.org/markup-compatibility/2006" xmlns:o="urn:schemas-microsoft-com:office:office" xmlns:r="http://schemas.openxmlformats.org/officeDocument/2006/relationships" xmlns:m="http://schemas.openxmlformats.org/officeDocument/2006/math" xmlns:v="urn:schemas-microsoft-com:vml" xmlns:wp14="http://schemas.microsoft.com/office/word/2010/wordprocessingDrawing" xmlns:wp="http://schemas.openxmlformats.org/drawingml/2006/wordprocessingDrawing" xmlns:w10="urn:schemas-microsoft-com:office:word" xmlns:w="http://schemas.openxmlformats.org/wordprocessingml/2006/main" xmlns:w14="http://schemas.microsoft.com/office/word/2010/wordml" xmlns:w15="http://schemas.microsoft.com/office/word/2012/wordml" xmlns:wpg="http://schemas.microsoft.com/office/word/2010/wordprocessingGroup" xmlns:wpi="http://schemas.microsoft.com/office/word/2010/wordprocessingInk" xmlns:wne="http://schemas.microsoft.com/office/word/2006/wordml" xmlns:wps="http://schemas.microsoft.com/office/word/2010/wordprocessingShape" mc:Ignorable="w14 w15 wp14">
+<w:numbering xmlns:wpc="http://schemas.microsoft.com/office/word/2010/wordprocessingCanvas" xmlns:cx="http://schemas.microsoft.com/office/drawing/2014/chartex" xmlns:mc="http://schemas.openxmlformats.org/markup-compatibility/2006" xmlns:o="urn:schemas-microsoft-com:office:office" xmlns:r="http://schemas.openxmlformats.org/officeDocument/2006/relationships" xmlns:m="http://schemas.openxmlformats.org/officeDocument/2006/math" xmlns:v="urn:schemas-microsoft-com:vml" xmlns:wp14="http://schemas.microsoft.com/office/word/2010/wordprocessingDrawing" xmlns:wp="http://schemas.openxmlformats.org/drawingml/2006/wordprocessingDrawing" xmlns:w10="urn:schemas-microsoft-com:office:word" xmlns:w="http://schemas.openxmlformats.org/wordprocessingml/2006/main" xmlns:w14="http://schemas.microsoft.com/office/word/2010/wordml" xmlns:w15="http://schemas.microsoft.com/office/word/2012/wordml" xmlns:w16se="http://schemas.microsoft.com/office/word/2015/wordml/symex" xmlns:wpg="http://schemas.microsoft.com/office/word/2010/wordprocessingGroup" xmlns:wpi="http://schemas.microsoft.com/office/word/2010/wordprocessingInk" xmlns:wne="http://schemas.microsoft.com/office/word/2006/wordml" xmlns:wps="http://schemas.microsoft.com/office/word/2010/wordprocessingShape" mc:Ignorable="w14 w15 w16se wp14">
   <w:abstractNum w:abstractNumId="0" w15:restartNumberingAfterBreak="0">
     <w:nsid w:val="FFFFFF1D"/>
     <w:multiLevelType w:val="multilevel"/>
@@ -25704,7 +26607,7 @@
 </file>
 
 <file path=word/styles.xml><?xml version="1.0" encoding="utf-8"?>
-<w:styles xmlns:mc="http://schemas.openxmlformats.org/markup-compatibility/2006" xmlns:r="http://schemas.openxmlformats.org/officeDocument/2006/relationships" xmlns:w="http://schemas.openxmlformats.org/wordprocessingml/2006/main" xmlns:w14="http://schemas.microsoft.com/office/word/2010/wordml" xmlns:w15="http://schemas.microsoft.com/office/word/2012/wordml" mc:Ignorable="w14 w15">
+<w:styles xmlns:mc="http://schemas.openxmlformats.org/markup-compatibility/2006" xmlns:r="http://schemas.openxmlformats.org/officeDocument/2006/relationships" xmlns:w="http://schemas.openxmlformats.org/wordprocessingml/2006/main" xmlns:w14="http://schemas.microsoft.com/office/word/2010/wordml" xmlns:w15="http://schemas.microsoft.com/office/word/2012/wordml" xmlns:w16se="http://schemas.microsoft.com/office/word/2015/wordml/symex" mc:Ignorable="w14 w15 w16se">
   <w:docDefaults>
     <w:rPrDefault>
       <w:rPr>
@@ -26122,7 +27025,6 @@
   <w:style w:type="character" w:default="1" w:styleId="DefaultParagraphFont">
     <w:name w:val="Default Paragraph Font"/>
     <w:uiPriority w:val="1"/>
-    <w:semiHidden/>
     <w:unhideWhenUsed/>
   </w:style>
   <w:style w:type="table" w:default="1" w:styleId="TableNormal">
@@ -26898,7 +27800,7 @@
 </file>
 
 <file path=customXml/itemProps1.xml><?xml version="1.0" encoding="utf-8"?>
-<ds:datastoreItem xmlns:ds="http://schemas.openxmlformats.org/officeDocument/2006/customXml" ds:itemID="{9E1F1F5D-B749-4729-B424-9D9693A25878}">
+<ds:datastoreItem xmlns:ds="http://schemas.openxmlformats.org/officeDocument/2006/customXml" ds:itemID="{840BEFC0-6A1C-4399-A723-A79D6DF6ABDF}">
   <ds:schemaRefs>
     <ds:schemaRef ds:uri="http://schemas.openxmlformats.org/officeDocument/2006/bibliography"/>
   </ds:schemaRefs>

</xml_diff>